<commit_message>
Final pre-submission fixes: SciRAG now cited as EACL 2026 (pp.6440-6460, Z. Wang added); router claims narrowed to tested surface-feature router (Sec 2.3/6.5); Limitations adds document-level vs passage-level transfer caveat (audit 208/208)
</commit_message>
<xml_diff>
--- a/manuscript/01_Manuscript_ESWA.docx
+++ b/manuscript/01_Manuscript_ESWA.docx
@@ -252,7 +252,7 @@
           <w:i w:val="0"/>
           <w:sz w:val="22"/>
         </w:rPr>
-        <w:t>Recent systems make retrieval adaptive: Self-RAG [15] learns when to retrieve, ITER-RETGEN [16] interleaves retrieval and generation, and agent-based assistants [17] plan multi-step retrieval. OpenScholar [18] synthesises scientific literature with retrieval-augmented models. These approaches adapt retrieval decisions per query or per generation step; our router analysis asks a sharper question—given a portfolio of cheap retrieval strategies, how much could perfect per-query selection possibly gain, and can surface query features recover it? On four datasets the answer is consistently negative, which constrains where agentic adaptivity is worth its cost.</w:t>
+        <w:t>Recent systems make retrieval adaptive: Self-RAG [15] learns when to retrieve, ITER-RETGEN [16] interleaves retrieval and generation, and agent-based assistants [17] plan multi-step retrieval. OpenScholar [18] synthesises scientific literature with retrieval-augmented models. These approaches adapt retrieval decisions per query or per generation step; our router analysis asks a sharper question—given a portfolio of cheap retrieval strategies, how much could perfect per-query selection possibly gain, and can surface query features recover it? On four datasets the answer for the tested surface-feature router is consistently negative, which constrains where this lightweight form of adaptivity is worth its cost.</w:t>
       </w:r>
     </w:p>
     <w:p>
@@ -578,7 +578,7 @@
               <w:rPr>
                 <w:sz w:val="16"/>
               </w:rPr>
-              <w:t>arXiv 2025</w:t>
+              <w:t>EACL 2026</w:t>
             </w:r>
           </w:p>
         </w:tc>
@@ -4640,7 +4640,7 @@
           <w:i w:val="0"/>
           <w:sz w:val="22"/>
         </w:rPr>
-        <w:t>Table 7 and Fig. 5 quantify how much per-query adaptivity could ever buy. The oracle that picks the per-query best among the three metadata-aware strategies exceeds the best single strategy by only +0.006 (SCIDOCS) and +0.008 (SciFact) NDCG@10; the headroom is larger on NFCorpus (+0.010) and TREC-COVID (+0.036), where the metadata signals interact with sparse coverage. The learned router does not recover this headroom on any dataset: out-of-fold label accuracy reaches 91.3% on SciFact but collapses to majority-class prediction (Cohen's κ between -0.108 and 0.027 across the four datasets), and the routed system never exceeds simply always choosing CA-HR. We replicate this negative result on all four domains: in scientific retrieval, adaptivity pays off at the domain level, not at the per-query level.</w:t>
+        <w:t>Table 7 and Fig. 5 quantify how much per-query adaptivity could ever buy. The oracle that picks the per-query best among the three metadata-aware strategies exceeds the best single strategy by only +0.006 (SCIDOCS) and +0.008 (SciFact) NDCG@10; the headroom is larger on NFCorpus (+0.010) and TREC-COVID (+0.036), where the metadata signals interact with sparse coverage. The learned router does not recover this headroom on any dataset: out-of-fold label accuracy reaches 91.3% on SciFact but collapses to majority-class prediction (Cohen's κ between -0.108 and 0.027 across the four datasets), and the routed system never exceeds simply always choosing CA-HR. Across the four datasets, the tested surface-feature router fails to recover the available per-query oracle headroom, suggesting that domain-level configuration is a stronger default than this lightweight form of query-level adaptation.</w:t>
       </w:r>
     </w:p>
     <w:p>
@@ -5067,7 +5067,7 @@
           <w:i w:val="0"/>
           <w:sz w:val="22"/>
         </w:rPr>
-        <w:t>Five limitations qualify our claims. (1) TREC-COVID has only 50 test queries, so per-dataset rankings there carry wider confidence intervals; the cross-domain pattern, however, is consistent across 1,673 queries in total. (2) Metadata coverage is below 100% by construction on TREC-COVID (69.8% citations); we mitigated with neutral defaults and disclosed coverage per field, but matched and unmatched documents may differ systematically. (3) The generation judge shares the generator's model family; the paired design controls relative bias, absolute judge scores may be inflated. (4) CA-HR's hyperparameters (alpha, beta, gamma, lambda, top-100 depth) were fixed a priori and not tuned per dataset, which is conservative but may understate the method where metadata is rich; the Section 6.4 weight sweep bounds this effect directly, showing a reachable gain only on SCIDOCS. (5) The deployment study is pilot-scale (6 users, one month); it demonstrates operability, not adoption.</w:t>
+        <w:t>Six limitations qualify our claims. (1) TREC-COVID has only 50 test queries, so per-dataset rankings there carry wider confidence intervals; the cross-domain pattern, however, is consistent across 1,673 queries in total. (2) Metadata coverage is below 100% by construction on TREC-COVID (69.8% citations); we mitigated with neutral defaults and disclosed coverage per field, but matched and unmatched documents may differ systematically. (3) The generation judge shares the generator's model family; the paired design controls relative bias, absolute judge scores may be inflated. (4) CA-HR's hyperparameters (alpha, beta, gamma, lambda, top-100 depth) were fixed a priori and not tuned per dataset, which is conservative but may understate the method where metadata is rich; the Section 6.4 weight sweep bounds this effect directly, showing a reachable gain only on SCIDOCS. (5) The deployment study is pilot-scale (6 users, one month); it demonstrates operability, not adoption. (6) The benchmark experiments operate on document-level representations (title and abstract), whereas the deployed PaperPilot pipeline retrieves passage-level chunks of uploaded papers; the deployment demonstrates engineering transferability but does not establish that all document-level ranking effects reproduce identically at passage level.</w:t>
       </w:r>
     </w:p>
     <w:p>
@@ -5397,7 +5397,7 @@
           <w:i w:val="0"/>
           <w:sz w:val="20"/>
         </w:rPr>
-        <w:t>[30] H. Ding, Y. Zhao, T. Hu, et al., SciRAG: Adaptive, citation-aware, and outline-guided retrieval and synthesis for scientific literature, arXiv:2511.14362, 2025.</w:t>
+        <w:t>[30] H. Ding, Y. Zhao, T. Hu, Z. Wang, M. Patwardhan, A. Cohan, SciRAG: Adaptive, citation-aware, and outline-guided retrieval and synthesis for scientific literature, in: Proc. EACL (Volume 1: Long Papers), Rabat, Morocco, 2026, pp. 6440-6460.</w:t>
       </w:r>
     </w:p>
     <w:p>

</xml_diff>

<commit_message>
Truth audit fixes: Yousuf et al. now cited as ECIR 2026 (pp.305-319); Table 2 year/venue coverage for SCIDOCS (98.7%/84.3%) and SciFact (93.8%/90.5%) corrected to recomputed per-field values (audit 208/208)
</commit_message>
<xml_diff>
--- a/manuscript/01_Manuscript_ESWA.docx
+++ b/manuscript/01_Manuscript_ESWA.docx
@@ -498,7 +498,7 @@
               <w:rPr>
                 <w:sz w:val="16"/>
               </w:rPr>
-              <w:t>arXiv 2026</w:t>
+              <w:t>ECIR 2026</w:t>
             </w:r>
           </w:p>
         </w:tc>
@@ -1146,7 +1146,7 @@
               <w:rPr>
                 <w:sz w:val="16"/>
               </w:rPr>
-              <w:t>99.7%</w:t>
+              <w:t>98.7%</w:t>
             </w:r>
           </w:p>
         </w:tc>
@@ -1159,7 +1159,7 @@
               <w:rPr>
                 <w:sz w:val="16"/>
               </w:rPr>
-              <w:t>99.7%</w:t>
+              <w:t>84.3%</w:t>
             </w:r>
           </w:p>
         </w:tc>
@@ -1239,7 +1239,7 @@
               <w:rPr>
                 <w:sz w:val="16"/>
               </w:rPr>
-              <w:t>94.1%</w:t>
+              <w:t>93.8%</w:t>
             </w:r>
           </w:p>
         </w:tc>
@@ -1252,7 +1252,7 @@
               <w:rPr>
                 <w:sz w:val="16"/>
               </w:rPr>
-              <w:t>94.1%</w:t>
+              <w:t>90.5%</w:t>
             </w:r>
           </w:p>
         </w:tc>
@@ -5387,7 +5387,7 @@
           <w:i w:val="0"/>
           <w:sz w:val="20"/>
         </w:rPr>
-        <w:t>[29] R. B. Yousuf, S. Xu, M. Sharma, et al., Utilizing metadata for better retrieval-augmented generation, arXiv:2601.11863, 2026.</w:t>
+        <w:t>[29] R. B. Yousuf, S. Xu, M. Sharma, et al., Utilizing metadata for better retrieval-augmented generation, in: Proc. ECIR, 2026, pp. 305-319.</w:t>
       </w:r>
     </w:p>
     <w:p>

</xml_diff>

<commit_message>
ESWA compliance: APA author-year refs, double-anonymized manuscript (repo/system links withheld), abstract 250 words, highlights <=85 chars, AI declaration before references, figures embedded, LLM-judge protocol detailed, exploratory labels for sensitivity sweep and LSA comparison (audit 208/208)
</commit_message>
<xml_diff>
--- a/manuscript/01_Manuscript_ESWA.docx
+++ b/manuscript/01_Manuscript_ESWA.docx
@@ -33,7 +33,7 @@
           <w:i w:val="0"/>
           <w:sz w:val="22"/>
         </w:rPr>
-        <w:t>Retrieval-augmented generation (RAG) systems for scientific literature usually ship a single static retrieval configuration, yet whether one configuration is optimal across research domains—and whether bibliographic metadata should influence ranking—remains insufficiently quantified. We evaluate ten retrieval configurations (BM25; latent-semantic analysis; two pretrained dense encoders; equal-weight hybrid fusion; and metadata-aware variants—UMA-RAG, LP-RAG, and a citation- and recency-aware re-ranker, CA-HR—on both dense backbones) on SCIDOCS, SciFact, NFCorpus, and TREC-COVID (171,332 to 3,633 documents; 1,673 queries in total), using real citation counts, publication years, and venue statistics from the Semantic Scholar and OpenAlex APIs (coverage 69.8%-99.7%). Three findings emerge. First, the optimal strategy is decisively domain-dependent: no configuration wins everywhere. Second, citation-aware re-ranking helps only where citation authority is informative about relevance (on SCIDOCS, relevant documents carry a median of 566 citations versus 71 for non-relevant ones; AUC 0.798), is neutral where the association is weak, and is mildly harmful where citations are uninformative or inversely associated with relevance (AUC approximately 0.50 and 0.46); the gain observed on the weaker MiniLM backbone does not transfer to the stronger BGE backbone under fixed hyperparameters; a 30-combination weight sweep recovers it only on the citation-informative corpus. Third, per-query strategy selection offers little recoverable headroom: a lightweight 12-feature logistic router (PAV Router) does not exceed majority-class behaviour on any dataset (Cohen's kappa approximately 0). A generation-side study (200 paired queries) finds answer relevance and faithfulness statistically indistinguishable between the hybrid and metadata-aware backends. The pipeline is deployed in PaperPilot, a live academic writing assistant, and we report a one-month pilot deployment. All data, code, and per-query results are publicly released.</w:t>
+        <w:t>Retrieval-augmented generation (RAG) systems for scientific literature often ship a single static retrieval configuration, yet whether one configuration is optimal across research domains—and whether bibliographic metadata should influence ranking—remains insufficiently quantified. We evaluate ten retrieval configurations—BM25, latent semantic analysis, two pretrained dense encoders, equal-weight hybrid fusion, and metadata-aware variants (UMA-RAG, LP-RAG, and a citation- and recency-aware re-ranker, CA-HR)—on SCIDOCS, SciFact, NFCorpus, and TREC-COVID (3,633 to 171,332 documents; 1,673 queries), using real citation counts, years, and venues from the Semantic Scholar and OpenAlex APIs (coverage 69.8%-99.7%). Three findings emerge. First, the optimal strategy is domain-dependent: no configuration wins everywhere. Second, citation-aware signals help only where citation authority predicts relevance (on SCIDOCS, relevant documents carry a median of 566 citations versus 71 for non-relevant ones; AUC 0.798), are neutral where the association is weak, mildly harmful where citations are uninformative or inversely associated with relevance (AUC 0.498 and 0.461); the gain on the weaker MiniLM backbone does not transfer to the stronger BGE backbone under fixed hyperparameters, and a 30-combination weight sweep recovers it only on the citation-informative corpus. Third, per-query strategy selection offers little recoverable headroom: a 12-feature logistic router does not exceed majority-class behaviour on any dataset (Cohen's kappa near 0). On 200 paired queries, answer relevance and faithfulness are statistically indistinguishable between the hybrid and metadata-aware backends. The pipeline is deployed in a live academic writing assistant (anonymized for review); we report a one-month pilot deployment. All data, code, and per-query results are released through an anonymized public repository.</w:t>
       </w:r>
     </w:p>
     <w:p>
@@ -68,7 +68,7 @@
           <w:i w:val="0"/>
           <w:sz w:val="22"/>
         </w:rPr>
-        <w:t>Academic writing and literature review increasingly rely on retrieval-augmented generation (RAG): a user question is first grounded in passages retrieved from a scholarly corpus, and a large language model then composes an answer conditioned on those passages [1]. The retrieval stage is the dominant determinant of end-to-end quality, because passages that are never retrieved cannot be cited. Yet most deployed scientific RAG systems adopt one fixed retrieval configuration—typically BM25 or a pretrained dense encoder—chosen once, on one benchmark, and generalised to every domain the system serves.</w:t>
+        <w:t>Academic writing and literature review increasingly rely on retrieval-augmented generation (RAG): a user question is first grounded in passages retrieved from a scholarly corpus, and a large language model then composes an answer conditioned on those passages (Lewis et al., 2020). The retrieval stage is the dominant determinant of end-to-end quality, because passages that are never retrieved cannot be cited. Yet most deployed scientific RAG systems adopt one fixed retrieval configuration—typically BM25 or a pretrained dense encoder—chosen once, on one benchmark, and generalised to every domain the system serves.</w:t>
       </w:r>
     </w:p>
     <w:p>
@@ -88,7 +88,7 @@
           <w:i w:val="0"/>
           <w:sz w:val="22"/>
         </w:rPr>
-        <w:t>This paper quantifies that question directly. We evaluate ten retrieval configurations on four public scientific benchmarks spanning computer science, biomedicine, nutrition, and pandemic medicine, using real—never synthetic—bibliographic metadata acquired from the Semantic Scholar and OpenAlex APIs. Unlike prior comparisons that rely on simulated metadata or single benchmarks, our study couples (i) a cross-domain retrieval evaluation with significance testing, (ii) ablation and query-corruption robustness analyses of the metadata terms, (iii) an oracle-and-router analysis that measures how much per-query adaptivity could ever buy, (iv) a generation-side study that asks whether backend differences survive into the final answer, and (v) a deployment case study in PaperPilot, a live academic writing assistant used by real users.</w:t>
+        <w:t>This paper quantifies that question directly. We evaluate ten retrieval configurations on four public scientific benchmarks spanning computer science, biomedicine, nutrition, and pandemic medicine, using real—never synthetic—bibliographic metadata acquired from the Semantic Scholar and OpenAlex APIs. Unlike prior comparisons that rely on simulated metadata or single benchmarks, our study couples (i) a cross-domain retrieval evaluation with significance testing, (ii) ablation and query-corruption robustness analyses of the metadata terms, (iii) an oracle-and-router analysis that measures how much per-query adaptivity could ever buy, (iv) a generation-side study that asks whether backend differences survive into the final answer, and (v) a deployment case study in a live academic writing assistant used by real users (system anonymized for review).</w:t>
       </w:r>
     </w:p>
     <w:p>
@@ -148,7 +148,7 @@
         <w:pStyle w:val="ListBullet"/>
       </w:pPr>
       <w:r>
-        <w:t>Evidence that citation- and recency-aware re-ranking (CA-HR) is conditional on bibliographic informativeness, not coverage—significantly helpful where citations strongly predict relevance (computer science), neutral where the association is weak (biomedical claims), mildly harmful where it is absent or inverted (nutrition, pandemic medicine)—and backbone-conditional: the citation gain observed on the weaker MiniLM backbone does not transfer to the stronger BGE backbone (RQ1, RQ2);</w:t>
+        <w:t>Evidence that citation- and recency-aware re-ranking (CA-HR) is conditional on bibliographic informativeness, not coverage—significantly helpful where citations strongly predict relevance (computer science), neutral where the association is weak (biomedical claims), mildly harmful where it is absent or inverted (nutrition, pandemic medicine)—and backbone-conditional: the citation gain observed on the weaker MiniLM backbone does not transfer to the stronger BGE backbone under fixed a-priori weights; a weight sweep recovers it only on the citation-informative corpus (RQ1, RQ2);</w:t>
       </w:r>
     </w:p>
     <w:p>
@@ -172,7 +172,7 @@
         <w:pStyle w:val="ListBullet"/>
       </w:pPr>
       <w:r>
-        <w:t>A deployment feasibility case study of the full pipeline in the live PaperPilot system, with architecture, cost, and one month of real usage statistics (RQ3). All code, data, and per-query results are released at https://github.com/TwistXXF/PaperPilot-Reproduction (archived at https://doi.org/10.5281/zenodo.21930729).</w:t>
+        <w:t>A deployment feasibility case study of the full pipeline in the live system, with architecture, cost, and one month of real usage statistics (RQ3). All code, data, and per-query results are released through an anonymized public repository (link withheld for anonymous review).</w:t>
       </w:r>
     </w:p>
     <w:p>
@@ -182,7 +182,7 @@
           <w:i w:val="0"/>
           <w:sz w:val="22"/>
         </w:rPr>
-        <w:t>The remainder of the paper is organised as follows. Section 2 reviews related work. Section 3 describes the PaperPilot system. Section 4 formalises the ten retrieval configurations and the router. Section 5 details datasets, metadata acquisition, and evaluation protocol. Section 6 reports results. Section 7 presents the deployment case study. Section 8 discusses implications and limitations, and Section 9 concludes.</w:t>
+        <w:t>The remainder of the paper is organised as follows. Section 2 reviews related work. Section 3 describes the deployed system. Section 4 formalises the ten retrieval configurations and the router. Section 5 details datasets, metadata acquisition, and evaluation protocol. Section 6 reports results. Section 7 presents the deployment case study. Section 8 discusses implications and limitations, and Section 9 concludes.</w:t>
       </w:r>
     </w:p>
     <w:p>
@@ -212,7 +212,7 @@
           <w:i w:val="0"/>
           <w:sz w:val="22"/>
         </w:rPr>
-        <w:t>Sparse lexical retrieval with BM25 [7] remains a strong baseline on scientific corpora. Dense passage retrieval [2] and its scientific specialisations—SPECTER [5], which exploits citation links during pre-training, and neighborhood-contrastive approaches [10]—improve semantic matching. Benchmarks such as BEIR [4] and SciRepEval [11] have shown that no single retriever dominates across domains, a finding our study sharpens for RAG-oriented pipelines. Sentence-level encoders such as Sentence-BERT [19] and the distilled MiniLM family [20] make dense retrieval cheap enough for CPU-only deployment, which is the regime our deployed system operates in; E5 [8] and the BGE family [9] push the same efficiency-quality frontier further.</w:t>
+        <w:t>Sparse lexical retrieval with BM25 (Robertson &amp; Zaragoza, 2009) remains a strong baseline on scientific corpora. Dense passage retrieval (Karpukhin et al., 2020) and its scientific specialisations—SPECTER (Cohan et al., 2020), which exploits citation links during pre-training, and neighborhood-contrastive approaches (Ostendorff et al., 2022)—improve semantic matching. Benchmarks such as BEIR (Thakur et al., 2021) and SciRepEval (Singh et al., 2023) have shown that no single retriever dominates across domains, a finding our study sharpens for RAG-oriented pipelines. Sentence-level encoders such as Sentence-BERT (Reimers &amp; Gurevych, 2019) and the distilled MiniLM family (Wang et al., 2020) make dense retrieval cheap enough for CPU-only deployment, which is the regime our deployed system operates in; E5 (Wang et al., 2022) and the BGE family (Chen et al., 2024) push the same efficiency-quality frontier further.</w:t>
       </w:r>
     </w:p>
     <w:p>
@@ -232,7 +232,7 @@
           <w:i w:val="0"/>
           <w:sz w:val="22"/>
         </w:rPr>
-        <w:t>Hybrid systems interpolate sparse and dense scores [3], [12]. Re-ranking with cross-encoders or sequence-to-sequence models (monoT5 [13]) and zero-shot LLM rankers such as setwise prompting [14] improve top-of-ranking quality at additional inference cost; these methods re-rank by content only. CA-HR instead re-ranks by combining content scores with citation-authority and recency signals derived from real bibliographic metadata, in the spirit of authority-aware scholarly search but applied inside a RAG pipeline. UMA-RAG and LP-RAG represent two alternative metadata-aware designs (uniform metadata augmentation and length-penalised ranking, respectively) and serve as strong in-family baselines.</w:t>
+        <w:t>Hybrid systems interpolate sparse and dense scores (Lin, 2021; Qu et al., 2021). Re-ranking with cross-encoders or sequence-to-sequence models (monoT5; Nogueira et al., 2020) and zero-shot LLM rankers such as setwise prompting (Zhuang et al., 2024) improve top-of-ranking quality at additional inference cost; these methods re-rank by content only. CA-HR instead re-ranks by combining content scores with citation-authority and recency signals derived from real bibliographic metadata, in the spirit of authority-aware scholarly search but applied inside a RAG pipeline. UMA-RAG and LP-RAG represent two alternative metadata-aware designs (uniform metadata augmentation and length-penalised ranking, respectively) and serve as strong in-family baselines.</w:t>
       </w:r>
     </w:p>
     <w:p>
@@ -252,7 +252,7 @@
           <w:i w:val="0"/>
           <w:sz w:val="22"/>
         </w:rPr>
-        <w:t>Recent systems make retrieval adaptive: Self-RAG [15] learns when to retrieve, ITER-RETGEN [16] interleaves retrieval and generation, and agent-based assistants [17] plan multi-step retrieval. OpenScholar [18] synthesises scientific literature with retrieval-augmented models. These approaches adapt retrieval decisions per query or per generation step; our router analysis asks a sharper question—given a portfolio of cheap retrieval strategies, how much could perfect per-query selection possibly gain, and can surface query features recover it? On four datasets the answer for the tested surface-feature router is consistently negative, which constrains where this lightweight form of adaptivity is worth its cost.</w:t>
+        <w:t>Recent systems make retrieval adaptive: Self-RAG (Asai et al., 2024b) learns when to retrieve, ITER-RETGEN (Shao et al., 2023) interleaves retrieval and generation, and agent-based assistants (Wang et al., 2024) plan multi-step retrieval. OpenScholar (Asai et al., 2024a) synthesises scientific literature with retrieval-augmented models. These approaches adapt retrieval decisions per query or per generation step; our router analysis asks a sharper question—given a portfolio of cheap retrieval strategies, how much could perfect per-query selection possibly gain, and can surface query features recover it? On four datasets the answer for the tested surface-feature router is consistently negative, which constrains where this lightweight form of adaptivity is worth its cost.</w:t>
       </w:r>
     </w:p>
     <w:p>
@@ -272,7 +272,7 @@
           <w:i w:val="0"/>
           <w:sz w:val="22"/>
         </w:rPr>
-        <w:t>Retrieval metrics do not directly measure what users read. We therefore add a generation-side study in which the same questions are answered by a fixed LLM (DeepSeek, deepseek-chat [26]) conditioned on contexts produced by two competing backends, scored for relevance and faithfulness with an LLM judge [27] and for citation precision against the gold relevance judgments. This closes the loop between retrieval evaluation and deployed answer quality.</w:t>
+        <w:t>Retrieval metrics do not directly measure what users read. We therefore add a generation-side study in which the same questions are answered by a fixed LLM (DeepSeek, deepseek-chat; DeepSeek-AI, 2024) conditioned on contexts produced by two competing backends, scored for relevance and faithfulness with an LLM judge (Zheng et al., 2023) and for citation precision against the gold relevance judgments. This closes the loop between retrieval evaluation and deployed answer quality.</w:t>
       </w:r>
     </w:p>
     <w:p>
@@ -292,7 +292,7 @@
           <w:i w:val="0"/>
           <w:sz w:val="22"/>
         </w:rPr>
-        <w:t>The RAG literature has moved quickly, and several 2025-2026 studies are closest to our problem. SurveyGen [28] builds a large-scale scientific survey dataset and a quality-aware framework (QUAL-SG) that injects citation counts, author influence, and venue reputation into literature retrieval for survey generation; it demonstrates that quality metadata helps its generation pipeline but does not isolate when or why the retrieval-level gain occurs. Yousuf et al. [29] systematically compare metadata-as-text, dual-encoder, and reformulation strategies on SEC filings and show that moderate metadata weights help on structured financial corpora; their metadata is structural (company, form, section), not bibliometric. SciRAG [30] couples adaptive retrieval with citation-graph symbolic reasoning and outline-guided synthesis for scientific question answering, using citations to organise evidence rather than as a ranking prior. RA-RAG [31] estimates per-source reliability by cross-checking and retrieves only from reliable sources in multi-source QA. Table 1 summarises the positioning. Our work is complementary and, to our knowledge, the first to (i) quantify, across four scientific domains, when citation- and recency-aware ranking priors help, are neutral, or harm—linking the outcome to a measurable corpus property (citation-relevance AUC) rather than to metadata coverage—and (ii) show, via a weight-sensitivity sweep on a stronger encoder, that the gain is backbone-dependent and re-emerges only where citations are informative, and that it does not propagate to generation quality or to a deployed system.</w:t>
+        <w:t>The RAG literature has moved quickly, and several 2025-2026 studies are closest to our problem. SurveyGen (Bao et al., 2025) builds a large-scale scientific survey dataset and a quality-aware framework (QUAL-SG) that injects citation counts, author influence, and venue reputation into literature retrieval for survey generation; it demonstrates that quality metadata helps its generation pipeline but does not isolate when or why the retrieval-level gain occurs. Yousuf et al. (2026) systematically compare metadata-as-text, dual-encoder, and reformulation strategies on SEC filings and show that moderate metadata weights help on structured financial corpora; their metadata is structural (company, form, section), not bibliometric. SciRAG (Ding et al., 2026) couples adaptive retrieval with citation-graph symbolic reasoning and outline-guided synthesis for scientific question answering, using citations to organise evidence rather than as a ranking prior. RA-RAG (Hwang et al., 2025) estimates per-source reliability by cross-checking and retrieves only from reliable sources in multi-source QA. Table 1 summarises the positioning. Our work is complementary and, to our knowledge, the first to (i) quantify, across four scientific domains, when citation- and recency-aware ranking priors help, are neutral, or harm—linking the outcome to a measurable corpus property (citation-relevance AUC) rather than to metadata coverage—and (ii) show, via a weight-sensitivity sweep on a stronger encoder, that the gain is backbone-dependent and re-emerges only where citations are informative, and that it does not propagate to generation quality or to a deployed system.</w:t>
       </w:r>
     </w:p>
     <w:tbl>
@@ -405,7 +405,7 @@
               <w:rPr>
                 <w:sz w:val="16"/>
               </w:rPr>
-              <w:t>SurveyGen [28]</w:t>
+              <w:t>Bao et al. (2025)</w:t>
             </w:r>
           </w:p>
         </w:tc>
@@ -485,7 +485,7 @@
               <w:rPr>
                 <w:sz w:val="16"/>
               </w:rPr>
-              <w:t>Yousuf et al. [29]</w:t>
+              <w:t>Yousuf et al. (2026)</w:t>
             </w:r>
           </w:p>
         </w:tc>
@@ -565,7 +565,7 @@
               <w:rPr>
                 <w:sz w:val="16"/>
               </w:rPr>
-              <w:t>SciRAG [30]</w:t>
+              <w:t>Ding et al. (2026)</w:t>
             </w:r>
           </w:p>
         </w:tc>
@@ -645,7 +645,7 @@
               <w:rPr>
                 <w:sz w:val="16"/>
               </w:rPr>
-              <w:t>RA-RAG [31]</w:t>
+              <w:t>Hwang et al. (2025)</w:t>
             </w:r>
           </w:p>
         </w:tc>
@@ -813,7 +813,7 @@
           <w:i w:val="0"/>
           <w:sz w:val="24"/>
         </w:rPr>
-        <w:t>3. The PaperPilot system</w:t>
+        <w:t>3. The deployed academic writing assistant</w:t>
       </w:r>
     </w:p>
     <w:p>
@@ -823,7 +823,7 @@
           <w:i w:val="0"/>
           <w:sz w:val="22"/>
         </w:rPr>
-        <w:t>PaperPilot is a web-based academic reading and writing assistant that operationalises the retrieval stack studied in this paper. Users upload papers, chat with an AI assistant grounded in their library, manage highlights and AI-generated summaries, and draft writing projects with citation support. The system serves real users at https://xxfpaperpilot.cn.</w:t>
+        <w:t>The system under study is a web-based academic reading and writing assistant (name and URL withheld for anonymous review) that operationalises the retrieval stack evaluated in this paper. Users upload papers, chat with an AI assistant grounded in their library, manage highlights and AI-generated summaries, and draft writing projects with citation support. The system serves real users in production.</w:t>
       </w:r>
     </w:p>
     <w:p>
@@ -833,7 +833,7 @@
           <w:i w:val="0"/>
           <w:sz w:val="22"/>
         </w:rPr>
-        <w:t>Fig. 1 shows the architecture. A React 18 single-page application communicates over HTTPS with an Nginx 1.18 reverse proxy that serves static assets and forwards API calls—including server-sent-event (SSE) token streams—to a Node.js 20 / Express backend supervised by PM2. Persistent state (users, papers, conversations, messages, highlights, summaries) lives in MySQL 8.0 behind the Drizzle ORM. The RAG orchestration layer chunks uploaded papers, embeds passages, runs the hybrid retrieval and metadata re-ranking pipeline evaluated here, and assembles a cited context of five passages that is streamed to the DeepSeek chat model (deepseek-chat [26]) for answer generation.</w:t>
+        <w:t>Fig. 1 shows the architecture. A React 18 single-page application communicates over HTTPS with an Nginx 1.18 reverse proxy that serves static assets and forwards API calls—including server-sent-event (SSE) token streams—to a Node.js 20 / Express backend supervised by PM2. Persistent state (users, papers, conversations, messages, highlights, summaries) lives in MySQL 8.0 behind the Drizzle ORM. The RAG orchestration layer chunks uploaded papers, embeds passages, runs the hybrid retrieval and metadata re-ranking pipeline evaluated here, and assembles a cited context of five passages that is streamed to the DeepSeek chat model (deepseek-chat; DeepSeek-AI, 2024) for answer generation.</w:t>
       </w:r>
     </w:p>
     <w:p>
@@ -848,12 +848,48 @@
     </w:p>
     <w:p>
       <w:r>
+        <w:drawing>
+          <wp:inline xmlns:a="http://schemas.openxmlformats.org/drawingml/2006/main" xmlns:pic="http://schemas.openxmlformats.org/drawingml/2006/picture">
+            <wp:extent cx="5486400" cy="3292718"/>
+            <wp:docPr id="1" name="Picture 1"/>
+            <wp:cNvGraphicFramePr>
+              <a:graphicFrameLocks noChangeAspect="1"/>
+            </wp:cNvGraphicFramePr>
+            <a:graphic>
+              <a:graphicData uri="http://schemas.openxmlformats.org/drawingml/2006/picture">
+                <pic:pic>
+                  <pic:nvPicPr>
+                    <pic:cNvPr id="0" name="system_architecture.png"/>
+                    <pic:cNvPicPr/>
+                  </pic:nvPicPr>
+                  <pic:blipFill>
+                    <a:blip r:embed="rId9"/>
+                    <a:stretch>
+                      <a:fillRect/>
+                    </a:stretch>
+                  </pic:blipFill>
+                  <pic:spPr>
+                    <a:xfrm>
+                      <a:off x="0" y="0"/>
+                      <a:ext cx="5486400" cy="3292718"/>
+                    </a:xfrm>
+                    <a:prstGeom prst="rect"/>
+                  </pic:spPr>
+                </pic:pic>
+              </a:graphicData>
+            </a:graphic>
+          </wp:inline>
+        </w:drawing>
+      </w:r>
+    </w:p>
+    <w:p>
+      <w:r>
         <w:rPr>
           <w:b w:val="0"/>
           <w:i/>
           <w:sz w:val="18"/>
         </w:rPr>
-        <w:t>Fig. 1. PaperPilot system architecture and deployment boundary.</w:t>
+        <w:t>Fig. 1. Architecture and deployment boundary of the deployed academic writing assistant (system anonymized for review).</w:t>
       </w:r>
     </w:p>
     <w:p>
@@ -883,7 +919,7 @@
           <w:i w:val="0"/>
           <w:sz w:val="22"/>
         </w:rPr>
-        <w:t>BM25 [7] scores documents with k1 = 1.5, b = 0.75 over whitespace- and punctuation-tokenised title-plus-abstract text. LSA-Dense projects a 50,000-feature TF-IDF space to 384 dimensions with truncated SVD (probabilistic LSI [21]). SBERT-Dense encodes the same text with all-MiniLM-L6-v2 [19], [20] (384-dim, L2-normalised, inner-product similarity). BGE-Dense replaces the encoder with BGE-small-en-v1.5 [25], a 12-layer 384-dim model roughly twice the depth of MiniLM, used with its official query instruction prefix. Neural-Hybrid fuses BM25 and SBERT-Dense with equal weights on min-max-normalised scores, and BGE-Hybrid is the same equal-weight fusion on the BGE backbone. To test whether metadata effects depend on the strength of the dense backbone, BGE-CA-HR applies the CA-HR re-ranking rule (Section 4.2) to the BGE hybrid instead of the MiniLM hybrid.</w:t>
+        <w:t>BM25 (Robertson &amp; Zaragoza, 2009) scores documents with k1 = 1.5, b = 0.75 over whitespace- and punctuation-tokenised title-plus-abstract text. LSA-Dense projects a 50,000-feature TF-IDF space to 384 dimensions with truncated SVD (latent semantic analysis; Deerwester et al., 1990). SBERT-Dense encodes the same text with all-MiniLM-L6-v2 (Reimers &amp; Gurevych, 2019; Wang et al., 2020) (384-dim, L2-normalised, inner-product similarity). BGE-Dense replaces the encoder with BGE-small-en-v1.5 (Xiao et al., 2023), a 12-layer 384-dim model roughly twice the depth of MiniLM, used with its official query instruction prefix. Neural-Hybrid fuses BM25 and SBERT-Dense with equal weights on min-max-normalised scores, and BGE-Hybrid is the same equal-weight fusion on the BGE backbone. To test whether metadata effects depend on the strength of the dense backbone, BGE-CA-HR applies the CA-HR re-ranking rule (Section 4.2) to the BGE hybrid instead of the MiniLM hybrid.</w:t>
       </w:r>
     </w:p>
     <w:p>
@@ -1451,7 +1487,7 @@
           <w:i w:val="0"/>
           <w:sz w:val="22"/>
         </w:rPr>
-        <w:t>We use four public benchmarks in BEIR format [4]: SCIDOCS (computer science [5]), SciFact (biomedical claim verification [6]), NFCorpus (nutrition and medicine [23]), and TREC-COVID (COVID-19 biomedicine [24]). They span two orders of magnitude in corpus size (3.6k-171k documents) and four distinct domains, and—critically—differ in metadata coverage (Table 2): SCIDOCS is nearly complete (99.7%), SciFact and NFCorpus are high (94%), while TREC-COVID is genuinely sparse at 69.8% citation coverage, reflecting its many preprints. We treat this sparsity not as a defect to hide but as a property of real-world corpora that our cross-domain design is built to expose.</w:t>
+        <w:t>We use four public benchmarks in BEIR format (Thakur et al., 2021): SCIDOCS (computer science; Cohan et al., 2020), SciFact (biomedical claim verification; Wadden et al., 2020), NFCorpus (nutrition and medicine; Boteva et al., 2016), and TREC-COVID (COVID-19 biomedicine; Voorhees et al., 2021). They span two orders of magnitude in corpus size (3.6k-171k documents) and four distinct domains, and—critically—differ in metadata coverage (Table 2): SCIDOCS is nearly complete (99.7%), SciFact and NFCorpus are high (94%), while TREC-COVID is genuinely sparse at 69.8% citation coverage, reflecting its many preprints. We treat this sparsity not as a defect to hide but as a property of real-world corpora that our cross-domain design is built to expose.</w:t>
       </w:r>
     </w:p>
     <w:p>
@@ -2056,7 +2092,7 @@
           <w:i w:val="0"/>
           <w:sz w:val="22"/>
         </w:rPr>
-        <w:t>Citation counts, publication years, and venues were fetched from the Semantic Scholar API for SCIDOCS and SciFact (99.7% and 94.1% matched, respectively). For NFCorpus, PubMed identifiers were mapped through the Semantic Scholar batch endpoint (94.0% matched). For TREC-COVID, CORD-19 identifiers were resolved through the official metadata file to DOIs and PubMed identifiers, then enriched through the OpenAlex API [22], reaching 69.8% citation, 96.4% year, and 92.5% venue coverage. No metadata value is synthetic; unmatched documents receive neutral defaults (zero citations, corpus-median year) exactly as they would in production.</w:t>
+        <w:t>Citation counts, publication years, and venues were fetched from the Semantic Scholar API for SCIDOCS and SciFact (99.7% and 94.1% matched, respectively). For NFCorpus, PubMed identifiers were mapped through the Semantic Scholar batch endpoint (94.0% matched). For TREC-COVID, CORD-19 identifiers were resolved through the official metadata file to DOIs and PubMed identifiers, then enriched through the OpenAlex API (Priem et al., 2022), reaching 69.8% citation, 96.4% year, and 92.5% venue coverage. No metadata value is synthetic; unmatched documents receive neutral defaults (zero citations, corpus-median year) exactly as they would in production.</w:t>
       </w:r>
     </w:p>
     <w:p>
@@ -2076,7 +2112,7 @@
           <w:i w:val="0"/>
           <w:sz w:val="22"/>
         </w:rPr>
-        <w:t>We report Recall@1/5/10, NDCG@10 with graded gains, and MRR on the official test judgments (documents judged non-relevant are excluded from the relevant sets). Significance uses the one-sided Wilcoxon signed-rank test over per-query scores with Cohen's d computed from the same per-query differences, so reported p-values and effect sizes are consistent by construction. To control the family-wise error rate, significance claims in the text are restricted to a pre-specified primary family of 16 comparisons (per dataset: CA-HR vs. BM25, SBERT-Dense, and Neural-Hybrid, and BGE-CA-HR vs. BGE-Hybrid, all on NDCG@10); quoted primary p-values are Holm-Bonferroni-adjusted within this family. Ablation, robustness, routing, and generation-side comparisons are reported as exploratory analyses with unadjusted two-sided p-values. All retrieval runs use a single CPU-only workstation. Measured per-query cost on the largest corpus (TREC-COVID, 171k documents): BM25 scoring averages 1,002 ms; dense scoring over precomputed embeddings and CA-HR re-ranking add under 2 ms per query. On the smaller corpora BM25 costs 7.6-97 ms per query. Query encoding (MiniLM) averages about 30 ms. Total online latency is therefore dominated by the LLM call, not retrieval.</w:t>
+        <w:t>We report Recall@1/5/10, NDCG@10 with graded gains, and MRR on the official test judgments (documents judged non-relevant are excluded from the relevant sets). Significance uses the one-sided Wilcoxon signed-rank test over per-query scores with Cohen's d computed from the same per-query differences, so reported p-values and effect sizes are consistent by construction. To control the family-wise error rate, significance claims in the text are restricted to a pre-specified primary family of 16 comparisons (per dataset: CA-HR vs. BM25, SBERT-Dense, and Neural-Hybrid, and BGE-CA-HR vs. BGE-Hybrid, all on NDCG@10); quoted primary p-values are Holm-Bonferroni-adjusted within this family. Ablation, robustness, routing, metadata-weight sensitivity, and generation-side comparisons are reported as exploratory analyses with unadjusted two-sided p-values. All retrieval runs use a single CPU-only workstation. Measured per-query cost on the largest corpus (TREC-COVID, 171k documents): BM25 scoring averages 1,002 ms; dense scoring over precomputed embeddings and CA-HR re-ranking add under 2 ms per query. On the smaller corpora BM25 costs 7.6-97 ms per query. Query encoding (MiniLM) averages about 30 ms. Total online latency is therefore dominated by the LLM call, not retrieval.</w:t>
       </w:r>
     </w:p>
     <w:p>
@@ -2872,7 +2908,7 @@
           <w:i w:val="0"/>
           <w:sz w:val="22"/>
         </w:rPr>
-        <w:t>Fig. 2 and Table 4 show the central pattern: no configuration wins everywhere. The best single method per dataset is SCIDOCS: SBERT-Dense (0.2164); SciFact: BGE-Dense (0.7127); NFCorpus: BGE-Hybrid (0.3487); TREC-COVID: BGE-Dense (0.7578). Pretrained dense retrieval dominates on SCIDOCS, where SBERT-Dense reaches 0.2164 NDCG@10 versus 0.1496 for BM25 (+44.7% relative); on SciFact the hybrid family is best-in-class (Neural-Hybrid 0.7080 versus 0.6496 for BM25), and CA-HR attains the best Recall@10 (0.8334) of all ten methods. BGE-based configurations provide the best single result on three of the four datasets—BGE-Dense on SciFact (0.7127) and TREC-COVID (0.7578), the latter consistent with its published BEIR reference score (approximately 0.76 [25]), and BGE-Hybrid on NFCorpus (0.3487)—yet BGE-Dense trails SBERT-Dense on SCIDOCS (0.2052 vs. 0.2164), confirming that even encoder choice is domain-dependent.</w:t>
+        <w:t>Fig. 2 and Table 4 show the central pattern: no configuration wins everywhere. The best single method per dataset is SCIDOCS: SBERT-Dense (0.2164); SciFact: BGE-Dense (0.7127); NFCorpus: BGE-Hybrid (0.3487); TREC-COVID: BGE-Dense (0.7578). Pretrained dense retrieval dominates on SCIDOCS, where SBERT-Dense reaches 0.2164 NDCG@10 versus 0.1496 for BM25 (+44.7% relative); on SciFact the hybrid family is best-in-class (Neural-Hybrid 0.7080 versus 0.6496 for BM25), and CA-HR attains the best Recall@10 (0.8334) of all ten methods. BGE-based configurations provide the best single result on three of the four datasets—BGE-Dense on SciFact (0.7127) and TREC-COVID (0.7578), the latter consistent with its published BEIR reference score (approximately 0.76; Xiao et al., 2023), and BGE-Hybrid on NFCorpus (0.3487)—yet BGE-Dense trails SBERT-Dense on SCIDOCS (0.2052 vs. 0.2164), confirming that even encoder choice is domain-dependent.</w:t>
       </w:r>
     </w:p>
     <w:p>
@@ -2882,7 +2918,7 @@
           <w:i w:val="0"/>
           <w:sz w:val="22"/>
         </w:rPr>
-        <w:t>CA-HR, the citation- and recency-aware configuration, sits in the middle of the hybrid family overall: it significantly outperforms BM25 and LSA-Dense on all four datasets (e.g., SCIDOCS p &lt; 0.001, TREC-COVID p &lt; 0.001), but it does not beat the plain dense or plain hybrid baselines except on SciFact, where it significantly exceeds SBERT-Dense (p = 0.001, d = 0.201). In other words, metadata-aware re-ranking reliably beats purely lexical and non-pretrained retrieval, but whether it beats plain dense retrieval depends on the domain.</w:t>
+        <w:t>CA-HR, the citation- and recency-aware configuration, sits in the middle of the hybrid family overall: it significantly outperforms BM25 on all four datasets (Holm-adjusted within the primary family; e.g., SCIDOCS p &lt; 0.001, TREC-COVID p &lt; 0.001), and it also exceeds LSA-Dense on all four datasets, an exploratory comparison outside the primary family (unadjusted one-sided Wilcoxon p &lt; 0.001 on every dataset), but it does not beat the plain dense or plain hybrid baselines except on SciFact, where it significantly exceeds SBERT-Dense (p = 0.001, d = 0.201). In other words, metadata-aware re-ranking reliably beats purely lexical and non-pretrained retrieval, but whether it beats plain dense retrieval depends on the domain.</w:t>
       </w:r>
     </w:p>
     <w:p>
@@ -2893,6 +2929,42 @@
           <w:sz w:val="22"/>
         </w:rPr>
         <w:t>Table 4 also isolates the role of the dense backbone. Equal-weight hybrid fusion on BGE-small (BGE-Hybrid) does not reproduce the hybrid advantage seen with MiniLM: it trails BGE-Dense on SCIDOCS (0.1832 vs. 0.2052), SciFact (0.7101 vs. 0.7127), and TREC-COVID (0.7115 vs. 0.7578); only on NFCorpus does BGE-Hybrid (0.3487) edge out BGE-Dense (0.3434), where it attains the best NDCG@10 of all ten configurations. Decisively for RQ1, transferring the CA-HR re-ranking rule to the BGE backbone (BGE-CA-HR) never helps: it falls slightly below BGE-Hybrid on every dataset (SCIDOCS 0.1803 vs. 0.1832, d = -0.059; SciFact 0.7094 vs. 0.7101, d = -0.007; NFCorpus 0.3367 vs. 0.3487, d = -0.213; TREC-COVID 0.6917 vs. 0.7115, d = -0.289) and well below BGE-Dense. Under CA-HR's fixed a-priori hyperparameters, the citation gain obtained on the weaker MiniLM backbone on SCIDOCS does not transfer to a stronger encoder: the observed metadata benefit is backbone-dependent rather than additive (Section 6.4 tests whether any metadata weight rescues it).</w:t>
+      </w:r>
+    </w:p>
+    <w:p>
+      <w:r>
+        <w:drawing>
+          <wp:inline xmlns:a="http://schemas.openxmlformats.org/drawingml/2006/main" xmlns:pic="http://schemas.openxmlformats.org/drawingml/2006/picture">
+            <wp:extent cx="5486400" cy="1413048"/>
+            <wp:docPr id="2" name="Picture 2"/>
+            <wp:cNvGraphicFramePr>
+              <a:graphicFrameLocks noChangeAspect="1"/>
+            </wp:cNvGraphicFramePr>
+            <a:graphic>
+              <a:graphicData uri="http://schemas.openxmlformats.org/drawingml/2006/picture">
+                <pic:pic>
+                  <pic:nvPicPr>
+                    <pic:cNvPr id="0" name="Fig2_main_results.png"/>
+                    <pic:cNvPicPr/>
+                  </pic:nvPicPr>
+                  <pic:blipFill>
+                    <a:blip r:embed="rId10"/>
+                    <a:stretch>
+                      <a:fillRect/>
+                    </a:stretch>
+                  </pic:blipFill>
+                  <pic:spPr>
+                    <a:xfrm>
+                      <a:off x="0" y="0"/>
+                      <a:ext cx="5486400" cy="1413048"/>
+                    </a:xfrm>
+                    <a:prstGeom prst="rect"/>
+                  </pic:spPr>
+                </pic:pic>
+              </a:graphicData>
+            </a:graphic>
+          </wp:inline>
+        </w:drawing>
       </w:r>
     </w:p>
     <w:p>
@@ -3420,7 +3492,43 @@
           <w:i w:val="0"/>
           <w:sz w:val="22"/>
         </w:rPr>
-        <w:t>The ablation (Table 5, Fig. 3; * = removal improves on the full model) localises exactly where metadata helps and where it hurts. On SCIDOCS—the corpus where citations are most informative about relevance (AUC = 0.798)—removing the citation boost drops NDCG@10 from 0.1894 to 0.1722, the single most valuable metadata signal in the study, while removing the recency prior improves performance to 0.2022, indicating a miscalibrated recency prior on a snapshot corpus. On SciFact both metadata terms are neutral. On the two new domains the sign flips: removing the citation boost improves NDCG@10 on NFCorpus (0.3322 → 0.3396) and on TREC-COVID (0.6740 → 0.6830), The sign flip tracks the bibliographic-informativeness diagnostics (Table 3), not coverage: NFCorpus and TREC-COVID are exactly the corpora where citation counts carry no (AUC = 0.498) or inverse (AUC = 0.461) information about relevance, so the citation boost amplifies noise rather than refining the ranking. The content side is stable across domains: removing either modality degrades performance almost everywhere, except that a pure dense configuration is best on SCIDOCS, consistent with dense dominance on computer science.</w:t>
+        <w:t>The ablation (Table 5, Fig. 3; * = removal improves on the full model) localises exactly where metadata helps and where it hurts. On SCIDOCS—the corpus where citations are most informative about relevance (AUC = 0.798)—removing the citation boost drops NDCG@10 from 0.1894 to 0.1722, the single most valuable metadata signal in the study, while removing the recency prior improves performance to 0.2022, indicating a miscalibrated recency prior on a snapshot corpus. On SciFact both metadata terms are neutral. On the two new domains the sign flips: removing the citation boost improves NDCG@10 on NFCorpus (0.3322 → 0.3396) and on TREC-COVID (0.6740 → 0.6830). The sign flip tracks the bibliographic-informativeness diagnostics (Table 3), not coverage: NFCorpus and TREC-COVID are exactly the corpora where citation counts carry no (AUC = 0.498) or inverse (AUC = 0.461) information about relevance, so the citation boost amplifies noise rather than refining the ranking. The content side is stable across domains: removing either modality degrades performance almost everywhere, except that a pure dense configuration is best on SCIDOCS, consistent with dense dominance on computer science.</w:t>
+      </w:r>
+    </w:p>
+    <w:p>
+      <w:r>
+        <w:drawing>
+          <wp:inline xmlns:a="http://schemas.openxmlformats.org/drawingml/2006/main" xmlns:pic="http://schemas.openxmlformats.org/drawingml/2006/picture">
+            <wp:extent cx="5486400" cy="1436718"/>
+            <wp:docPr id="3" name="Picture 3"/>
+            <wp:cNvGraphicFramePr>
+              <a:graphicFrameLocks noChangeAspect="1"/>
+            </wp:cNvGraphicFramePr>
+            <a:graphic>
+              <a:graphicData uri="http://schemas.openxmlformats.org/drawingml/2006/picture">
+                <pic:pic>
+                  <pic:nvPicPr>
+                    <pic:cNvPr id="0" name="Fig3_ablation.png"/>
+                    <pic:cNvPicPr/>
+                  </pic:nvPicPr>
+                  <pic:blipFill>
+                    <a:blip r:embed="rId11"/>
+                    <a:stretch>
+                      <a:fillRect/>
+                    </a:stretch>
+                  </pic:blipFill>
+                  <pic:spPr>
+                    <a:xfrm>
+                      <a:off x="0" y="0"/>
+                      <a:ext cx="5486400" cy="1436718"/>
+                    </a:xfrm>
+                    <a:prstGeom prst="rect"/>
+                  </pic:spPr>
+                </pic:pic>
+              </a:graphicData>
+            </a:graphic>
+          </wp:inline>
+        </w:drawing>
       </w:r>
     </w:p>
     <w:p>
@@ -3455,6 +3563,42 @@
     </w:p>
     <w:p>
       <w:r>
+        <w:drawing>
+          <wp:inline xmlns:a="http://schemas.openxmlformats.org/drawingml/2006/main" xmlns:pic="http://schemas.openxmlformats.org/drawingml/2006/picture">
+            <wp:extent cx="5486400" cy="1430221"/>
+            <wp:docPr id="4" name="Picture 4"/>
+            <wp:cNvGraphicFramePr>
+              <a:graphicFrameLocks noChangeAspect="1"/>
+            </wp:cNvGraphicFramePr>
+            <a:graphic>
+              <a:graphicData uri="http://schemas.openxmlformats.org/drawingml/2006/picture">
+                <pic:pic>
+                  <pic:nvPicPr>
+                    <pic:cNvPr id="0" name="Fig4_robustness.png"/>
+                    <pic:cNvPicPr/>
+                  </pic:nvPicPr>
+                  <pic:blipFill>
+                    <a:blip r:embed="rId12"/>
+                    <a:stretch>
+                      <a:fillRect/>
+                    </a:stretch>
+                  </pic:blipFill>
+                  <pic:spPr>
+                    <a:xfrm>
+                      <a:off x="0" y="0"/>
+                      <a:ext cx="5486400" cy="1430221"/>
+                    </a:xfrm>
+                    <a:prstGeom prst="rect"/>
+                  </pic:spPr>
+                </pic:pic>
+              </a:graphicData>
+            </a:graphic>
+          </wp:inline>
+        </w:drawing>
+      </w:r>
+    </w:p>
+    <w:p>
+      <w:r>
         <w:rPr>
           <w:b w:val="0"/>
           <w:i/>
@@ -3480,7 +3624,7 @@
           <w:i w:val="0"/>
           <w:sz w:val="22"/>
         </w:rPr>
-        <w:t>Two objections remain after Section 6.1. First, CA-HR's weights were fixed a priori, so the absence of a metadata gain on the stronger BGE backbone could be an artefact of under-weighting the metadata terms. Second, our hybrids interpolate min-max-normalised scores, so a standard rank-fusion reference is missing. Table 6 addresses both. We sweep the citation and recency weights of BGE-CA-HR over a 30-combination grid (beta in {0, 0.05, 0.10, 0.15, 0.20, 0.30}, gamma in {0, 0.05, 0.10, 0.15, 0.20}) and test each combination against BGE-Hybrid with one-sided Wilcoxon tests, Holm-corrected within each dataset. The metadata gain re-emerges only on SCIDOCS: beta = 0.3, gamma = 0.0 attains 0.2079 NDCG@10, significantly above BGE-Hybrid (0.1832; Holm p &lt; 0.001) and marginally above BGE-Dense (0.2052). On SciFact, NFCorpus, and TREC-COVID no grid combination significantly beats BGE-Hybrid (best 0.7112, 0.3437, and 0.7121 versus 0.7101, 0.3487, and 0.7115; all Holm-adjusted p = 1.0). The backbone effect is therefore not a weight artefact: metadata gains on a strong encoder are gated by citation informativeness, and where the signal is informative the gain transfers only after re-calibrating the metadata weight.</w:t>
+        <w:t>Two objections remain after Section 6.1. First, CA-HR's weights were fixed a priori, so the absence of a metadata gain on the stronger BGE backbone could be an artefact of under-weighting the metadata terms. Second, our hybrids interpolate min-max-normalised scores, so a standard rank-fusion reference is missing. Table 6 addresses both. We sweep the citation and recency weights of BGE-CA-HR over a 30-combination grid (beta in {0, 0.05, 0.10, 0.15, 0.20, 0.30}, gamma in {0, 0.05, 0.10, 0.15, 0.20}) and test each combination against BGE-Hybrid with one-sided Wilcoxon tests, Holm-corrected within each dataset. Because the grid is selected on the test judgments, we report this sweep strictly as an exploratory sensitivity analysis, not as confirmatory evidence. The metadata gain re-emerges only on SCIDOCS: beta = 0.3, gamma = 0.0 attains 0.2079 NDCG@10, significantly above BGE-Hybrid (0.1832; Holm p &lt; 0.001) and marginally above BGE-Dense (0.2052). On SciFact, NFCorpus, and TREC-COVID no grid combination significantly beats BGE-Hybrid (best 0.7112, 0.3437, and 0.7121 versus 0.7101, 0.3487, and 0.7115; all Holm-adjusted p = 1.0). The backbone effect is therefore not a weight artefact: metadata gains on a strong encoder are gated by citation informativeness, and where the signal is informative the gain transfers only after re-calibrating the metadata weight.</w:t>
       </w:r>
     </w:p>
     <w:p>
@@ -4645,6 +4789,42 @@
     </w:p>
     <w:p>
       <w:r>
+        <w:drawing>
+          <wp:inline xmlns:a="http://schemas.openxmlformats.org/drawingml/2006/main" xmlns:pic="http://schemas.openxmlformats.org/drawingml/2006/picture">
+            <wp:extent cx="5486400" cy="2561317"/>
+            <wp:docPr id="5" name="Picture 5"/>
+            <wp:cNvGraphicFramePr>
+              <a:graphicFrameLocks noChangeAspect="1"/>
+            </wp:cNvGraphicFramePr>
+            <a:graphic>
+              <a:graphicData uri="http://schemas.openxmlformats.org/drawingml/2006/picture">
+                <pic:pic>
+                  <pic:nvPicPr>
+                    <pic:cNvPr id="0" name="Fig5_routing.png"/>
+                    <pic:cNvPicPr/>
+                  </pic:nvPicPr>
+                  <pic:blipFill>
+                    <a:blip r:embed="rId13"/>
+                    <a:stretch>
+                      <a:fillRect/>
+                    </a:stretch>
+                  </pic:blipFill>
+                  <pic:spPr>
+                    <a:xfrm>
+                      <a:off x="0" y="0"/>
+                      <a:ext cx="5486400" cy="2561317"/>
+                    </a:xfrm>
+                    <a:prstGeom prst="rect"/>
+                  </pic:spPr>
+                </pic:pic>
+              </a:graphicData>
+            </a:graphic>
+          </wp:inline>
+        </w:drawing>
+      </w:r>
+    </w:p>
+    <w:p>
+      <w:r>
         <w:rPr>
           <w:b w:val="0"/>
           <w:i/>
@@ -4967,7 +5147,7 @@
           <w:i w:val="0"/>
           <w:sz w:val="22"/>
         </w:rPr>
-        <w:t>Do the retrieval-level differences survive into the answers users actually read? We sampled 200 test queries (50 per dataset, fixed seed), generated cited answers with DeepSeek (deepseek-chat, temperature 0.2, top-5 passages as context), and scored each answer for relevance and faithfulness with an LLM judge and for citation precision against the gold judgments. Table 8 shows the backends are statistically indistinguishable on every measure (all p &gt; 0.48): at top-5, the two systems surface nearly the same passages (1.68 vs. 1.70 gold-relevant documents on average). Two secondary findings are worth reporting. First, absolute answer quality is high (relevance 4.18-4.25, faithfulness 4.89-4.92 of 5), so the pipeline is usable in production. Second, citation precision against the strict gold judgments averages about 0.50 but varies sharply with gold-judgment density: 0.87 on TREC-COVID, whose queries carry dense graded judgments, versus 0.15 on SCIDOCS, whose judgments are sparse; the model frequently cites plausible but not gold-relevant passages, a failure mode invisible to retrieval metrics and a target for future citation verification. We caveat that the judge shares the generator's model family [27]; the paired design controls for this bias, but absolute scores should be read accordingly.</w:t>
+        <w:t>Do the retrieval-level differences survive into the answers users actually read? We sampled 200 test queries (50 per dataset, fixed seed), generated cited answers with DeepSeek (deepseek-chat, temperature 0.2, top-5 passages as context), and scored each answer for relevance and faithfulness with an LLM judge and for citation precision against the gold judgments. The judge is the same DeepSeek chat model prompted with a fixed rubric (1-5 relevance; 1-5 faithfulness conditioned on the retrieved context; the exact prompts are released with the code). Each answer was judged once, in randomised backend order with backend labels hidden from the judge; no human verification subsample was performed, which we flag as a limitation (Section 8.2). Table 8 shows the backends are statistically indistinguishable on every measure (all p &gt; 0.48): at top-5, the two systems surface nearly the same passages (1.68 vs. 1.70 gold-relevant documents on average). Two secondary findings are worth reporting. First, absolute answer quality is high (relevance 4.18-4.25, faithfulness 4.89-4.92 of 5), so the pipeline is usable in production. Second, citation precision against the strict gold judgments averages about 0.50 but varies sharply with gold-judgment density: 0.87 on TREC-COVID, whose queries carry dense graded judgments, versus 0.15 on SCIDOCS, whose judgments are sparse; the model frequently cites plausible but not gold-relevant passages, a failure mode invisible to retrieval metrics and a target for future citation verification. We caveat that the judge shares the generator's model family (Zheng et al., 2023); the paired design controls for this bias, but absolute scores should be read accordingly.</w:t>
       </w:r>
     </w:p>
     <w:p>
@@ -5007,7 +5187,7 @@
           <w:i w:val="0"/>
           <w:sz w:val="22"/>
         </w:rPr>
-        <w:t>The full pipeline has been deployed in PaperPilot since 10 July 2026 at https://xxfpaperpilot.cn, on a single Aliyun ECS instance (2 vCPU, 1.6 GB RAM, 40 GB disk, Ubuntu 22.04) with Node.js 20.20.2, MySQL 8.0.46, Nginx 1.18 terminating TLS (Let's Encrypt, auto-renewed), and PM2 supervision. Over the first month of operation the service recorded 6 registered users, 6 uploaded papers, 26 chat conversations with 63 messages, 6 AI-generated summaries, and 3 writing projects; the process restarted twice in six days (both manual deploys) and the edge responds in about 74 ms. This is a pilot-scale deployment, and we report it as such: its purpose is to demonstrate that the evaluated pipeline runs unchanged on commodity hardware in production, not to claim large-scale adoption.</w:t>
+        <w:t>The full pipeline has been deployed in the production assistant since 10 July 2026 (system name and URL withheld for anonymous review), on a single Aliyun ECS instance (2 vCPU, 1.6 GB RAM, 40 GB disk, Ubuntu 22.04) with Node.js 20.20.2, MySQL 8.0.46, Nginx 1.18 terminating TLS (Let's Encrypt, auto-renewed), and PM2 supervision. Over the first month of operation the service recorded 6 registered users, 6 uploaded papers, 26 chat conversations with 63 messages, 6 AI-generated summaries, and 3 writing projects; the process restarted twice in six days (both manual deploys) and the edge responds in about 74 ms. This is a pilot-scale deployment, and we report it as such: its purpose is to demonstrate that the evaluated pipeline runs unchanged on commodity hardware in production, not to claim large-scale adoption.</w:t>
       </w:r>
     </w:p>
     <w:p>
@@ -5067,7 +5247,7 @@
           <w:i w:val="0"/>
           <w:sz w:val="22"/>
         </w:rPr>
-        <w:t>Six limitations qualify our claims. (1) TREC-COVID has only 50 test queries, so per-dataset rankings there carry wider confidence intervals; the cross-domain pattern, however, is consistent across 1,673 queries in total. (2) Metadata coverage is below 100% by construction on TREC-COVID (69.8% citations); we mitigated with neutral defaults and disclosed coverage per field, but matched and unmatched documents may differ systematically. (3) The generation judge shares the generator's model family; the paired design controls relative bias, absolute judge scores may be inflated. (4) CA-HR's hyperparameters (alpha, beta, gamma, lambda, top-100 depth) were fixed a priori and not tuned per dataset, which is conservative but may understate the method where metadata is rich; the Section 6.4 weight sweep bounds this effect directly, showing a reachable gain only on SCIDOCS. (5) The deployment study is pilot-scale (6 users, one month); it demonstrates operability, not adoption. (6) The benchmark experiments operate on document-level representations (title and abstract), whereas the deployed PaperPilot pipeline retrieves passage-level chunks of uploaded papers; the deployment demonstrates engineering transferability but does not establish that all document-level ranking effects reproduce identically at passage level.</w:t>
+        <w:t>Six limitations qualify our claims. (1) TREC-COVID has only 50 test queries, so per-dataset rankings there carry wider confidence intervals; the cross-domain pattern, however, is consistent across 1,673 queries in total. (2) Metadata coverage is below 100% by construction on TREC-COVID (69.8% citations); we mitigated with neutral defaults and disclosed coverage per field, but matched and unmatched documents may differ systematically. (3) The generation judge shares the generator's model family; the paired design controls relative bias, absolute judge scores may be inflated, and no human verification subsample was performed. (4) CA-HR's hyperparameters (alpha, beta, gamma, lambda, top-100 depth) were fixed a priori and not tuned per dataset, which is conservative but may understate the method where metadata is rich; the Section 6.4 weight sweep bounds this effect directly, showing a reachable gain only on SCIDOCS. (5) The deployment study is pilot-scale (6 users, one month); it demonstrates operability, not adoption. (6) The benchmark experiments operate on document-level representations (title and abstract), whereas the deployed pipeline retrieves passage-level chunks of uploaded papers; the deployment demonstrates engineering transferability but does not establish that all document-level ranking effects reproduce identically at passage level.</w:t>
       </w:r>
     </w:p>
     <w:p>
@@ -5097,6 +5277,26 @@
           <w:i w:val="0"/>
           <w:sz w:val="24"/>
         </w:rPr>
+        <w:t>Declaration of generative AI and AI-assisted technologies in the writing process</w:t>
+      </w:r>
+    </w:p>
+    <w:p>
+      <w:r>
+        <w:rPr>
+          <w:b w:val="0"/>
+          <w:i w:val="0"/>
+          <w:sz w:val="22"/>
+        </w:rPr>
+        <w:t>During the preparation of this work the author used Kimi (Moonshot AI) for code debugging and language polishing. After using this tool, the author reviewed and edited the content as needed and takes full responsibility for the content of the published article.</w:t>
+      </w:r>
+    </w:p>
+    <w:p>
+      <w:r>
+        <w:rPr>
+          <w:b/>
+          <w:i w:val="0"/>
+          <w:sz w:val="24"/>
+        </w:rPr>
         <w:t>References</w:t>
       </w:r>
     </w:p>
@@ -5107,7 +5307,7 @@
           <w:i w:val="0"/>
           <w:sz w:val="20"/>
         </w:rPr>
-        <w:t>[1] P. Lewis, E. Perez, A. Piktus, et al., Retrieval-augmented generation for knowledge-intensive NLP tasks, in: Proc. NeurIPS, 2020, pp. 9459-9474.</w:t>
+        <w:t>Asai, A., He, J., Shao, R., et al. (2024a). OpenScholar: Synthesizing scientific literature with retrieval-augmented language models. arXiv:2411.14199.</w:t>
       </w:r>
     </w:p>
     <w:p>
@@ -5117,7 +5317,7 @@
           <w:i w:val="0"/>
           <w:sz w:val="20"/>
         </w:rPr>
-        <w:t>[2] V. Karpukhin, B. Oguz, S. Min, et al., Dense passage retrieval for open-domain question answering, in: Proc. EMNLP, 2020, pp. 6769-6781.</w:t>
+        <w:t>Asai, A., Wu, Z., Wang, Y., et al. (2024b). Self-RAG: Learning to retrieve, generate, and critique through self-reflection. In Proceedings of ICLR.</w:t>
       </w:r>
     </w:p>
     <w:p>
@@ -5127,7 +5327,7 @@
           <w:i w:val="0"/>
           <w:sz w:val="20"/>
         </w:rPr>
-        <w:t>[3] J. Lin, A proposed conceptual framework for a representational approach to information retrieval, ACM SIGIR Forum 55 (2) (2021).</w:t>
+        <w:t>Bao, T., Nayeem, M. T., Rafiei, D., &amp; Zhang, C. (2025). SurveyGen: Quality-aware scientific survey generation with large language models. In Proceedings of EMNLP (pp. 2712-2736).</w:t>
       </w:r>
     </w:p>
     <w:p>
@@ -5137,7 +5337,7 @@
           <w:i w:val="0"/>
           <w:sz w:val="20"/>
         </w:rPr>
-        <w:t>[4] N. Thakur, N. Reimers, A. Rücklé, et al., BEIR: A heterogeneous benchmark for zero-shot evaluation of information retrieval models, in: Proc. NeurIPS Datasets and Benchmarks, 2021.</w:t>
+        <w:t>Boteva, V., Gholipour, D., Sokolov, A., &amp; Riezler, S. (2016). A full-text learning to rank dataset for medical information retrieval. In Proceedings of ECIR (pp. 716-722).</w:t>
       </w:r>
     </w:p>
     <w:p>
@@ -5147,7 +5347,7 @@
           <w:i w:val="0"/>
           <w:sz w:val="20"/>
         </w:rPr>
-        <w:t>[5] A. Cohan, S. Feldman, I. Beltagy, et al., SPECTER: Document-level representation learning using citation-informed transformers, in: Proc. ACL, 2020, pp. 2270-2282.</w:t>
+        <w:t>Chen, J., Xiao, S., Zhang, P., et al. (2024). BGE M3-Embedding: Multi-lingual, multi-functionality, multi-granularity text embeddings through self-knowledge distillation. arXiv:2402.03216.</w:t>
       </w:r>
     </w:p>
     <w:p>
@@ -5157,7 +5357,7 @@
           <w:i w:val="0"/>
           <w:sz w:val="20"/>
         </w:rPr>
-        <w:t>[6] D. Wadden, S. Lin, K. Lo, et al., Fact or fiction: Verifying scientific claims, in: Proc. EMNLP, 2020, pp. 7534-7550.</w:t>
+        <w:t>Cohan, A., Feldman, S., Beltagy, I., et al. (2020). SPECTER: Document-level representation learning using citation-informed transformers. In Proceedings of ACL (pp. 2270-2282).</w:t>
       </w:r>
     </w:p>
     <w:p>
@@ -5167,7 +5367,7 @@
           <w:i w:val="0"/>
           <w:sz w:val="20"/>
         </w:rPr>
-        <w:t>[7] S. Robertson, H. Zaragoza, The probabilistic relevance framework: BM25 and beyond, Foundations and Trends in Information Retrieval 3 (4) (2009) 333-389.</w:t>
+        <w:t>Deerwester, S., Dumais, S. T., Furnas, G. W., Landauer, T. K., &amp; Harshman, R. (1990). Indexing by latent semantic analysis. Journal of the American Society for Information Science, 41(6), 391-407.</w:t>
       </w:r>
     </w:p>
     <w:p>
@@ -5177,7 +5377,7 @@
           <w:i w:val="0"/>
           <w:sz w:val="20"/>
         </w:rPr>
-        <w:t>[8] L. Wang, N. Yang, X. Huang, et al., Text embeddings by weakly-supervised contrastive pre-training, arXiv:2212.03533, 2022.</w:t>
+        <w:t>DeepSeek-AI. (2024). DeepSeek-V3 technical report. arXiv:2412.19437.</w:t>
       </w:r>
     </w:p>
     <w:p>
@@ -5187,7 +5387,7 @@
           <w:i w:val="0"/>
           <w:sz w:val="20"/>
         </w:rPr>
-        <w:t>[9] J. Chen, S. Xiao, P. Zhang, et al., BGE M3-Embedding: Multi-lingual, multi-functionality, multi-granularity text embeddings through self-knowledge distillation, arXiv:2402.03216, 2024.</w:t>
+        <w:t>Ding, H., Zhao, Y., Hu, T., Wang, Z., Patwardhan, M., &amp; Cohan, A. (2026). SciRAG: Adaptive, citation-aware, and outline-guided retrieval and synthesis for scientific literature. In Proceedings of EACL (Volume 1: Long Papers) (pp. 6440-6460).</w:t>
       </w:r>
     </w:p>
     <w:p>
@@ -5197,7 +5397,7 @@
           <w:i w:val="0"/>
           <w:sz w:val="20"/>
         </w:rPr>
-        <w:t>[10] M. Ostendorff, N. Rethmeier, I. Augenstein, et al., Neighborhood contrastive learning for scientific document representations with citation embeddings, in: Proc. EMNLP, 2022, pp. 11670-11688.</w:t>
+        <w:t>Hwang, J., Park, J., Park, H., et al. (2025). Retrieval-augmented generation with estimation of source reliability. In Proceedings of EMNLP (pp. 34279-34303).</w:t>
       </w:r>
     </w:p>
     <w:p>
@@ -5207,7 +5407,7 @@
           <w:i w:val="0"/>
           <w:sz w:val="20"/>
         </w:rPr>
-        <w:t>[11] A. Singh, M. D'Arcy, A. Cohan, et al., SciRepEval: A multi-format benchmark for scientific document representations, in: Proc. EMNLP, 2023, pp. 5548-5566.</w:t>
+        <w:t>Karpukhin, V., Oguz, B., Min, S., et al. (2020). Dense passage retrieval for open-domain question answering. In Proceedings of EMNLP (pp. 6769-6781).</w:t>
       </w:r>
     </w:p>
     <w:p>
@@ -5217,7 +5417,7 @@
           <w:i w:val="0"/>
           <w:sz w:val="20"/>
         </w:rPr>
-        <w:t>[12] Y. Qu, Y. Ding, J. Liu, et al., RocketQA: An optimized training approach to dense passage retrieval, in: Proc. NAACL, 2021, pp. 5835-5847.</w:t>
+        <w:t>Lewis, P., Perez, E., Piktus, A., et al. (2020). Retrieval-augmented generation for knowledge-intensive NLP tasks. In Proceedings of NeurIPS (pp. 9459-9474).</w:t>
       </w:r>
     </w:p>
     <w:p>
@@ -5227,7 +5427,7 @@
           <w:i w:val="0"/>
           <w:sz w:val="20"/>
         </w:rPr>
-        <w:t>[13] R. Nogueira, Z. Jiang, R. Pradeep, J. Lin, Document ranking with a pretrained sequence-to-sequence model, in: Findings of EMNLP, 2020, pp. 708-718.</w:t>
+        <w:t>Lin, J. (2021). A proposed conceptual framework for a representational approach to information retrieval. ACM SIGIR Forum, 55(2).</w:t>
       </w:r>
     </w:p>
     <w:p>
@@ -5237,7 +5437,7 @@
           <w:i w:val="0"/>
           <w:sz w:val="20"/>
         </w:rPr>
-        <w:t>[14] S. Zhuang, H. Zhuang, B. Koopman, G. Zuccon, A setwise approach for effective and highly efficient zero-shot ranking with large language models, in: Proc. SIGIR, 2024, pp. 38-47.</w:t>
+        <w:t>Nogueira, R., Jiang, Z., Pradeep, R., &amp; Lin, J. (2020). Document ranking with a pretrained sequence-to-sequence model. In Findings of EMNLP (pp. 708-718).</w:t>
       </w:r>
     </w:p>
     <w:p>
@@ -5247,7 +5447,7 @@
           <w:i w:val="0"/>
           <w:sz w:val="20"/>
         </w:rPr>
-        <w:t>[15] A. Asai, Z. Wu, Y. Wang, et al., Self-RAG: Learning to retrieve, generate, and critique through self-reflection, in: Proc. ICLR, 2024.</w:t>
+        <w:t>Ostendorff, M., Rethmeier, N., Augenstein, I., et al. (2022). Neighborhood contrastive learning for scientific document representations with citation embeddings. In Proceedings of EMNLP (pp. 11670-11688).</w:t>
       </w:r>
     </w:p>
     <w:p>
@@ -5257,7 +5457,7 @@
           <w:i w:val="0"/>
           <w:sz w:val="20"/>
         </w:rPr>
-        <w:t>[16] Z. Shao, Y. Gong, Y. Shen, et al., Enhancing retrieval-augmented large language models with iterative retrieval-generation synergy, in: Findings of EMNLP, 2023, pp. 9248-9274.</w:t>
+        <w:t>Priem, J., Piwowar, H., &amp; Orr, R. (2022). OpenAlex: A fully-open index of scholarly works, authors, venues, institutions, and concepts. arXiv:2205.01833.</w:t>
       </w:r>
     </w:p>
     <w:p>
@@ -5267,7 +5467,7 @@
           <w:i w:val="0"/>
           <w:sz w:val="20"/>
         </w:rPr>
-        <w:t>[17] L. Wang, C. Ma, X. Feng, et al., A survey on large language model based autonomous agents, Frontiers of Computer Science 18 (6) (2024) 186345.</w:t>
+        <w:t>Qu, Y., Ding, Y., Liu, J., et al. (2021). RocketQA: An optimized training approach to dense passage retrieval. In Proceedings of NAACL (pp. 5835-5847).</w:t>
       </w:r>
     </w:p>
     <w:p>
@@ -5277,7 +5477,7 @@
           <w:i w:val="0"/>
           <w:sz w:val="20"/>
         </w:rPr>
-        <w:t>[18] A. Asai, J. He, R. Shao, et al., OpenScholar: Synthesizing scientific literature with retrieval-augmented language models, arXiv:2411.14199, 2024.</w:t>
+        <w:t>Reimers, N., &amp; Gurevych, I. (2019). Sentence-BERT: Sentence embeddings using Siamese BERT-networks. In Proceedings of EMNLP-IJCNLP (pp. 3982-3992).</w:t>
       </w:r>
     </w:p>
     <w:p>
@@ -5287,7 +5487,7 @@
           <w:i w:val="0"/>
           <w:sz w:val="20"/>
         </w:rPr>
-        <w:t>[19] N. Reimers, I. Gurevych, Sentence-BERT: Sentence embeddings using Siamese BERT-networks, in: Proc. EMNLP-IJCNLP, 2019, pp. 3982-3992.</w:t>
+        <w:t>Robertson, S., &amp; Zaragoza, H. (2009). The probabilistic relevance framework: BM25 and beyond. Foundations and Trends in Information Retrieval, 3(4), 333-389.</w:t>
       </w:r>
     </w:p>
     <w:p>
@@ -5297,7 +5497,7 @@
           <w:i w:val="0"/>
           <w:sz w:val="20"/>
         </w:rPr>
-        <w:t>[20] W. Wang, F. Wei, L. Dong, et al., MiniLM: Deep self-attention distillation for task-agnostic compression of pre-trained transformers, in: Proc. NeurIPS, 2020.</w:t>
+        <w:t>Shao, Z., Gong, Y., Shen, Y., et al. (2023). Enhancing retrieval-augmented large language models with iterative retrieval-generation synergy. In Findings of EMNLP (pp. 9248-9274).</w:t>
       </w:r>
     </w:p>
     <w:p>
@@ -5307,7 +5507,7 @@
           <w:i w:val="0"/>
           <w:sz w:val="20"/>
         </w:rPr>
-        <w:t>[21] T. Hofmann, Probabilistic latent semantic indexing, in: Proc. SIGIR, 1999, pp. 50-57.</w:t>
+        <w:t>Singh, A., D'Arcy, M., Cohan, A., et al. (2023). SciRepEval: A multi-format benchmark for scientific document representations. In Proceedings of EMNLP (pp. 5548-5566).</w:t>
       </w:r>
     </w:p>
     <w:p>
@@ -5317,7 +5517,7 @@
           <w:i w:val="0"/>
           <w:sz w:val="20"/>
         </w:rPr>
-        <w:t>[22] J. Priem, H. Piwowar, R. Orr, OpenAlex: A fully-open index of scholarly works, authors, venues, institutions, and concepts, arXiv:2205.01833, 2022.</w:t>
+        <w:t>Thakur, N., Reimers, N., Rücklé, A., et al. (2021). BEIR: A heterogeneous benchmark for zero-shot evaluation of information retrieval models. In Proceedings of NeurIPS Datasets and Benchmarks.</w:t>
       </w:r>
     </w:p>
     <w:p>
@@ -5327,7 +5527,7 @@
           <w:i w:val="0"/>
           <w:sz w:val="20"/>
         </w:rPr>
-        <w:t>[23] V. Boteva, D. Gholipour, A. Sokolov, S. Riezler, A full-text learning to rank dataset for medical information retrieval, in: Proc. ECIR, 2016, pp. 716-722.</w:t>
+        <w:t>Voorhees, E., Alam, T., Bedrick, S., et al. (2021). TREC-COVID: Constructing a pandemic information retrieval test collection. ACM SIGIR Forum, 54(1), 1-12.</w:t>
       </w:r>
     </w:p>
     <w:p>
@@ -5337,7 +5537,7 @@
           <w:i w:val="0"/>
           <w:sz w:val="20"/>
         </w:rPr>
-        <w:t>[24] E. Voorhees, T. Alam, S. Bedrick, et al., TREC-COVID: Constructing a pandemic information retrieval test collection, ACM SIGIR Forum 54 (1) (2021) 1-12.</w:t>
+        <w:t>Wadden, D., Lin, S., Lo, K., et al. (2020). Fact or fiction: Verifying scientific claims. In Proceedings of EMNLP (pp. 7534-7550).</w:t>
       </w:r>
     </w:p>
     <w:p>
@@ -5347,7 +5547,7 @@
           <w:i w:val="0"/>
           <w:sz w:val="20"/>
         </w:rPr>
-        <w:t>[25] S. Xiao, Z. Liu, P. Zhang, N. Muennighoff, et al., C-Pack: Packaged resources to advance general Chinese embedding, arXiv:2309.07597, 2023.</w:t>
+        <w:t>Wang, L., Yang, N., Huang, X., et al. (2022). Text embeddings by weakly-supervised contrastive pre-training. arXiv:2212.03533.</w:t>
       </w:r>
     </w:p>
     <w:p>
@@ -5357,7 +5557,7 @@
           <w:i w:val="0"/>
           <w:sz w:val="20"/>
         </w:rPr>
-        <w:t>[26] DeepSeek-AI, DeepSeek-V3 technical report, arXiv:2412.19437, 2024.</w:t>
+        <w:t>Wang, L., Ma, C., Feng, X., et al. (2024). A survey on large language model based autonomous agents. Frontiers of Computer Science, 18(6), 186345.</w:t>
       </w:r>
     </w:p>
     <w:p>
@@ -5367,7 +5567,7 @@
           <w:i w:val="0"/>
           <w:sz w:val="20"/>
         </w:rPr>
-        <w:t>[27] L. Zheng, W.-L. Chiang, Y. Sheng, et al., Judging LLM-as-a-judge with MT-Bench and Chatbot Arena, in: Proc. NeurIPS Datasets and Benchmarks, 2023.</w:t>
+        <w:t>Wang, W., Wei, F., Dong, L., et al. (2020). MiniLM: Deep self-attention distillation for task-agnostic compression of pre-trained transformers. In Proceedings of NeurIPS.</w:t>
       </w:r>
     </w:p>
     <w:p>
@@ -5377,7 +5577,7 @@
           <w:i w:val="0"/>
           <w:sz w:val="20"/>
         </w:rPr>
-        <w:t>[28] T. Bao, M. T. Nayeem, D. Rafiei, C. Zhang, SurveyGen: Quality-aware scientific survey generation with large language models, in: Proc. EMNLP, 2025, pp. 2712-2736.</w:t>
+        <w:t>Xiao, S., Liu, Z., Zhang, P., Muennighoff, N., et al. (2023). C-Pack: Packaged resources to advance general Chinese embedding. arXiv:2309.07597.</w:t>
       </w:r>
     </w:p>
     <w:p>
@@ -5387,7 +5587,7 @@
           <w:i w:val="0"/>
           <w:sz w:val="20"/>
         </w:rPr>
-        <w:t>[29] R. B. Yousuf, S. Xu, M. Sharma, et al., Utilizing metadata for better retrieval-augmented generation, in: Proc. ECIR, 2026, pp. 305-319.</w:t>
+        <w:t>Yousuf, R. B., Xu, S., Sharma, M., et al. (2026). Utilizing metadata for better retrieval-augmented generation. In Proceedings of ECIR (pp. 305-319).</w:t>
       </w:r>
     </w:p>
     <w:p>
@@ -5397,7 +5597,7 @@
           <w:i w:val="0"/>
           <w:sz w:val="20"/>
         </w:rPr>
-        <w:t>[30] H. Ding, Y. Zhao, T. Hu, Z. Wang, M. Patwardhan, A. Cohan, SciRAG: Adaptive, citation-aware, and outline-guided retrieval and synthesis for scientific literature, in: Proc. EACL (Volume 1: Long Papers), Rabat, Morocco, 2026, pp. 6440-6460.</w:t>
+        <w:t>Zheng, L., Chiang, W.-L., Sheng, Y., et al. (2023). Judging LLM-as-a-judge with MT-Bench and Chatbot Arena. In Proceedings of NeurIPS Datasets and Benchmarks.</w:t>
       </w:r>
     </w:p>
     <w:p>
@@ -5407,7 +5607,7 @@
           <w:i w:val="0"/>
           <w:sz w:val="20"/>
         </w:rPr>
-        <w:t>[31] J. Hwang, J. Park, H. Park, et al., Retrieval-augmented generation with estimation of source reliability, in: Proc. EMNLP, 2025, pp. 34279-34303.</w:t>
+        <w:t>Zhuang, S., Zhuang, H., Koopman, B., &amp; Zuccon, G. (2024). A setwise approach for effective and highly efficient zero-shot ranking with large language models. In Proceedings of SIGIR (pp. 38-47).</w:t>
       </w:r>
     </w:p>
     <w:sectPr>

</xml_diff>

<commit_message>
Round-6 compliance: fix 5.4 test-description contradiction (sensitivity = one-sided Wilcoxon + Holm), strict APA 7 reference list (all author lists expanded and verified against ACL Anthology/arXiv/ACM DL, 16 DOIs added, en-dash page ranges), abstract trimmed to 243 words, AI declaration retitled to manuscript-preparation wording with verification statement (audit 208/208)
</commit_message>
<xml_diff>
--- a/manuscript/01_Manuscript_ESWA.docx
+++ b/manuscript/01_Manuscript_ESWA.docx
@@ -33,7 +33,7 @@
           <w:i w:val="0"/>
           <w:sz w:val="22"/>
         </w:rPr>
-        <w:t>Retrieval-augmented generation (RAG) systems for scientific literature often ship a single static retrieval configuration, yet whether one configuration is optimal across research domains—and whether bibliographic metadata should influence ranking—remains insufficiently quantified. We evaluate ten retrieval configurations—BM25, latent semantic analysis, two pretrained dense encoders, equal-weight hybrid fusion, and metadata-aware variants (UMA-RAG, LP-RAG, and a citation- and recency-aware re-ranker, CA-HR)—on SCIDOCS, SciFact, NFCorpus, and TREC-COVID (3,633 to 171,332 documents; 1,673 queries), using real citation counts, years, and venues from the Semantic Scholar and OpenAlex APIs (coverage 69.8%-99.7%). Three findings emerge. First, the optimal strategy is domain-dependent: no configuration wins everywhere. Second, citation-aware signals help only where citation authority predicts relevance (on SCIDOCS, relevant documents carry a median of 566 citations versus 71 for non-relevant ones; AUC 0.798), are neutral where the association is weak, mildly harmful where citations are uninformative or inversely associated with relevance (AUC 0.498 and 0.461); the gain on the weaker MiniLM backbone does not transfer to the stronger BGE backbone under fixed hyperparameters, and a 30-combination weight sweep recovers it only on the citation-informative corpus. Third, per-query strategy selection offers little recoverable headroom: a 12-feature logistic router does not exceed majority-class behaviour on any dataset (Cohen's kappa near 0). On 200 paired queries, answer relevance and faithfulness are statistically indistinguishable between the hybrid and metadata-aware backends. The pipeline is deployed in a live academic writing assistant (anonymized for review); we report a one-month pilot deployment. All data, code, and per-query results are released through an anonymized public repository.</w:t>
+        <w:t>Retrieval-augmented generation (RAG) systems for scientific literature often ship one static retrieval configuration, yet whether one is optimal across research domains—and whether bibliographic metadata should influence ranking—remains insufficiently quantified. We evaluate ten retrieval configurations—BM25, latent semantic analysis, two pretrained dense encoders, equal-weight hybrid fusion, and metadata-aware variants (UMA-RAG, LP-RAG, and a citation- and recency-aware re-ranker, CA-HR)—on SCIDOCS, SciFact, NFCorpus, and TREC-COVID (3,633 to 171,332 documents; 1,673 queries), using real citation counts, years, and venues from Semantic Scholar and OpenAlex (coverage 69.8%-99.7%). Three findings emerge. First, the optimal strategy is domain-dependent: no configuration wins everywhere. Second, citation-aware signals help only where citation authority predicts relevance (on SCIDOCS, relevant documents carry a median of 566 citations versus 71 for non-relevant ones; AUC 0.798), are neutral where the association is weak, mildly harmful where citations are uninformative or inversely associated with relevance (AUC 0.498 and 0.461); the gain on the weaker MiniLM backbone does not transfer to the stronger BGE backbone under fixed hyperparameters, and a 30-combination weight sweep recovers it only on the citation-informative corpus. Third, per-query strategy selection offers little recoverable headroom: a 12-feature logistic router does not exceed majority-class behaviour on any dataset (kappa near 0). On 200 paired queries, answer relevance and faithfulness are statistically indistinguishable between the hybrid and metadata-aware backends. The pipeline is deployed in a live academic writing assistant (anonymized for review); we report a one-month pilot deployment. Data, code, and per-query results are released through an anonymized repository.</w:t>
       </w:r>
     </w:p>
     <w:p>
@@ -2112,7 +2112,7 @@
           <w:i w:val="0"/>
           <w:sz w:val="22"/>
         </w:rPr>
-        <w:t>We report Recall@1/5/10, NDCG@10 with graded gains, and MRR on the official test judgments (documents judged non-relevant are excluded from the relevant sets). Significance uses the one-sided Wilcoxon signed-rank test over per-query scores with Cohen's d computed from the same per-query differences, so reported p-values and effect sizes are consistent by construction. To control the family-wise error rate, significance claims in the text are restricted to a pre-specified primary family of 16 comparisons (per dataset: CA-HR vs. BM25, SBERT-Dense, and Neural-Hybrid, and BGE-CA-HR vs. BGE-Hybrid, all on NDCG@10); quoted primary p-values are Holm-Bonferroni-adjusted within this family. Ablation, robustness, routing, metadata-weight sensitivity, and generation-side comparisons are reported as exploratory analyses with unadjusted two-sided p-values. All retrieval runs use a single CPU-only workstation. Measured per-query cost on the largest corpus (TREC-COVID, 171k documents): BM25 scoring averages 1,002 ms; dense scoring over precomputed embeddings and CA-HR re-ranking add under 2 ms per query. On the smaller corpora BM25 costs 7.6-97 ms per query. Query encoding (MiniLM) averages about 30 ms. Total online latency is therefore dominated by the LLM call, not retrieval.</w:t>
+        <w:t>We report Recall@1/5/10, NDCG@10 with graded gains, and MRR on the official test judgments (documents judged non-relevant are excluded from the relevant sets). Significance uses the one-sided Wilcoxon signed-rank test over per-query scores with Cohen's d computed from the same per-query differences, so reported p-values and effect sizes are consistent by construction. To control the family-wise error rate, significance claims in the text are restricted to a pre-specified primary family of 16 comparisons (per dataset: CA-HR vs. BM25, SBERT-Dense, and Neural-Hybrid, and BGE-CA-HR vs. BGE-Hybrid, all on NDCG@10); quoted primary p-values are Holm-Bonferroni-adjusted within this family. Ablation, robustness, routing, and generation-side comparisons are exploratory analyses with unadjusted two-sided p-values; metadata-weight sensitivity uses one-sided Wilcoxon tests with Holm correction within each dataset. All retrieval runs use a single CPU-only workstation. Measured per-query cost on the largest corpus (TREC-COVID, 171k documents): BM25 scoring averages 1,002 ms; dense scoring over precomputed embeddings and CA-HR re-ranking add under 2 ms per query. On the smaller corpora BM25 costs 7.6-97 ms per query. Query encoding (MiniLM) averages about 30 ms. Total online latency is therefore dominated by the LLM call, not retrieval.</w:t>
       </w:r>
     </w:p>
     <w:p>
@@ -5277,7 +5277,7 @@
           <w:i w:val="0"/>
           <w:sz w:val="24"/>
         </w:rPr>
-        <w:t>Declaration of generative AI and AI-assisted technologies in the writing process</w:t>
+        <w:t>Declaration of generative AI and AI-assisted technologies in the manuscript preparation process</w:t>
       </w:r>
     </w:p>
     <w:p>
@@ -5287,7 +5287,7 @@
           <w:i w:val="0"/>
           <w:sz w:val="22"/>
         </w:rPr>
-        <w:t>During the preparation of this work the author used Kimi (Moonshot AI) for code debugging and language polishing. After using this tool, the author reviewed and edited the content as needed and takes full responsibility for the content of the published article.</w:t>
+        <w:t>During the preparation of this work the author used Kimi (Moonshot AI) for code debugging and language polishing. All AI-assisted output, including code and experimental results, was reviewed, executed, and verified by the author, who takes full responsibility for the content of the published article.</w:t>
       </w:r>
     </w:p>
     <w:p>
@@ -5307,7 +5307,7 @@
           <w:i w:val="0"/>
           <w:sz w:val="20"/>
         </w:rPr>
-        <w:t>Asai, A., He, J., Shao, R., et al. (2024a). OpenScholar: Synthesizing scientific literature with retrieval-augmented language models. arXiv:2411.14199.</w:t>
+        <w:t>Asai, A., He, J., Shao, R., Shi, W., Singh, A., Chang, J. C., Lo, K., Soldaini, L., Feldman, S., D'Arcy, M., Wadden, D., Latzke, M., Tian, M., Ji, P., Liu, S., Tong, H., Wu, B., Xiong, Y., Zettlemoyer, L., ... Hajishirzi, H. (2024a). OpenScholar: Synthesizing scientific literature with retrieval-augmented language models. arXiv:2411.14199. https://doi.org/10.48550/arXiv.2411.14199</w:t>
       </w:r>
     </w:p>
     <w:p>
@@ -5317,7 +5317,7 @@
           <w:i w:val="0"/>
           <w:sz w:val="20"/>
         </w:rPr>
-        <w:t>Asai, A., Wu, Z., Wang, Y., et al. (2024b). Self-RAG: Learning to retrieve, generate, and critique through self-reflection. In Proceedings of ICLR.</w:t>
+        <w:t>Asai, A., Wu, Z., Wang, Y., Sil, A., &amp; Hajishirzi, H. (2024b). Self-RAG: Learning to retrieve, generate, and critique through self-reflection. In Proceedings of ICLR.</w:t>
       </w:r>
     </w:p>
     <w:p>
@@ -5327,7 +5327,7 @@
           <w:i w:val="0"/>
           <w:sz w:val="20"/>
         </w:rPr>
-        <w:t>Bao, T., Nayeem, M. T., Rafiei, D., &amp; Zhang, C. (2025). SurveyGen: Quality-aware scientific survey generation with large language models. In Proceedings of EMNLP (pp. 2712-2736).</w:t>
+        <w:t>Bao, T., Nayeem, M. T., Rafiei, D., &amp; Zhang, C. (2025). SurveyGen: Quality-aware scientific survey generation with large language models. In Proceedings of EMNLP (pp. 2712–2736). https://doi.org/10.18653/v1/2025.emnlp-main.136</w:t>
       </w:r>
     </w:p>
     <w:p>
@@ -5337,7 +5337,7 @@
           <w:i w:val="0"/>
           <w:sz w:val="20"/>
         </w:rPr>
-        <w:t>Boteva, V., Gholipour, D., Sokolov, A., &amp; Riezler, S. (2016). A full-text learning to rank dataset for medical information retrieval. In Proceedings of ECIR (pp. 716-722).</w:t>
+        <w:t>Boteva, V., Gholipour, D., Sokolov, A., &amp; Riezler, S. (2016). A full-text learning to rank dataset for medical information retrieval. In Proceedings of ECIR (pp. 716–722).</w:t>
       </w:r>
     </w:p>
     <w:p>
@@ -5347,7 +5347,7 @@
           <w:i w:val="0"/>
           <w:sz w:val="20"/>
         </w:rPr>
-        <w:t>Chen, J., Xiao, S., Zhang, P., et al. (2024). BGE M3-Embedding: Multi-lingual, multi-functionality, multi-granularity text embeddings through self-knowledge distillation. arXiv:2402.03216.</w:t>
+        <w:t>Chen, J., Xiao, S., Zhang, P., Luo, K., Lian, D., &amp; Liu, Z. (2024). BGE M3-Embedding: Multi-lingual, multi-functionality, multi-granularity text embeddings through self-knowledge distillation. arXiv:2402.03216. https://doi.org/10.48550/arXiv.2402.03216</w:t>
       </w:r>
     </w:p>
     <w:p>
@@ -5357,7 +5357,7 @@
           <w:i w:val="0"/>
           <w:sz w:val="20"/>
         </w:rPr>
-        <w:t>Cohan, A., Feldman, S., Beltagy, I., et al. (2020). SPECTER: Document-level representation learning using citation-informed transformers. In Proceedings of ACL (pp. 2270-2282).</w:t>
+        <w:t>Cohan, A., Feldman, S., Beltagy, I., Downey, D., &amp; Weld, D. S. (2020). SPECTER: Document-level representation learning using citation-informed transformers. In Proceedings of ACL (pp. 2270–2282). https://doi.org/10.18653/v1/2020.acl-main.207</w:t>
       </w:r>
     </w:p>
     <w:p>
@@ -5367,7 +5367,7 @@
           <w:i w:val="0"/>
           <w:sz w:val="20"/>
         </w:rPr>
-        <w:t>Deerwester, S., Dumais, S. T., Furnas, G. W., Landauer, T. K., &amp; Harshman, R. (1990). Indexing by latent semantic analysis. Journal of the American Society for Information Science, 41(6), 391-407.</w:t>
+        <w:t>Deerwester, S., Dumais, S. T., Furnas, G. W., Landauer, T. K., &amp; Harshman, R. (1990). Indexing by latent semantic analysis. Journal of the American Society for Information Science, 41(6), 391–407.</w:t>
       </w:r>
     </w:p>
     <w:p>
@@ -5377,7 +5377,7 @@
           <w:i w:val="0"/>
           <w:sz w:val="20"/>
         </w:rPr>
-        <w:t>DeepSeek-AI. (2024). DeepSeek-V3 technical report. arXiv:2412.19437.</w:t>
+        <w:t>DeepSeek-AI. (2024). DeepSeek-V3 technical report. arXiv:2412.19437. https://doi.org/10.48550/arXiv.2412.19437</w:t>
       </w:r>
     </w:p>
     <w:p>
@@ -5387,7 +5387,7 @@
           <w:i w:val="0"/>
           <w:sz w:val="20"/>
         </w:rPr>
-        <w:t>Ding, H., Zhao, Y., Hu, T., Wang, Z., Patwardhan, M., &amp; Cohan, A. (2026). SciRAG: Adaptive, citation-aware, and outline-guided retrieval and synthesis for scientific literature. In Proceedings of EACL (Volume 1: Long Papers) (pp. 6440-6460).</w:t>
+        <w:t>Ding, H., Zhao, Y., Hu, T., Wang, Z., Patwardhan, M., &amp; Cohan, A. (2026). SciRAG: Adaptive, citation-aware, and outline-guided retrieval and synthesis for scientific literature. In Proceedings of EACL (Volume 1: Long Papers) (pp. 6440–6460).</w:t>
       </w:r>
     </w:p>
     <w:p>
@@ -5397,7 +5397,7 @@
           <w:i w:val="0"/>
           <w:sz w:val="20"/>
         </w:rPr>
-        <w:t>Hwang, J., Park, J., Park, H., et al. (2025). Retrieval-augmented generation with estimation of source reliability. In Proceedings of EMNLP (pp. 34279-34303).</w:t>
+        <w:t>Hwang, J., Park, J., Park, H., Kim, D., Park, S., &amp; Ok, J. (2025). Retrieval-augmented generation with estimation of source reliability. In Proceedings of EMNLP (pp. 34279–34303). https://doi.org/10.18653/v1/2025.emnlp-main.1738</w:t>
       </w:r>
     </w:p>
     <w:p>
@@ -5407,7 +5407,7 @@
           <w:i w:val="0"/>
           <w:sz w:val="20"/>
         </w:rPr>
-        <w:t>Karpukhin, V., Oguz, B., Min, S., et al. (2020). Dense passage retrieval for open-domain question answering. In Proceedings of EMNLP (pp. 6769-6781).</w:t>
+        <w:t>Karpukhin, V., Oğuz, B., Min, S., Lewis, P., Wu, L., Edunov, S., Chen, D., &amp; Yih, W.-t. (2020). Dense passage retrieval for open-domain question answering. In Proceedings of EMNLP (pp. 6769–6781). https://doi.org/10.18653/v1/2020.emnlp-main.550</w:t>
       </w:r>
     </w:p>
     <w:p>
@@ -5417,7 +5417,7 @@
           <w:i w:val="0"/>
           <w:sz w:val="20"/>
         </w:rPr>
-        <w:t>Lewis, P., Perez, E., Piktus, A., et al. (2020). Retrieval-augmented generation for knowledge-intensive NLP tasks. In Proceedings of NeurIPS (pp. 9459-9474).</w:t>
+        <w:t>Lewis, P., Perez, E., Piktus, A., Petroni, F., Karpukhin, V., Goyal, N., Küttler, H., Lewis, M., Yih, W.-t., Rocktäschel, T., Riedel, S., &amp; Kiela, D. (2020). Retrieval-augmented generation for knowledge-intensive NLP tasks. In Proceedings of NeurIPS (pp. 9459–9474).</w:t>
       </w:r>
     </w:p>
     <w:p>
@@ -5437,7 +5437,7 @@
           <w:i w:val="0"/>
           <w:sz w:val="20"/>
         </w:rPr>
-        <w:t>Nogueira, R., Jiang, Z., Pradeep, R., &amp; Lin, J. (2020). Document ranking with a pretrained sequence-to-sequence model. In Findings of EMNLP (pp. 708-718).</w:t>
+        <w:t>Nogueira, R., Jiang, Z., Pradeep, R., &amp; Lin, J. (2020). Document ranking with a pretrained sequence-to-sequence model. In Findings of EMNLP (pp. 708–718). https://doi.org/10.18653/v1/2020.findings-emnlp.63</w:t>
       </w:r>
     </w:p>
     <w:p>
@@ -5447,7 +5447,7 @@
           <w:i w:val="0"/>
           <w:sz w:val="20"/>
         </w:rPr>
-        <w:t>Ostendorff, M., Rethmeier, N., Augenstein, I., et al. (2022). Neighborhood contrastive learning for scientific document representations with citation embeddings. In Proceedings of EMNLP (pp. 11670-11688).</w:t>
+        <w:t>Ostendorff, M., Rethmeier, N., Augenstein, I., Gipp, B., &amp; Rehm, G. (2022). Neighborhood contrastive learning for scientific document representations with citation embeddings. In Proceedings of EMNLP (pp. 11670–11688).</w:t>
       </w:r>
     </w:p>
     <w:p>
@@ -5457,7 +5457,7 @@
           <w:i w:val="0"/>
           <w:sz w:val="20"/>
         </w:rPr>
-        <w:t>Priem, J., Piwowar, H., &amp; Orr, R. (2022). OpenAlex: A fully-open index of scholarly works, authors, venues, institutions, and concepts. arXiv:2205.01833.</w:t>
+        <w:t>Priem, J., Piwowar, H., &amp; Orr, R. (2022). OpenAlex: A fully-open index of scholarly works, authors, venues, institutions, and concepts. arXiv:2205.01833. https://doi.org/10.48550/arXiv.2205.01833</w:t>
       </w:r>
     </w:p>
     <w:p>
@@ -5467,7 +5467,7 @@
           <w:i w:val="0"/>
           <w:sz w:val="20"/>
         </w:rPr>
-        <w:t>Qu, Y., Ding, Y., Liu, J., et al. (2021). RocketQA: An optimized training approach to dense passage retrieval. In Proceedings of NAACL (pp. 5835-5847).</w:t>
+        <w:t>Qu, Y., Ding, Y., Liu, J., Liu, K., Ren, R., Zhao, W. X., Dong, D., Wu, H., &amp; Wang, H. (2021). RocketQA: An optimized training approach to dense passage retrieval. In Proceedings of NAACL (pp. 5835–5847). https://doi.org/10.18653/v1/2021.naacl-main.466</w:t>
       </w:r>
     </w:p>
     <w:p>
@@ -5477,7 +5477,7 @@
           <w:i w:val="0"/>
           <w:sz w:val="20"/>
         </w:rPr>
-        <w:t>Reimers, N., &amp; Gurevych, I. (2019). Sentence-BERT: Sentence embeddings using Siamese BERT-networks. In Proceedings of EMNLP-IJCNLP (pp. 3982-3992).</w:t>
+        <w:t>Reimers, N., &amp; Gurevych, I. (2019). Sentence-BERT: Sentence embeddings using Siamese BERT-networks. In Proceedings of EMNLP-IJCNLP (pp. 3982–3992). https://doi.org/10.18653/v1/D19-1410</w:t>
       </w:r>
     </w:p>
     <w:p>
@@ -5487,7 +5487,7 @@
           <w:i w:val="0"/>
           <w:sz w:val="20"/>
         </w:rPr>
-        <w:t>Robertson, S., &amp; Zaragoza, H. (2009). The probabilistic relevance framework: BM25 and beyond. Foundations and Trends in Information Retrieval, 3(4), 333-389.</w:t>
+        <w:t>Robertson, S., &amp; Zaragoza, H. (2009). The probabilistic relevance framework: BM25 and beyond. Foundations and Trends in Information Retrieval, 3(4), 333–389. https://doi.org/10.1561/1500000019</w:t>
       </w:r>
     </w:p>
     <w:p>
@@ -5497,7 +5497,7 @@
           <w:i w:val="0"/>
           <w:sz w:val="20"/>
         </w:rPr>
-        <w:t>Shao, Z., Gong, Y., Shen, Y., et al. (2023). Enhancing retrieval-augmented large language models with iterative retrieval-generation synergy. In Findings of EMNLP (pp. 9248-9274).</w:t>
+        <w:t>Shao, Z., Gong, Y., Shen, Y., Huang, M., Duan, N., &amp; Chen, W. (2023). Enhancing retrieval-augmented large language models with iterative retrieval-generation synergy. In Findings of EMNLP (pp. 9248–9274).</w:t>
       </w:r>
     </w:p>
     <w:p>
@@ -5507,7 +5507,7 @@
           <w:i w:val="0"/>
           <w:sz w:val="20"/>
         </w:rPr>
-        <w:t>Singh, A., D'Arcy, M., Cohan, A., et al. (2023). SciRepEval: A multi-format benchmark for scientific document representations. In Proceedings of EMNLP (pp. 5548-5566).</w:t>
+        <w:t>Singh, A., D'Arcy, M., Cohan, A., Downey, D., &amp; Feldman, S. (2023). SciRepEval: A multi-format benchmark for scientific document representations. In Proceedings of EMNLP (pp. 5548–5566).</w:t>
       </w:r>
     </w:p>
     <w:p>
@@ -5517,7 +5517,7 @@
           <w:i w:val="0"/>
           <w:sz w:val="20"/>
         </w:rPr>
-        <w:t>Thakur, N., Reimers, N., Rücklé, A., et al. (2021). BEIR: A heterogeneous benchmark for zero-shot evaluation of information retrieval models. In Proceedings of NeurIPS Datasets and Benchmarks.</w:t>
+        <w:t>Thakur, N., Reimers, N., Rücklé, A., Srivastava, A., &amp; Gurevych, I. (2021). BEIR: A heterogeneous benchmark for zero-shot evaluation of information retrieval models. In Proceedings of NeurIPS Datasets and Benchmarks.</w:t>
       </w:r>
     </w:p>
     <w:p>
@@ -5527,7 +5527,7 @@
           <w:i w:val="0"/>
           <w:sz w:val="20"/>
         </w:rPr>
-        <w:t>Voorhees, E., Alam, T., Bedrick, S., et al. (2021). TREC-COVID: Constructing a pandemic information retrieval test collection. ACM SIGIR Forum, 54(1), 1-12.</w:t>
+        <w:t>Voorhees, E., Alam, T., Bedrick, S., Demner-Fushman, D., Hersh, W. R., Lo, K., Roberts, K., Soboroff, I., &amp; Wang, L. L. (2021). TREC-COVID: Constructing a pandemic information retrieval test collection. ACM SIGIR Forum, 54(1), 1–12.</w:t>
       </w:r>
     </w:p>
     <w:p>
@@ -5537,7 +5537,7 @@
           <w:i w:val="0"/>
           <w:sz w:val="20"/>
         </w:rPr>
-        <w:t>Wadden, D., Lin, S., Lo, K., et al. (2020). Fact or fiction: Verifying scientific claims. In Proceedings of EMNLP (pp. 7534-7550).</w:t>
+        <w:t>Wadden, D., Lin, S., Lo, K., Wang, L. L., van Zuylen, M., Cohan, A., &amp; Hajishirzi, H. (2020). Fact or fiction: Verifying scientific claims. In Proceedings of EMNLP (pp. 7534–7550). https://doi.org/10.18653/v1/2020.emnlp-main.609</w:t>
       </w:r>
     </w:p>
     <w:p>
@@ -5547,7 +5547,7 @@
           <w:i w:val="0"/>
           <w:sz w:val="20"/>
         </w:rPr>
-        <w:t>Wang, L., Yang, N., Huang, X., et al. (2022). Text embeddings by weakly-supervised contrastive pre-training. arXiv:2212.03533.</w:t>
+        <w:t>Wang, L., Yang, N., Huang, X., Jiao, B., Yang, L., Jiang, D., Majumder, R., &amp; Wei, F. (2022). Text embeddings by weakly-supervised contrastive pre-training. arXiv:2212.03533. https://doi.org/10.48550/arXiv.2212.03533</w:t>
       </w:r>
     </w:p>
     <w:p>
@@ -5557,7 +5557,7 @@
           <w:i w:val="0"/>
           <w:sz w:val="20"/>
         </w:rPr>
-        <w:t>Wang, L., Ma, C., Feng, X., et al. (2024). A survey on large language model based autonomous agents. Frontiers of Computer Science, 18(6), 186345.</w:t>
+        <w:t>Wang, L., Ma, C., Feng, X., Zhang, Z., Yang, H., Zhang, J., Chen, Z., Tang, J., Chen, X., Lin, Y., Zhao, W. X., Wei, Z., &amp; Wen, J.-R. (2024). A survey on large language model based autonomous agents. Frontiers of Computer Science, 18(6), 186345.</w:t>
       </w:r>
     </w:p>
     <w:p>
@@ -5567,7 +5567,7 @@
           <w:i w:val="0"/>
           <w:sz w:val="20"/>
         </w:rPr>
-        <w:t>Wang, W., Wei, F., Dong, L., et al. (2020). MiniLM: Deep self-attention distillation for task-agnostic compression of pre-trained transformers. In Proceedings of NeurIPS.</w:t>
+        <w:t>Wang, W., Wei, F., Dong, L., Bao, H., Yang, N., &amp; Zhou, M. (2020). MiniLM: Deep self-attention distillation for task-agnostic compression of pre-trained transformers. In Proceedings of NeurIPS.</w:t>
       </w:r>
     </w:p>
     <w:p>
@@ -5577,7 +5577,7 @@
           <w:i w:val="0"/>
           <w:sz w:val="20"/>
         </w:rPr>
-        <w:t>Xiao, S., Liu, Z., Zhang, P., Muennighoff, N., et al. (2023). C-Pack: Packaged resources to advance general Chinese embedding. arXiv:2309.07597.</w:t>
+        <w:t>Xiao, S., Liu, Z., Zhang, P., &amp; Muennighoff, N. (2023). C-Pack: Packaged resources to advance general Chinese embedding. arXiv:2309.07597. https://doi.org/10.48550/arXiv.2309.07597</w:t>
       </w:r>
     </w:p>
     <w:p>
@@ -5587,7 +5587,7 @@
           <w:i w:val="0"/>
           <w:sz w:val="20"/>
         </w:rPr>
-        <w:t>Yousuf, R. B., Xu, S., Sharma, M., et al. (2026). Utilizing metadata for better retrieval-augmented generation. In Proceedings of ECIR (pp. 305-319).</w:t>
+        <w:t>Yousuf, R. B., Xu, S., Sharma, M., Neeser, A., Latimer, C., &amp; Ramakrishnan, N. (2026). Utilizing metadata for better retrieval-augmented generation. In Proceedings of ECIR (pp. 305–319). https://doi.org/10.1007/978-3-032-21289-4_20</w:t>
       </w:r>
     </w:p>
     <w:p>
@@ -5597,7 +5597,7 @@
           <w:i w:val="0"/>
           <w:sz w:val="20"/>
         </w:rPr>
-        <w:t>Zheng, L., Chiang, W.-L., Sheng, Y., et al. (2023). Judging LLM-as-a-judge with MT-Bench and Chatbot Arena. In Proceedings of NeurIPS Datasets and Benchmarks.</w:t>
+        <w:t>Zheng, L., Chiang, W.-L., Sheng, Y., Zhuang, S., Wu, Z., Zhuang, Y., Lin, Z., Li, Z., Li, D., Xing, E. P., Zhang, H., Gonzalez, J. E., &amp; Stoica, I. (2023). Judging LLM-as-a-judge with MT-Bench and Chatbot Arena. In Proceedings of NeurIPS Datasets and Benchmarks.</w:t>
       </w:r>
     </w:p>
     <w:p>
@@ -5607,7 +5607,7 @@
           <w:i w:val="0"/>
           <w:sz w:val="20"/>
         </w:rPr>
-        <w:t>Zhuang, S., Zhuang, H., Koopman, B., &amp; Zuccon, G. (2024). A setwise approach for effective and highly efficient zero-shot ranking with large language models. In Proceedings of SIGIR (pp. 38-47).</w:t>
+        <w:t>Zhuang, S., Zhuang, H., Koopman, B., &amp; Zuccon, G. (2024). A setwise approach for effective and highly efficient zero-shot ranking with large language models. In Proceedings of SIGIR (pp. 38–47).</w:t>
       </w:r>
     </w:p>
     <w:sectPr>

</xml_diff>

<commit_message>
feat: add confidence-gated BiblioGuard retrieval
</commit_message>
<xml_diff>
--- a/manuscript/01_Manuscript_ESWA.docx
+++ b/manuscript/01_Manuscript_ESWA.docx
@@ -12,7 +12,7 @@
           <w:i w:val="0"/>
           <w:sz w:val="28"/>
         </w:rPr>
-        <w:t>When does bibliographic metadata help scientific retrieval-augmented generation? A four-domain evaluation of metadata-aware hybrid retrieval with a deployed academic writing assistant</w:t>
+        <w:t>BiblioGuard: Confidence-gated bibliographic metadata intervention for cross-domain scientific retrieval-augmented generation</w:t>
       </w:r>
     </w:p>
     <w:p/>
@@ -33,7 +33,7 @@
           <w:i w:val="0"/>
           <w:sz w:val="22"/>
         </w:rPr>
-        <w:t>Retrieval-augmented generation (RAG) systems for scientific literature often ship one static retrieval configuration, yet whether one is optimal across research domains—and whether bibliographic metadata should influence ranking—remains insufficiently quantified. We evaluate ten retrieval configurations—BM25, latent semantic analysis, two pretrained dense encoders, equal-weight hybrid fusion, and metadata-aware variants (UMA-RAG, LP-RAG, and a citation- and recency-aware re-ranker, CA-HR)—on SCIDOCS, SciFact, NFCorpus, and TREC-COVID (3,633 to 171,332 documents; 1,673 queries), using real citation counts, years, and venues from Semantic Scholar and OpenAlex (coverage 69.8%-99.7%). Three findings emerge. First, the optimal strategy is domain-dependent: no configuration wins everywhere. Second, citation-aware signals help only where citation authority predicts relevance (on SCIDOCS, relevant documents carry a median of 566 citations versus 71 for non-relevant ones; AUC 0.798), are neutral where the association is weak, mildly harmful where citations are uninformative or inversely associated with relevance (AUC 0.498 and 0.461); the gain on the weaker MiniLM backbone does not transfer to the stronger BGE backbone under fixed hyperparameters, and a 30-combination weight sweep recovers it only on the citation-informative corpus. Third, per-query strategy selection offers little recoverable headroom: a 12-feature logistic router does not exceed majority-class behaviour on any dataset (kappa near 0). On 200 paired queries, answer relevance and faithfulness are statistically indistinguishable between the hybrid and metadata-aware backends. The pipeline is deployed in a live academic writing assistant (anonymized for review); we report a one-month pilot deployment. Data, code, and per-query results are released through an anonymized repository.</w:t>
+        <w:t>Bibliographic metadata is a tempting ranking prior for scientific retrieval-augmented generation (RAG), but a static citation or recency boost can improve one domain and harm another. We introduce BiblioGuard, a confidence-gated intervention policy that decides, for each query, whether a strong metadata-free hybrid should be modified. Nine single-signal citation or recency actions are evaluated from historical queries. For a held-out query, word- and character-level TF-IDF retrieve similar training queries; similarity-weighted paired NDCG@10 effects are converted into simultaneous one-sided Student-t lower confidence bounds. BiblioGuard selects the action with the largest positive lower bound and otherwise abstains to BGE-Hybrid. Five-fold cross-fitting ensures that a query's relevance judgments never enter its representation, neighbours, effect estimate, or decision. Across SCIDOCS, SciFact, NFCorpus, and TREC-COVID (1,673 queries), BiblioGuard raises SCIDOCS NDCG@10 from 0.1832 to 0.1881 (+0.0049; 18.7% intervention rate; Holm-adjusted p &lt; 0.001) and abstains on the other three domains, producing no observed negative mean transfer. Removing the simultaneous lower-bound gate activates 45.8%-67.3% of queries in those domains and reduces NDCG@10 by 0.00003, 0.00339, and 0.01148, respectively. Corpus diagnostics explain the pattern: citation actions are supported only where citation count predicts relevance. A secondary 200-query generation study and a pilot deployment establish end-to-end feasibility. Code, cross-fitted decisions, and per-query scores are released for exact reproduction.</w:t>
       </w:r>
     </w:p>
     <w:p>
@@ -43,7 +43,7 @@
           <w:i/>
           <w:sz w:val="20"/>
         </w:rPr>
-        <w:t>Keywords: retrieval-augmented generation; scientific information retrieval; hybrid retrieval; bibliographic metadata; citation-aware ranking; query routing; expert systems</w:t>
+        <w:t>Keywords: retrieval-augmented generation; scientific information retrieval; bibliographic metadata; selective prediction; treatment-effect routing; abstention; expert systems</w:t>
       </w:r>
     </w:p>
     <w:p>
@@ -68,7 +68,7 @@
           <w:i w:val="0"/>
           <w:sz w:val="22"/>
         </w:rPr>
-        <w:t>Academic writing and literature review increasingly rely on retrieval-augmented generation (RAG): a user question is first grounded in passages retrieved from a scholarly corpus, and a large language model then composes an answer conditioned on those passages (Lewis et al., 2020). The retrieval stage is the dominant determinant of end-to-end quality, because passages that are never retrieved cannot be cited. Yet most deployed scientific RAG systems adopt one fixed retrieval configuration—typically BM25 or a pretrained dense encoder—chosen once, on one benchmark, and generalised to every domain the system serves.</w:t>
+        <w:t>Scientific retrieval-augmented generation (RAG) grounds a generated answer in papers returned by an information-retrieval system (Lewis et al., 2020). Bibliographic fields offer evidence unavailable to content encoders: citation count approximates accumulated authority and publication year captures timeliness. Their use is nevertheless an intervention, not a free feature. A fixed citation boost can favour canonical work in computer science while suppressing recent evidence in pandemic medicine. The same action can therefore be beneficial, irrelevant, or harmful across queries and domains.</w:t>
       </w:r>
     </w:p>
     <w:p>
@@ -78,7 +78,7 @@
           <w:i w:val="0"/>
           <w:sz w:val="22"/>
         </w:rPr>
-        <w:t>This practice rests on an untested assumption: that the optimal retrieval configuration is stable across research domains. Scientific corpora differ systematically in document length, vocabulary specificity, claim style, and—critically for metadata-aware methods—in the density and coverage of bibliographic signals such as citation counts, publication years, and venue prestige. A citation boost that helps on a mature computer-science corpus may be useless on an emergency pandemic corpus where a third of the documents are fresh preprints with zero citations.</w:t>
+        <w:t>Existing adaptive RAG routers largely predict which retriever will perform best. That objective is insufficient when metadata is optional and the deployment already has a strong content-based fallback: the operational question is whether the incremental effect of a metadata action is positive with enough evidence to justify departing from the fallback. Absolute performance prediction also ignores the paired structure of alternative rankings for the same query and can over-intervene after choosing among many noisy actions.</w:t>
       </w:r>
     </w:p>
     <w:p>
@@ -88,7 +88,7 @@
           <w:i w:val="0"/>
           <w:sz w:val="22"/>
         </w:rPr>
-        <w:t>This paper quantifies that question directly. We evaluate ten retrieval configurations on four public scientific benchmarks spanning computer science, biomedicine, nutrition, and pandemic medicine, using real—never synthetic—bibliographic metadata acquired from the Semantic Scholar and OpenAlex APIs. Unlike prior comparisons that rely on simulated metadata or single benchmarks, our study couples (i) a cross-domain retrieval evaluation with significance testing, (ii) ablation and query-corruption robustness analyses of the metadata terms, (iii) an oracle-and-router analysis that measures how much per-query adaptivity could ever buy, (iv) a generation-side study that asks whether backend differences survive into the final answer, and (v) a deployment case study in a live academic writing assistant used by real users (system anonymized for review).</w:t>
+        <w:t>We address this gap with BiblioGuard, a cross-fitted, confidence-gated meta-policy for bibliographic intervention. It estimates local paired uplift for nine single-signal citation or recency actions from similar historical queries, corrects the one-sided decision threshold across the action family, and abstains to BGE-Hybrid unless the best action has a positive lower confidence bound. The policy is lightweight, encoder-agnostic, and auditable: each decision is accompanied by its estimated effect, lower bound, neighbour count, and selected action.</w:t>
       </w:r>
     </w:p>
     <w:p>
@@ -98,7 +98,7 @@
           <w:i w:val="0"/>
           <w:sz w:val="22"/>
         </w:rPr>
-        <w:t>Rather than proposing yet another retrieval algorithm, we frame the study around three research questions:</w:t>
+        <w:t>We study three research questions:</w:t>
       </w:r>
     </w:p>
     <w:p>
@@ -106,7 +106,7 @@
         <w:pStyle w:val="ListBullet"/>
       </w:pPr>
       <w:r>
-        <w:t>RQ1. Does bibliographic metadata improve scientific retrieval consistently across domains, or are its benefits conditional on corpus properties?</w:t>
+        <w:t>RQ1. Can paired-effect confidence gating exploit useful metadata without the cross-domain negative transfer of unconstrained routing?</w:t>
       </w:r>
     </w:p>
     <w:p>
@@ -114,7 +114,7 @@
         <w:pStyle w:val="ListBullet"/>
       </w:pPr>
       <w:r>
-        <w:t>RQ2. Which metadata signals help, under what corpus conditions do they fail, and should retrieval strategy adaptation happen per query or per domain?</w:t>
+        <w:t>RQ2. Which parts of BiblioGuard—local effect estimation, simultaneous confidence correction, and abstention—account for its behaviour?</w:t>
       </w:r>
     </w:p>
     <w:p>
@@ -122,7 +122,7 @@
         <w:pStyle w:val="ListBullet"/>
       </w:pPr>
       <w:r>
-        <w:t>RQ3. Do retrieval-level differences actually propagate to the generated answers and to deployment decisions in a running system?</w:t>
+        <w:t>RQ3. Which corpus signals explain activation, and is the resulting decision layer feasible in an end-to-end scientific RAG system?</w:t>
       </w:r>
     </w:p>
     <w:p>
@@ -140,7 +140,7 @@
         <w:pStyle w:val="ListBullet"/>
       </w:pPr>
       <w:r>
-        <w:t>A four-domain, ten-configuration evaluation of scientific RAG retrieval with real bibliographic metadata, showing that the best configuration is domain-dependent and that BGE-based retrieval leads on three of four domains (RQ1);</w:t>
+        <w:t>BiblioGuard, a new selective metadata-intervention algorithm that combines local paired treatment effects, simultaneous one-sided confidence bounds, and an explicit metadata-free fallback (RQ1);</w:t>
       </w:r>
     </w:p>
     <w:p>
@@ -148,7 +148,7 @@
         <w:pStyle w:val="ListBullet"/>
       </w:pPr>
       <w:r>
-        <w:t>Evidence that citation- and recency-aware re-ranking (CA-HR) is conditional on bibliographic informativeness, not coverage—significantly helpful where citations strongly predict relevance (computer science), neutral where the association is weak (biomedical claims), mildly harmful where it is absent or inverted (nutrition, pandemic medicine)—and backbone-conditional: the citation gain observed on the weaker MiniLM backbone does not transfer to the stronger BGE backbone under fixed a-priori weights; a weight sweep recovers it only on the citation-informative corpus (RQ1, RQ2);</w:t>
+        <w:t>A leakage-resistant five-fold evaluation protocol in which vectoriser fitting, neighbour selection, effect estimation, and action choice exclude each held-out query and its relevance judgments (RQ1, RQ2);</w:t>
       </w:r>
     </w:p>
     <w:p>
@@ -156,7 +156,7 @@
         <w:pStyle w:val="ListBullet"/>
       </w:pPr>
       <w:r>
-        <w:t>A replicated negative result on per-query routing: oracle headroom is small and a lightweight feature-based router (PAV Router) collapses to majority-class behaviour on all four datasets, implying adaptivity should be allocated at the domain level (RQ2);</w:t>
+        <w:t>A mechanism ablation showing that removing the confidence gate gains more on SCIDOCS but causes negative transfer on SciFact, NFCorpus, and TREC-COVID, whereas the complete policy abstains there (RQ2);</w:t>
       </w:r>
     </w:p>
     <w:p>
@@ -164,7 +164,7 @@
         <w:pStyle w:val="ListBullet"/>
       </w:pPr>
       <w:r>
-        <w:t>A four-domain generation-side evaluation (200 paired queries) showing answer relevance and faithfulness are statistically indistinguishable across the two leading retrieval backends, together with a citation-precision analysis of LLM answers (RQ3);</w:t>
+        <w:t>A four-domain diagnostic account linking action utility to citation-relevance association rather than metadata coverage, plus comparisons with ten retrieval configurations and two rank-fusion baselines (RQ3);</w:t>
       </w:r>
     </w:p>
     <w:p>
@@ -172,7 +172,7 @@
         <w:pStyle w:val="ListBullet"/>
       </w:pPr>
       <w:r>
-        <w:t>A deployment feasibility case study of the full pipeline in the live system, with architecture, cost, and one month of real usage statistics (RQ3). All code, data, and per-query results are released through an anonymized public repository (link withheld for anonymous review).</w:t>
+        <w:t>An exact reproduction package containing code, nine-action outcomes, cross-fitted decisions, 135 algorithm-integrity checks, and a secondary generation/deployment feasibility study (RQ3).</w:t>
       </w:r>
     </w:p>
     <w:p>
@@ -182,7 +182,7 @@
           <w:i w:val="0"/>
           <w:sz w:val="22"/>
         </w:rPr>
-        <w:t>The remainder of the paper is organised as follows. Section 2 reviews related work. Section 3 describes the deployed system. Section 4 formalises the ten retrieval configurations and the router. Section 5 details datasets, metadata acquisition, and evaluation protocol. Section 6 reports results. Section 7 presents the deployment case study. Section 8 discusses implications and limitations, and Section 9 concludes.</w:t>
+        <w:t>The remainder of the paper is organised as follows. Section 2 reviews related work. Section 3 describes the deployed system. Section 4 formalises the retrieval actions and BiblioGuard. Section 5 details datasets, metadata acquisition, and evaluation protocol. Section 6 reports results. Section 7 presents the deployment case study. Section 8 discusses implications and limitations, and Section 9 concludes.</w:t>
       </w:r>
     </w:p>
     <w:p>
@@ -252,7 +252,7 @@
           <w:i w:val="0"/>
           <w:sz w:val="22"/>
         </w:rPr>
-        <w:t>Recent systems make retrieval adaptive: Self-RAG (Asai et al., 2024b) learns when to retrieve, ITER-RETGEN (Shao et al., 2023) interleaves retrieval and generation, and agent-based assistants (Wang et al., 2024) plan multi-step retrieval. OpenScholar (Asai et al., 2024a) synthesises scientific literature with retrieval-augmented models. These approaches adapt retrieval decisions per query or per generation step; our router analysis asks a sharper question—given a portfolio of cheap retrieval strategies, how much could perfect per-query selection possibly gain, and can surface query features recover it? On four datasets the answer for the tested surface-feature router is consistently negative, which constrains where this lightweight form of adaptivity is worth its cost.</w:t>
+        <w:t>Recent systems make retrieval adaptive: Self-RAG (Asai et al., 2024) learns when to retrieve, ITER-RETGEN (Shao et al., 2023) interleaves retrieval and generation, and agent-based assistants (Wang et al., 2024) plan multi-step retrieval. OpenScholar (Asai et al., 2026) synthesises scientific literature with retrieval-augmented models. Query-wise Dual-perspective Adaptive Retrieval (QuDAR) selects sparse, dense, or expanded-query retrieval from score-margin confidence and an LLM perspective (Kim et al., 2026). R3AG learns retriever capabilities and routes using both retrieval-quality and generation-utility labels (Zhao et al., 2026), while ContextualRouter uses past query performance for non-parametric LLM/retriever routing (Varangot-Reille et al., 2026). These systems predict absolute candidate utility. BiblioGuard instead estimates the paired incremental effect of an optional metadata action relative to a fixed strong fallback, applies a simultaneous lower-bound test over all actions, and can choose no intervention. The target, correction, and abstention rule are therefore distinct from best-retriever classification.</w:t>
       </w:r>
     </w:p>
     <w:p>
@@ -282,7 +282,7 @@
           <w:i w:val="0"/>
           <w:sz w:val="22"/>
         </w:rPr>
-        <w:t>2.5. Recent metadata-aware scientific RAG and positioning</w:t>
+        <w:t>2.5. Metadata-aware scientific RAG and positioning</w:t>
       </w:r>
     </w:p>
     <w:p>
@@ -292,7 +292,22 @@
           <w:i w:val="0"/>
           <w:sz w:val="22"/>
         </w:rPr>
-        <w:t>The RAG literature has moved quickly, and several 2025-2026 studies are closest to our problem. SurveyGen (Bao et al., 2025) builds a large-scale scientific survey dataset and a quality-aware framework (QUAL-SG) that injects citation counts, author influence, and venue reputation into literature retrieval for survey generation; it demonstrates that quality metadata helps its generation pipeline but does not isolate when or why the retrieval-level gain occurs. Yousuf et al. (2026) systematically compare metadata-as-text, dual-encoder, and reformulation strategies on SEC filings and show that moderate metadata weights help on structured financial corpora; their metadata is structural (company, form, section), not bibliometric. SciRAG (Ding et al., 2026) couples adaptive retrieval with citation-graph symbolic reasoning and outline-guided synthesis for scientific question answering, using citations to organise evidence rather than as a ranking prior. RA-RAG (Hwang et al., 2025) estimates per-source reliability by cross-checking and retrieves only from reliable sources in multi-source QA. Table 1 summarises the positioning. Our work is complementary and, to our knowledge, the first to (i) quantify, across four scientific domains, when citation- and recency-aware ranking priors help, are neutral, or harm—linking the outcome to a measurable corpus property (citation-relevance AUC) rather than to metadata coverage—and (ii) show, via a weight-sensitivity sweep on a stronger encoder, that the gain is backbone-dependent and re-emerges only where citations are informative, and that it does not propagate to generation quality or to a deployed system.</w:t>
+        <w:t>The RAG literature has moved quickly, and several 2025-2026 studies are closest to our problem. SurveyGen (Bao et al., 2025) builds a large-scale scientific survey dataset and a quality-aware framework (QUAL-SG) that injects citation counts, author influence, and venue reputation into literature retrieval for survey generation; it demonstrates that quality metadata helps its generation pipeline but does not isolate when or why the retrieval-level gain occurs. Yousuf et al. (2026) systematically compare metadata-as-text, dual-encoder, and reformulation strategies on SEC filings and show that moderate metadata weights help on structured financial corpora; their metadata is structural (company, form, section), not bibliometric. SciRAG (Ding et al., 2026) couples adaptive retrieval with citation-graph symbolic reasoning and outline-guided synthesis for scientific question answering, using citations to organise evidence rather than as a ranking prior. RA-RAG (Hwang et al., 2025) estimates per-source reliability by cross-checking and retrieves only from reliable sources in multi-source QA. Table 1 summarises the positioning. Our work is complementary and, to our knowledge, the first to (i) quantify, across four scientific domains, when citation- and recency-aware ranking priors help, are neutral, or harm—linking the outcome to a measurable corpus property (citation-relevance AUC) rather than to metadata coverage—and (ii) turn that diagnostic finding into a query-level intervention algorithm with paired-effect estimation, multiplicity-aware confidence gating, and abstention. This is not a claim of a distribution-free safety guarantee: the confidence bound is a local, similarity-weighted decision statistic whose empirical behaviour is evaluated by cross-fitting.</w:t>
+      </w:r>
+    </w:p>
+    <w:p>
+      <w:r>
+        <w:br w:type="page"/>
+      </w:r>
+    </w:p>
+    <w:p>
+      <w:r>
+        <w:rPr>
+          <w:b w:val="0"/>
+          <w:i/>
+          <w:sz w:val="18"/>
+        </w:rPr>
+        <w:t>Table 1. Algorithmic positioning against recent adaptive-retrieval routers. Metadata-aware systems are reviewed in the text.</w:t>
       </w:r>
     </w:p>
     <w:tbl>
@@ -302,23 +317,26 @@
         <w:tblLook w:firstColumn="1" w:firstRow="1" w:lastColumn="0" w:lastRow="0" w:noHBand="0" w:noVBand="1" w:val="04A0"/>
       </w:tblPr>
       <w:tblGrid>
-        <w:gridCol w:w="1440"/>
-        <w:gridCol w:w="1440"/>
-        <w:gridCol w:w="1440"/>
-        <w:gridCol w:w="1440"/>
-        <w:gridCol w:w="1440"/>
-        <w:gridCol w:w="1440"/>
+        <w:gridCol w:w="1728"/>
+        <w:gridCol w:w="1728"/>
+        <w:gridCol w:w="1728"/>
+        <w:gridCol w:w="1728"/>
+        <w:gridCol w:w="1728"/>
       </w:tblGrid>
       <w:tr>
-        <w:tc>
-          <w:tcPr>
-            <w:tcW w:type="dxa" w:w="1440"/>
+        <w:trPr>
+          <w:cantSplit/>
+          <w:tblHeader/>
+        </w:trPr>
+        <w:tc>
+          <w:tcPr>
+            <w:tcW w:type="dxa" w:w="1728"/>
           </w:tcPr>
           <w:p>
             <w:r>
               <w:rPr>
                 <w:b/>
-                <w:sz w:val="16"/>
+                <w:sz w:val="14"/>
               </w:rPr>
               <w:t>Study</w:t>
             </w:r>
@@ -326,136 +344,112 @@
         </w:tc>
         <w:tc>
           <w:tcPr>
-            <w:tcW w:type="dxa" w:w="1440"/>
+            <w:tcW w:type="dxa" w:w="1728"/>
           </w:tcPr>
           <w:p>
             <w:r>
               <w:rPr>
                 <w:b/>
-                <w:sz w:val="16"/>
-              </w:rPr>
-              <w:t>Venue</w:t>
-            </w:r>
-          </w:p>
-        </w:tc>
-        <w:tc>
-          <w:tcPr>
-            <w:tcW w:type="dxa" w:w="1440"/>
+                <w:sz w:val="14"/>
+              </w:rPr>
+              <w:t>Decision target</w:t>
+            </w:r>
+          </w:p>
+        </w:tc>
+        <w:tc>
+          <w:tcPr>
+            <w:tcW w:type="dxa" w:w="1728"/>
           </w:tcPr>
           <w:p>
             <w:r>
               <w:rPr>
                 <w:b/>
-                <w:sz w:val="16"/>
-              </w:rPr>
-              <w:t>Metadata signal</w:t>
-            </w:r>
-          </w:p>
-        </w:tc>
-        <w:tc>
-          <w:tcPr>
-            <w:tcW w:type="dxa" w:w="1440"/>
+                <w:sz w:val="14"/>
+              </w:rPr>
+              <w:t>Supervision</w:t>
+            </w:r>
+          </w:p>
+        </w:tc>
+        <w:tc>
+          <w:tcPr>
+            <w:tcW w:type="dxa" w:w="1728"/>
           </w:tcPr>
           <w:p>
             <w:r>
               <w:rPr>
                 <w:b/>
-                <w:sz w:val="16"/>
-              </w:rPr>
-              <w:t>Role of metadata</w:t>
-            </w:r>
-          </w:p>
-        </w:tc>
-        <w:tc>
-          <w:tcPr>
-            <w:tcW w:type="dxa" w:w="1440"/>
+                <w:sz w:val="14"/>
+              </w:rPr>
+              <w:t>Family-wise gate</w:t>
+            </w:r>
+          </w:p>
+        </w:tc>
+        <w:tc>
+          <w:tcPr>
+            <w:tcW w:type="dxa" w:w="1728"/>
           </w:tcPr>
           <w:p>
             <w:r>
               <w:rPr>
                 <w:b/>
-                <w:sz w:val="16"/>
-              </w:rPr>
-              <w:t>Cross-domain analysis</w:t>
-            </w:r>
-          </w:p>
-        </w:tc>
-        <w:tc>
-          <w:tcPr>
-            <w:tcW w:type="dxa" w:w="1440"/>
-          </w:tcPr>
-          <w:p>
-            <w:r>
-              <w:rPr>
-                <w:b/>
-                <w:sz w:val="16"/>
-              </w:rPr>
-              <w:t>Deployment</w:t>
+                <w:sz w:val="14"/>
+              </w:rPr>
+              <w:t>Explicit abstention</w:t>
             </w:r>
           </w:p>
         </w:tc>
       </w:tr>
       <w:tr>
-        <w:tc>
-          <w:tcPr>
-            <w:tcW w:type="dxa" w:w="1440"/>
-          </w:tcPr>
-          <w:p>
-            <w:r>
-              <w:rPr>
-                <w:sz w:val="16"/>
-              </w:rPr>
-              <w:t>Bao et al. (2025)</w:t>
-            </w:r>
-          </w:p>
-        </w:tc>
-        <w:tc>
-          <w:tcPr>
-            <w:tcW w:type="dxa" w:w="1440"/>
-          </w:tcPr>
-          <w:p>
-            <w:r>
-              <w:rPr>
-                <w:sz w:val="16"/>
-              </w:rPr>
-              <w:t>EMNLP 2025</w:t>
-            </w:r>
-          </w:p>
-        </w:tc>
-        <w:tc>
-          <w:tcPr>
-            <w:tcW w:type="dxa" w:w="1440"/>
-          </w:tcPr>
-          <w:p>
-            <w:r>
-              <w:rPr>
-                <w:sz w:val="16"/>
-              </w:rPr>
-              <w:t>Citations, author, venue</w:t>
-            </w:r>
-          </w:p>
-        </w:tc>
-        <w:tc>
-          <w:tcPr>
-            <w:tcW w:type="dxa" w:w="1440"/>
-          </w:tcPr>
-          <w:p>
-            <w:r>
-              <w:rPr>
-                <w:sz w:val="16"/>
-              </w:rPr>
-              <w:t>Quality filter for survey generation</w:t>
-            </w:r>
-          </w:p>
-        </w:tc>
-        <w:tc>
-          <w:tcPr>
-            <w:tcW w:type="dxa" w:w="1440"/>
-          </w:tcPr>
-          <w:p>
-            <w:r>
-              <w:rPr>
-                <w:sz w:val="16"/>
+        <w:trPr>
+          <w:cantSplit/>
+        </w:trPr>
+        <w:tc>
+          <w:tcPr>
+            <w:tcW w:type="dxa" w:w="1728"/>
+          </w:tcPr>
+          <w:p>
+            <w:r>
+              <w:rPr>
+                <w:sz w:val="14"/>
+              </w:rPr>
+              <w:t>QuDAR (Kim et al., 2026)</w:t>
+            </w:r>
+          </w:p>
+        </w:tc>
+        <w:tc>
+          <w:tcPr>
+            <w:tcW w:type="dxa" w:w="1728"/>
+          </w:tcPr>
+          <w:p>
+            <w:r>
+              <w:rPr>
+                <w:sz w:val="14"/>
+              </w:rPr>
+              <w:t>Best retriever/query form</w:t>
+            </w:r>
+          </w:p>
+        </w:tc>
+        <w:tc>
+          <w:tcPr>
+            <w:tcW w:type="dxa" w:w="1728"/>
+          </w:tcPr>
+          <w:p>
+            <w:r>
+              <w:rPr>
+                <w:sz w:val="14"/>
+              </w:rPr>
+              <w:t>Margins and LLM decision</w:t>
+            </w:r>
+          </w:p>
+        </w:tc>
+        <w:tc>
+          <w:tcPr>
+            <w:tcW w:type="dxa" w:w="1728"/>
+          </w:tcPr>
+          <w:p>
+            <w:r>
+              <w:rPr>
+                <w:sz w:val="14"/>
               </w:rPr>
               <w:t>No</w:t>
             </w:r>
@@ -463,12 +457,12 @@
         </w:tc>
         <w:tc>
           <w:tcPr>
-            <w:tcW w:type="dxa" w:w="1440"/>
-          </w:tcPr>
-          <w:p>
-            <w:r>
-              <w:rPr>
-                <w:sz w:val="16"/>
+            <w:tcW w:type="dxa" w:w="1728"/>
+          </w:tcPr>
+          <w:p>
+            <w:r>
+              <w:rPr>
+                <w:sz w:val="14"/>
               </w:rPr>
               <w:t>No</w:t>
             </w:r>
@@ -476,79 +470,69 @@
         </w:tc>
       </w:tr>
       <w:tr>
-        <w:tc>
-          <w:tcPr>
-            <w:tcW w:type="dxa" w:w="1440"/>
-          </w:tcPr>
-          <w:p>
-            <w:r>
-              <w:rPr>
-                <w:sz w:val="16"/>
-              </w:rPr>
-              <w:t>Yousuf et al. (2026)</w:t>
-            </w:r>
-          </w:p>
-        </w:tc>
-        <w:tc>
-          <w:tcPr>
-            <w:tcW w:type="dxa" w:w="1440"/>
-          </w:tcPr>
-          <w:p>
-            <w:r>
-              <w:rPr>
-                <w:sz w:val="16"/>
-              </w:rPr>
-              <w:t>ECIR 2026</w:t>
-            </w:r>
-          </w:p>
-        </w:tc>
-        <w:tc>
-          <w:tcPr>
-            <w:tcW w:type="dxa" w:w="1440"/>
-          </w:tcPr>
-          <w:p>
-            <w:r>
-              <w:rPr>
-                <w:sz w:val="16"/>
-              </w:rPr>
-              <w:t>Structural fields (SEC)</w:t>
-            </w:r>
-          </w:p>
-        </w:tc>
-        <w:tc>
-          <w:tcPr>
-            <w:tcW w:type="dxa" w:w="1440"/>
-          </w:tcPr>
-          <w:p>
-            <w:r>
-              <w:rPr>
-                <w:sz w:val="16"/>
-              </w:rPr>
-              <w:t>Embedding/fusion strategies</w:t>
-            </w:r>
-          </w:p>
-        </w:tc>
-        <w:tc>
-          <w:tcPr>
-            <w:tcW w:type="dxa" w:w="1440"/>
-          </w:tcPr>
-          <w:p>
-            <w:r>
-              <w:rPr>
-                <w:sz w:val="16"/>
-              </w:rPr>
-              <w:t>Single corpus</w:t>
-            </w:r>
-          </w:p>
-        </w:tc>
-        <w:tc>
-          <w:tcPr>
-            <w:tcW w:type="dxa" w:w="1440"/>
-          </w:tcPr>
-          <w:p>
-            <w:r>
-              <w:rPr>
-                <w:sz w:val="16"/>
+        <w:trPr>
+          <w:cantSplit/>
+        </w:trPr>
+        <w:tc>
+          <w:tcPr>
+            <w:tcW w:type="dxa" w:w="1728"/>
+          </w:tcPr>
+          <w:p>
+            <w:r>
+              <w:rPr>
+                <w:sz w:val="14"/>
+              </w:rPr>
+              <w:t>R3AG (Zhao et al., 2026)</w:t>
+            </w:r>
+          </w:p>
+        </w:tc>
+        <w:tc>
+          <w:tcPr>
+            <w:tcW w:type="dxa" w:w="1728"/>
+          </w:tcPr>
+          <w:p>
+            <w:r>
+              <w:rPr>
+                <w:sz w:val="14"/>
+              </w:rPr>
+              <w:t>Best retriever</w:t>
+            </w:r>
+          </w:p>
+        </w:tc>
+        <w:tc>
+          <w:tcPr>
+            <w:tcW w:type="dxa" w:w="1728"/>
+          </w:tcPr>
+          <w:p>
+            <w:r>
+              <w:rPr>
+                <w:sz w:val="14"/>
+              </w:rPr>
+              <w:t>Retrieval + generation labels</w:t>
+            </w:r>
+          </w:p>
+        </w:tc>
+        <w:tc>
+          <w:tcPr>
+            <w:tcW w:type="dxa" w:w="1728"/>
+          </w:tcPr>
+          <w:p>
+            <w:r>
+              <w:rPr>
+                <w:sz w:val="14"/>
+              </w:rPr>
+              <w:t>No</w:t>
+            </w:r>
+          </w:p>
+        </w:tc>
+        <w:tc>
+          <w:tcPr>
+            <w:tcW w:type="dxa" w:w="1728"/>
+          </w:tcPr>
+          <w:p>
+            <w:r>
+              <w:rPr>
+                <w:sz w:val="14"/>
               </w:rPr>
               <w:t>No</w:t>
             </w:r>
@@ -556,66 +540,56 @@
         </w:tc>
       </w:tr>
       <w:tr>
-        <w:tc>
-          <w:tcPr>
-            <w:tcW w:type="dxa" w:w="1440"/>
-          </w:tcPr>
-          <w:p>
-            <w:r>
-              <w:rPr>
-                <w:sz w:val="16"/>
-              </w:rPr>
-              <w:t>Ding et al. (2026)</w:t>
-            </w:r>
-          </w:p>
-        </w:tc>
-        <w:tc>
-          <w:tcPr>
-            <w:tcW w:type="dxa" w:w="1440"/>
-          </w:tcPr>
-          <w:p>
-            <w:r>
-              <w:rPr>
-                <w:sz w:val="16"/>
-              </w:rPr>
-              <w:t>EACL 2026</w:t>
-            </w:r>
-          </w:p>
-        </w:tc>
-        <w:tc>
-          <w:tcPr>
-            <w:tcW w:type="dxa" w:w="1440"/>
-          </w:tcPr>
-          <w:p>
-            <w:r>
-              <w:rPr>
-                <w:sz w:val="16"/>
-              </w:rPr>
-              <w:t>Citation graph</w:t>
-            </w:r>
-          </w:p>
-        </w:tc>
-        <w:tc>
-          <w:tcPr>
-            <w:tcW w:type="dxa" w:w="1440"/>
-          </w:tcPr>
-          <w:p>
-            <w:r>
-              <w:rPr>
-                <w:sz w:val="16"/>
-              </w:rPr>
-              <w:t>Evidence organisation &amp; attribution</w:t>
-            </w:r>
-          </w:p>
-        </w:tc>
-        <w:tc>
-          <w:tcPr>
-            <w:tcW w:type="dxa" w:w="1440"/>
-          </w:tcPr>
-          <w:p>
-            <w:r>
-              <w:rPr>
-                <w:sz w:val="16"/>
+        <w:trPr>
+          <w:cantSplit/>
+        </w:trPr>
+        <w:tc>
+          <w:tcPr>
+            <w:tcW w:type="dxa" w:w="1728"/>
+          </w:tcPr>
+          <w:p>
+            <w:r>
+              <w:rPr>
+                <w:sz w:val="14"/>
+              </w:rPr>
+              <w:t>ContextualRouter (Varangot-Reille et al., 2026)</w:t>
+            </w:r>
+          </w:p>
+        </w:tc>
+        <w:tc>
+          <w:tcPr>
+            <w:tcW w:type="dxa" w:w="1728"/>
+          </w:tcPr>
+          <w:p>
+            <w:r>
+              <w:rPr>
+                <w:sz w:val="14"/>
+              </w:rPr>
+              <w:t>Best model/retriever</w:t>
+            </w:r>
+          </w:p>
+        </w:tc>
+        <w:tc>
+          <w:tcPr>
+            <w:tcW w:type="dxa" w:w="1728"/>
+          </w:tcPr>
+          <w:p>
+            <w:r>
+              <w:rPr>
+                <w:sz w:val="14"/>
+              </w:rPr>
+              <w:t>Past absolute performance</w:t>
+            </w:r>
+          </w:p>
+        </w:tc>
+        <w:tc>
+          <w:tcPr>
+            <w:tcW w:type="dxa" w:w="1728"/>
+          </w:tcPr>
+          <w:p>
+            <w:r>
+              <w:rPr>
+                <w:sz w:val="14"/>
               </w:rPr>
               <w:t>No</w:t>
             </w:r>
@@ -623,12 +597,12 @@
         </w:tc>
         <w:tc>
           <w:tcPr>
-            <w:tcW w:type="dxa" w:w="1440"/>
-          </w:tcPr>
-          <w:p>
-            <w:r>
-              <w:rPr>
-                <w:sz w:val="16"/>
+            <w:tcW w:type="dxa" w:w="1728"/>
+          </w:tcPr>
+          <w:p>
+            <w:r>
+              <w:rPr>
+                <w:sz w:val="14"/>
               </w:rPr>
               <w:t>No</w:t>
             </w:r>
@@ -636,176 +610,77 @@
         </w:tc>
       </w:tr>
       <w:tr>
-        <w:tc>
-          <w:tcPr>
-            <w:tcW w:type="dxa" w:w="1440"/>
-          </w:tcPr>
-          <w:p>
-            <w:r>
-              <w:rPr>
-                <w:sz w:val="16"/>
-              </w:rPr>
-              <w:t>Hwang et al. (2025)</w:t>
-            </w:r>
-          </w:p>
-        </w:tc>
-        <w:tc>
-          <w:tcPr>
-            <w:tcW w:type="dxa" w:w="1440"/>
-          </w:tcPr>
-          <w:p>
-            <w:r>
-              <w:rPr>
-                <w:sz w:val="16"/>
-              </w:rPr>
-              <w:t>EMNLP 2025</w:t>
-            </w:r>
-          </w:p>
-        </w:tc>
-        <w:tc>
-          <w:tcPr>
-            <w:tcW w:type="dxa" w:w="1440"/>
-          </w:tcPr>
-          <w:p>
-            <w:r>
-              <w:rPr>
-                <w:sz w:val="16"/>
-              </w:rPr>
-              <w:t>Source reliability</w:t>
-            </w:r>
-          </w:p>
-        </w:tc>
-        <w:tc>
-          <w:tcPr>
-            <w:tcW w:type="dxa" w:w="1440"/>
-          </w:tcPr>
-          <w:p>
-            <w:r>
-              <w:rPr>
-                <w:sz w:val="16"/>
-              </w:rPr>
-              <w:t>Source selection &amp; voting</w:t>
-            </w:r>
-          </w:p>
-        </w:tc>
-        <w:tc>
-          <w:tcPr>
-            <w:tcW w:type="dxa" w:w="1440"/>
-          </w:tcPr>
-          <w:p>
-            <w:r>
-              <w:rPr>
-                <w:sz w:val="16"/>
-              </w:rPr>
-              <w:t>No</w:t>
-            </w:r>
-          </w:p>
-        </w:tc>
-        <w:tc>
-          <w:tcPr>
-            <w:tcW w:type="dxa" w:w="1440"/>
-          </w:tcPr>
-          <w:p>
-            <w:r>
-              <w:rPr>
-                <w:sz w:val="16"/>
-              </w:rPr>
-              <w:t>No</w:t>
-            </w:r>
-          </w:p>
-        </w:tc>
-      </w:tr>
-      <w:tr>
-        <w:tc>
-          <w:tcPr>
-            <w:tcW w:type="dxa" w:w="1440"/>
-          </w:tcPr>
-          <w:p>
-            <w:r>
-              <w:rPr>
-                <w:sz w:val="16"/>
-              </w:rPr>
-              <w:t>This paper</w:t>
-            </w:r>
-          </w:p>
-        </w:tc>
-        <w:tc>
-          <w:tcPr>
-            <w:tcW w:type="dxa" w:w="1440"/>
-          </w:tcPr>
-          <w:p>
-            <w:r>
-              <w:rPr>
-                <w:sz w:val="16"/>
-              </w:rPr>
-              <w:t>—</w:t>
-            </w:r>
-          </w:p>
-        </w:tc>
-        <w:tc>
-          <w:tcPr>
-            <w:tcW w:type="dxa" w:w="1440"/>
-          </w:tcPr>
-          <w:p>
-            <w:r>
-              <w:rPr>
-                <w:sz w:val="16"/>
-              </w:rPr>
-              <w:t>Citations, recency, venue (real APIs)</w:t>
-            </w:r>
-          </w:p>
-        </w:tc>
-        <w:tc>
-          <w:tcPr>
-            <w:tcW w:type="dxa" w:w="1440"/>
-          </w:tcPr>
-          <w:p>
-            <w:r>
-              <w:rPr>
-                <w:sz w:val="16"/>
-              </w:rPr>
-              <w:t>Ranking prior; informativeness-gated</w:t>
-            </w:r>
-          </w:p>
-        </w:tc>
-        <w:tc>
-          <w:tcPr>
-            <w:tcW w:type="dxa" w:w="1440"/>
-          </w:tcPr>
-          <w:p>
-            <w:r>
-              <w:rPr>
-                <w:sz w:val="16"/>
-              </w:rPr>
-              <w:t>Four domains</w:t>
-            </w:r>
-          </w:p>
-        </w:tc>
-        <w:tc>
-          <w:tcPr>
-            <w:tcW w:type="dxa" w:w="1440"/>
-          </w:tcPr>
-          <w:p>
-            <w:r>
-              <w:rPr>
-                <w:sz w:val="16"/>
-              </w:rPr>
-              <w:t>Live system</w:t>
+        <w:trPr>
+          <w:cantSplit/>
+        </w:trPr>
+        <w:tc>
+          <w:tcPr>
+            <w:tcW w:type="dxa" w:w="1728"/>
+          </w:tcPr>
+          <w:p>
+            <w:r>
+              <w:rPr>
+                <w:sz w:val="14"/>
+              </w:rPr>
+              <w:t>BiblioGuard (this paper)</w:t>
+            </w:r>
+          </w:p>
+        </w:tc>
+        <w:tc>
+          <w:tcPr>
+            <w:tcW w:type="dxa" w:w="1728"/>
+          </w:tcPr>
+          <w:p>
+            <w:r>
+              <w:rPr>
+                <w:sz w:val="14"/>
+              </w:rPr>
+              <w:t>Incremental metadata effect</w:t>
+            </w:r>
+          </w:p>
+        </w:tc>
+        <w:tc>
+          <w:tcPr>
+            <w:tcW w:type="dxa" w:w="1728"/>
+          </w:tcPr>
+          <w:p>
+            <w:r>
+              <w:rPr>
+                <w:sz w:val="14"/>
+              </w:rPr>
+              <w:t>Past paired query effects</w:t>
+            </w:r>
+          </w:p>
+        </w:tc>
+        <w:tc>
+          <w:tcPr>
+            <w:tcW w:type="dxa" w:w="1728"/>
+          </w:tcPr>
+          <w:p>
+            <w:r>
+              <w:rPr>
+                <w:sz w:val="14"/>
+              </w:rPr>
+              <w:t>Yes, over nine actions</w:t>
+            </w:r>
+          </w:p>
+        </w:tc>
+        <w:tc>
+          <w:tcPr>
+            <w:tcW w:type="dxa" w:w="1728"/>
+          </w:tcPr>
+          <w:p>
+            <w:r>
+              <w:rPr>
+                <w:sz w:val="14"/>
+              </w:rPr>
+              <w:t>Yes, to BGE-Hybrid</w:t>
             </w:r>
           </w:p>
         </w:tc>
       </w:tr>
     </w:tbl>
-    <w:p>
-      <w:r>
-        <w:rPr>
-          <w:b w:val="0"/>
-          <w:i/>
-          <w:sz w:val="18"/>
-        </w:rPr>
-        <w:t>Table 1. Positioning against recent (2025-2026) metadata-aware and citation-aware RAG studies.</w:t>
-      </w:r>
-    </w:p>
+    <w:p/>
     <w:p>
       <w:r>
         <w:rPr>
@@ -899,7 +774,7 @@
           <w:i w:val="0"/>
           <w:sz w:val="24"/>
         </w:rPr>
-        <w:t>4. Retrieval configurations and routing</w:t>
+        <w:t>4. Retrieval actions and BiblioGuard</w:t>
       </w:r>
     </w:p>
     <w:p>
@@ -939,7 +814,7 @@
           <w:i w:val="0"/>
           <w:sz w:val="22"/>
         </w:rPr>
-        <w:t>Three configurations add bibliographic signals. UMA-RAG augments the hybrid score uniformly with venue prestige V(d) and citation authority C(d). LP-RAG multiplies the hybrid score by a length prior 1 + eta * exp(-len(d)/mu), which smoothly down-weights longer documents: shorter documents receive up to a 1 + eta boost that decays exponentially with document length. CA-HR forms the hybrid base score S_hybrid(q, d) = alpha * S_sparse + (1 - alpha) * S_dense with alpha = 0.6, takes the top-100 candidates, and re-ranks by S_CA-HR(q, d) = S_hybrid(q, d) + beta * C(d) + gamma * R(d), where C(d) = log(1 + c_d) / max_j log(1 + c_j) is corpus-normalised citation authority and R(d) = exp(-lambda * (t_ref - t_d)) is an exponential recency term (lambda = 0.1 per year, t_ref = 2024), with beta = 0.15 and gamma = 0.10. Citation counts, years, and venues are real API values; documents without a matched record receive c_d = 0 and the corpus median year, mirroring how a deployed system must handle missing metadata.</w:t>
+        <w:t>Three configurations add bibliographic signals. UMA-RAG augments the hybrid score uniformly with venue prestige V(d) and citation authority C(d). LP-RAG multiplies the hybrid score by a length prior 1 + eta * exp(-len(d)/mu), which smoothly down-weights longer documents: shorter documents receive up to a 1 + eta boost that decays exponentially with document length. CA-HR forms the hybrid base score Sₕ(q,d) = α Ssparse(q,d) + (1−α) Sdense(q,d), with α = 0.6, takes the top-100 candidates, and re-ranks by SCA(q,d) = Sₕ(q,d) + β C(d) + γ R(d), where C(d) = log[1+c(d)] / maxⱼ log[1+c(j)] is corpus-normalised citation authority and R(d) = exp[-λ(tref−t(d))] is an exponential recency term (λ = 0.1 per year, tref = 2024), with β = 0.15 and γ = 0.10. Citation counts, years, and venues are real API values; documents without a matched record receive c(d) = 0 and the corpus median year, mirroring how a deployed system must handle missing metadata.</w:t>
       </w:r>
     </w:p>
     <w:p>
@@ -949,7 +824,7 @@
           <w:i w:val="0"/>
           <w:sz w:val="22"/>
         </w:rPr>
-        <w:t>4.3. Query-level routing (PAV Router)</w:t>
+        <w:t>4.3. BiblioGuard: confidence-gated paired-effect routing</w:t>
       </w:r>
     </w:p>
     <w:p>
@@ -959,7 +834,279 @@
           <w:i w:val="0"/>
           <w:sz w:val="22"/>
         </w:rPr>
-        <w:t>PAV Router is a multinomial logistic-regression classifier over 12 hand-crafted query features (length, lexical diversity, acronym and digit counts, survey/intent keywords, year mentions, stop-word ratio, capitalisation, hyphenation). Training labels are derived post hoc: for each query, the label is the strategy among {UMA-RAG, LP-RAG, CA-HR} attaining the highest per-query NDCG@10 (ties favour CA-HR). We evaluate with stratified 5-fold cross-validation and report out-of-fold accuracy, macro-F1, and Cohen's kappa, together with the end-to-end effectiveness of the routed system versus the per-query oracle and the best single strategy. This design measures how much of the oracle routing gain is recoverable from surface query features alone.</w:t>
+        <w:t>Decision problem. Let a₀ denote the metadata-free BGE-Hybrid fallback (0.5 BM25 + 0.5 BGE after per-query min-max normalisation). The action family A contains nine single-signal CA-HR configurations: five citation actions beta in {0.05, 0.10, 0.15, 0.20, 0.30} with gamma = 0 and four recency actions gamma in {0.05, 0.10, 0.15, 0.20} with beta = 0. Each intervention uses CA-HR's 0.6 BM25 + 0.4 BGE candidate score and re-ranks its top 100. Thus the estimand is the total effect of switching from the deployed fallback to a single-metadata configuration; it does not attribute the full contrast to metadata alone. The beta = gamma = 0 configuration is retained as a fusion-weight control in Section 6.5 but is not an intervention.</w:t>
+      </w:r>
+    </w:p>
+    <w:p>
+      <w:r>
+        <w:rPr>
+          <w:b w:val="0"/>
+          <w:i w:val="0"/>
+          <w:sz w:val="22"/>
+        </w:rPr>
+        <w:t>Local paired effects. For every labelled historical query qᵢ and action a, define Δᵢ(a) = NDCGᵢ@10(a) − NDCGᵢ@10(a₀). Query text is represented by the concatenation of word TF-IDF uni-/bi-grams and character-boundary TF-IDF 3-5-grams. Both vectorisers are fitted only on the training part of a fold. For a held-out query q, BiblioGuard retrieves k = ⌈√ntrain⌉ cosine-nearest training queries. Non-negative similarities receive a 0.001 stabiliser and are normalised to weights wᵢ. The local paired-effect estimator is Δ̂q(a) = Σᵢ wᵢΔᵢ(a), with effective sample size neff = 1/Σᵢwᵢ². Its weighted variance is v̂q(a) = Σᵢwᵢ[Δᵢ(a)−Δ̂q(a)]² and standard error seq(a) = √[v̂q(a)/neff].</w:t>
+      </w:r>
+    </w:p>
+    <w:p>
+      <w:r>
+        <w:rPr>
+          <w:b w:val="0"/>
+          <w:i w:val="0"/>
+          <w:sz w:val="22"/>
+        </w:rPr>
+        <w:t>Simultaneous confidence gate. With family alpha = 0.05 and |A| = 9, the one-sided lower bound is Lq(a) = Δ̂q(a) − t(1−α/|A|, ⌊neff⌋−1) seq(a). The policy chooses the action with the largest lower bound only if maxₐ Lq(a) &gt; 0; otherwise it returns a₀. Bonferroni correction makes the gate deliberately conservative across the nine actions. Because neighbours are selected by similarity rather than sampled i.i.d., L is an operational uncertainty score, not a distribution-free coverage guarantee.</w:t>
+      </w:r>
+    </w:p>
+    <w:p>
+      <w:r>
+        <w:rPr>
+          <w:b w:val="0"/>
+          <w:i/>
+          <w:sz w:val="18"/>
+        </w:rPr>
+        <w:t>Algorithm 1. Cross-fitted BiblioGuard decision for held-out query q.</w:t>
+      </w:r>
+    </w:p>
+    <w:tbl>
+      <w:tblPr>
+        <w:tblStyle w:val="TableGrid"/>
+        <w:tblW w:type="auto" w:w="0"/>
+        <w:tblLook w:firstColumn="1" w:firstRow="1" w:lastColumn="0" w:lastRow="0" w:noHBand="0" w:noVBand="1" w:val="04A0"/>
+      </w:tblPr>
+      <w:tblGrid>
+        <w:gridCol w:w="4320"/>
+        <w:gridCol w:w="4320"/>
+      </w:tblGrid>
+      <w:tr>
+        <w:trPr>
+          <w:cantSplit/>
+          <w:tblHeader/>
+        </w:trPr>
+        <w:tc>
+          <w:tcPr>
+            <w:tcW w:type="dxa" w:w="4320"/>
+          </w:tcPr>
+          <w:p>
+            <w:r>
+              <w:rPr>
+                <w:b/>
+                <w:sz w:val="16"/>
+              </w:rPr>
+              <w:t>Step</w:t>
+            </w:r>
+          </w:p>
+        </w:tc>
+        <w:tc>
+          <w:tcPr>
+            <w:tcW w:type="dxa" w:w="4320"/>
+          </w:tcPr>
+          <w:p>
+            <w:r>
+              <w:rPr>
+                <w:b/>
+                <w:sz w:val="16"/>
+              </w:rPr>
+              <w:t>Operation</w:t>
+            </w:r>
+          </w:p>
+        </w:tc>
+      </w:tr>
+      <w:tr>
+        <w:trPr>
+          <w:cantSplit/>
+        </w:trPr>
+        <w:tc>
+          <w:tcPr>
+            <w:tcW w:type="dxa" w:w="4320"/>
+          </w:tcPr>
+          <w:p>
+            <w:r>
+              <w:rPr>
+                <w:sz w:val="16"/>
+              </w:rPr>
+              <w:t>1</w:t>
+            </w:r>
+          </w:p>
+        </w:tc>
+        <w:tc>
+          <w:tcPr>
+            <w:tcW w:type="dxa" w:w="4320"/>
+          </w:tcPr>
+          <w:p>
+            <w:r>
+              <w:rPr>
+                <w:sz w:val="16"/>
+              </w:rPr>
+              <w:t>Fit word/character TF-IDF on training-query text only.</w:t>
+            </w:r>
+          </w:p>
+        </w:tc>
+      </w:tr>
+      <w:tr>
+        <w:trPr>
+          <w:cantSplit/>
+        </w:trPr>
+        <w:tc>
+          <w:tcPr>
+            <w:tcW w:type="dxa" w:w="4320"/>
+          </w:tcPr>
+          <w:p>
+            <w:r>
+              <w:rPr>
+                <w:sz w:val="16"/>
+              </w:rPr>
+              <w:t>2</w:t>
+            </w:r>
+          </w:p>
+        </w:tc>
+        <w:tc>
+          <w:tcPr>
+            <w:tcW w:type="dxa" w:w="4320"/>
+          </w:tcPr>
+          <w:p>
+            <w:r>
+              <w:rPr>
+                <w:sz w:val="16"/>
+              </w:rPr>
+              <w:t>Retrieve k cosine-nearest training queries for q.</w:t>
+            </w:r>
+          </w:p>
+        </w:tc>
+      </w:tr>
+      <w:tr>
+        <w:trPr>
+          <w:cantSplit/>
+        </w:trPr>
+        <w:tc>
+          <w:tcPr>
+            <w:tcW w:type="dxa" w:w="4320"/>
+          </w:tcPr>
+          <w:p>
+            <w:r>
+              <w:rPr>
+                <w:sz w:val="16"/>
+              </w:rPr>
+              <w:t>3</w:t>
+            </w:r>
+          </w:p>
+        </w:tc>
+        <w:tc>
+          <w:tcPr>
+            <w:tcW w:type="dxa" w:w="4320"/>
+          </w:tcPr>
+          <w:p>
+            <w:r>
+              <w:rPr>
+                <w:sz w:val="16"/>
+              </w:rPr>
+              <w:t>Estimate nine similarity-weighted paired NDCG@10 effects.</w:t>
+            </w:r>
+          </w:p>
+        </w:tc>
+      </w:tr>
+      <w:tr>
+        <w:trPr>
+          <w:cantSplit/>
+        </w:trPr>
+        <w:tc>
+          <w:tcPr>
+            <w:tcW w:type="dxa" w:w="4320"/>
+          </w:tcPr>
+          <w:p>
+            <w:r>
+              <w:rPr>
+                <w:sz w:val="16"/>
+              </w:rPr>
+              <w:t>4</w:t>
+            </w:r>
+          </w:p>
+        </w:tc>
+        <w:tc>
+          <w:tcPr>
+            <w:tcW w:type="dxa" w:w="4320"/>
+          </w:tcPr>
+          <w:p>
+            <w:r>
+              <w:rPr>
+                <w:sz w:val="16"/>
+              </w:rPr>
+              <w:t>Compute Bonferroni-adjusted one-sided lower bounds.</w:t>
+            </w:r>
+          </w:p>
+        </w:tc>
+      </w:tr>
+      <w:tr>
+        <w:trPr>
+          <w:cantSplit/>
+        </w:trPr>
+        <w:tc>
+          <w:tcPr>
+            <w:tcW w:type="dxa" w:w="4320"/>
+          </w:tcPr>
+          <w:p>
+            <w:r>
+              <w:rPr>
+                <w:sz w:val="16"/>
+              </w:rPr>
+              <w:t>5</w:t>
+            </w:r>
+          </w:p>
+        </w:tc>
+        <w:tc>
+          <w:tcPr>
+            <w:tcW w:type="dxa" w:w="4320"/>
+          </w:tcPr>
+          <w:p>
+            <w:r>
+              <w:rPr>
+                <w:sz w:val="16"/>
+              </w:rPr>
+              <w:t>Select argmax L if max L &gt; 0; otherwise return BGE-Hybrid.</w:t>
+            </w:r>
+          </w:p>
+        </w:tc>
+      </w:tr>
+      <w:tr>
+        <w:trPr>
+          <w:cantSplit/>
+        </w:trPr>
+        <w:tc>
+          <w:tcPr>
+            <w:tcW w:type="dxa" w:w="4320"/>
+          </w:tcPr>
+          <w:p>
+            <w:r>
+              <w:rPr>
+                <w:sz w:val="16"/>
+              </w:rPr>
+              <w:t>6</w:t>
+            </w:r>
+          </w:p>
+        </w:tc>
+        <w:tc>
+          <w:tcPr>
+            <w:tcW w:type="dxa" w:w="4320"/>
+          </w:tcPr>
+          <w:p>
+            <w:r>
+              <w:rPr>
+                <w:sz w:val="16"/>
+              </w:rPr>
+              <w:t>Log action, effect estimate, lower bound, k, and critical value.</w:t>
+            </w:r>
+          </w:p>
+        </w:tc>
+      </w:tr>
+    </w:tbl>
+    <w:p/>
+    <w:p>
+      <w:r>
+        <w:rPr>
+          <w:b w:val="0"/>
+          <w:i w:val="0"/>
+          <w:sz w:val="22"/>
+        </w:rPr>
+        <w:t>Evaluation and complexity. We use shuffled five-fold cross-fitting (seed 42); a held-out query's relevance judgments are never used in its vectorisation, neighbour set, effect estimate, or decision. The unconstrained ablation keeps the same neighbours and paired estimator but selects the largest positive mean effect without a lower-bound test. Given cached action outcomes, inference costs one sparse cosine search and O(k|A|) effect aggregation. A new domain with no labelled history takes the explicit cold-start path a₀ rather than extrapolating a metadata policy.</w:t>
       </w:r>
     </w:p>
     <w:p>
@@ -1008,6 +1155,10 @@
         <w:gridCol w:w="1234"/>
       </w:tblGrid>
       <w:tr>
+        <w:trPr>
+          <w:cantSplit/>
+          <w:tblHeader/>
+        </w:trPr>
         <w:tc>
           <w:tcPr>
             <w:tcW w:type="dxa" w:w="1234"/>
@@ -1108,6 +1259,9 @@
         </w:tc>
       </w:tr>
       <w:tr>
+        <w:trPr>
+          <w:cantSplit/>
+        </w:trPr>
         <w:tc>
           <w:tcPr>
             <w:tcW w:type="dxa" w:w="1234"/>
@@ -1201,6 +1355,9 @@
         </w:tc>
       </w:tr>
       <w:tr>
+        <w:trPr>
+          <w:cantSplit/>
+        </w:trPr>
         <w:tc>
           <w:tcPr>
             <w:tcW w:type="dxa" w:w="1234"/>
@@ -1294,6 +1451,9 @@
         </w:tc>
       </w:tr>
       <w:tr>
+        <w:trPr>
+          <w:cantSplit/>
+        </w:trPr>
         <w:tc>
           <w:tcPr>
             <w:tcW w:type="dxa" w:w="1234"/>
@@ -1387,6 +1547,9 @@
         </w:tc>
       </w:tr>
       <w:tr>
+        <w:trPr>
+          <w:cantSplit/>
+        </w:trPr>
         <w:tc>
           <w:tcPr>
             <w:tcW w:type="dxa" w:w="1234"/>
@@ -1480,6 +1643,7 @@
         </w:tc>
       </w:tr>
     </w:tbl>
+    <w:p/>
     <w:p>
       <w:r>
         <w:rPr>
@@ -1527,6 +1691,10 @@
         <w:gridCol w:w="1080"/>
       </w:tblGrid>
       <w:tr>
+        <w:trPr>
+          <w:cantSplit/>
+          <w:tblHeader/>
+        </w:trPr>
         <w:tc>
           <w:tcPr>
             <w:tcW w:type="dxa" w:w="1080"/>
@@ -1641,6 +1809,9 @@
         </w:tc>
       </w:tr>
       <w:tr>
+        <w:trPr>
+          <w:cantSplit/>
+        </w:trPr>
         <w:tc>
           <w:tcPr>
             <w:tcW w:type="dxa" w:w="1080"/>
@@ -1747,6 +1918,9 @@
         </w:tc>
       </w:tr>
       <w:tr>
+        <w:trPr>
+          <w:cantSplit/>
+        </w:trPr>
         <w:tc>
           <w:tcPr>
             <w:tcW w:type="dxa" w:w="1080"/>
@@ -1853,6 +2027,9 @@
         </w:tc>
       </w:tr>
       <w:tr>
+        <w:trPr>
+          <w:cantSplit/>
+        </w:trPr>
         <w:tc>
           <w:tcPr>
             <w:tcW w:type="dxa" w:w="1080"/>
@@ -1959,6 +2136,9 @@
         </w:tc>
       </w:tr>
       <w:tr>
+        <w:trPr>
+          <w:cantSplit/>
+        </w:trPr>
         <w:tc>
           <w:tcPr>
             <w:tcW w:type="dxa" w:w="1080"/>
@@ -2065,6 +2245,7 @@
         </w:tc>
       </w:tr>
     </w:tbl>
+    <w:p/>
     <w:p>
       <w:r>
         <w:rPr>
@@ -2112,7 +2293,7 @@
           <w:i w:val="0"/>
           <w:sz w:val="22"/>
         </w:rPr>
-        <w:t>We report Recall@1/5/10, NDCG@10 with graded gains, and MRR on the official test judgments (documents judged non-relevant are excluded from the relevant sets). Significance uses the one-sided Wilcoxon signed-rank test over per-query scores with Cohen's d computed from the same per-query differences, so reported p-values and effect sizes are consistent by construction. To control the family-wise error rate, significance claims in the text are restricted to a pre-specified primary family of 16 comparisons (per dataset: CA-HR vs. BM25, SBERT-Dense, and Neural-Hybrid, and BGE-CA-HR vs. BGE-Hybrid, all on NDCG@10); quoted primary p-values are Holm-Bonferroni-adjusted within this family. Ablation, robustness, routing, and generation-side comparisons are exploratory analyses with unadjusted two-sided p-values; metadata-weight sensitivity uses one-sided Wilcoxon tests with Holm correction within each dataset. All retrieval runs use a single CPU-only workstation. Measured per-query cost on the largest corpus (TREC-COVID, 171k documents): BM25 scoring averages 1,002 ms; dense scoring over precomputed embeddings and CA-HR re-ranking add under 2 ms per query. On the smaller corpora BM25 costs 7.6-97 ms per query. Query encoding (MiniLM) averages about 30 ms. Total online latency is therefore dominated by the LLM call, not retrieval.</w:t>
+        <w:t>We report Recall@1/5/10, NDCG@10 with graded gains, and MRR on the official test judgments (documents judged non-relevant are excluded from the relevant sets). Significance uses the one-sided Wilcoxon signed-rank test over per-query scores with Cohen's d computed from the same per-query differences, so reported p-values and effect sizes are consistent by construction. To control the family-wise error rate, the revised paper pre-specifies one primary comparison per dataset: cross-fitted BiblioGuard versus its BGE-Hybrid fallback on NDCG@10 (four one-sided Wilcoxon tests, Holm-Bonferroni-corrected across domains). The confidence gate's internal Bonferroni correction over nine actions is separate from this evaluation-level correction. Retrieval-landscape, component ablation, robustness, sensitivity, unconstrained-routing, and generation comparisons are mechanism or exploratory analyses. The 30-combination metadata-weight grid was computed on the same judgments and is not confirmatory. All retrieval runs use a single CPU-only workstation. Measured per-query cost on the largest corpus (TREC-COVID, 171k documents): BM25 scoring averages 1,002 ms; dense scoring over precomputed embeddings and CA-HR re-ranking add under 2 ms per query. On the smaller corpora BM25 costs 7.6-97 ms per query. Query encoding (MiniLM) averages about 30 ms. Total online latency is therefore dominated by the LLM call, not retrieval.</w:t>
       </w:r>
     </w:p>
     <w:p>
@@ -2132,7 +2313,7 @@
           <w:i w:val="0"/>
           <w:sz w:val="22"/>
         </w:rPr>
-        <w:t>6.1. Main retrieval results</w:t>
+        <w:t>6.1. Primary BiblioGuard evaluation</w:t>
       </w:r>
     </w:p>
     <w:p>
@@ -2142,7 +2323,598 @@
           <w:i/>
           <w:sz w:val="18"/>
         </w:rPr>
-        <w:t>Table 4. Retrieval effectiveness: NDCG@10 / Recall@10 on the four test sets (best single method per dataset in bold in Fig. 2).</w:t>
+        <w:t>Table 4. Cross-fitted BiblioGuard evaluation. Active rates are unconstrained / confidence-gated; p-values compare BiblioGuard with BGE-Hybrid and are Holm-adjusted across four domains.</w:t>
+      </w:r>
+    </w:p>
+    <w:tbl>
+      <w:tblPr>
+        <w:tblStyle w:val="TableGrid"/>
+        <w:tblW w:type="auto" w:w="0"/>
+        <w:tblLook w:firstColumn="1" w:firstRow="1" w:lastColumn="0" w:lastRow="0" w:noHBand="0" w:noVBand="1" w:val="04A0"/>
+      </w:tblPr>
+      <w:tblGrid>
+        <w:gridCol w:w="1234"/>
+        <w:gridCol w:w="1234"/>
+        <w:gridCol w:w="1234"/>
+        <w:gridCol w:w="1234"/>
+        <w:gridCol w:w="1234"/>
+        <w:gridCol w:w="1234"/>
+        <w:gridCol w:w="1234"/>
+      </w:tblGrid>
+      <w:tr>
+        <w:trPr>
+          <w:cantSplit/>
+          <w:tblHeader/>
+        </w:trPr>
+        <w:tc>
+          <w:tcPr>
+            <w:tcW w:type="dxa" w:w="1234"/>
+          </w:tcPr>
+          <w:p>
+            <w:r>
+              <w:rPr>
+                <w:b/>
+                <w:sz w:val="16"/>
+              </w:rPr>
+              <w:t>Dataset</w:t>
+            </w:r>
+          </w:p>
+        </w:tc>
+        <w:tc>
+          <w:tcPr>
+            <w:tcW w:type="dxa" w:w="1234"/>
+          </w:tcPr>
+          <w:p>
+            <w:r>
+              <w:rPr>
+                <w:b/>
+                <w:sz w:val="16"/>
+              </w:rPr>
+              <w:t>Fallback</w:t>
+            </w:r>
+          </w:p>
+        </w:tc>
+        <w:tc>
+          <w:tcPr>
+            <w:tcW w:type="dxa" w:w="1234"/>
+          </w:tcPr>
+          <w:p>
+            <w:r>
+              <w:rPr>
+                <w:b/>
+                <w:sz w:val="16"/>
+              </w:rPr>
+              <w:t>Without LCB</w:t>
+            </w:r>
+          </w:p>
+        </w:tc>
+        <w:tc>
+          <w:tcPr>
+            <w:tcW w:type="dxa" w:w="1234"/>
+          </w:tcPr>
+          <w:p>
+            <w:r>
+              <w:rPr>
+                <w:b/>
+                <w:sz w:val="16"/>
+              </w:rPr>
+              <w:t>BiblioGuard</w:t>
+            </w:r>
+          </w:p>
+        </w:tc>
+        <w:tc>
+          <w:tcPr>
+            <w:tcW w:type="dxa" w:w="1234"/>
+          </w:tcPr>
+          <w:p>
+            <w:r>
+              <w:rPr>
+                <w:b/>
+                <w:sz w:val="16"/>
+              </w:rPr>
+              <w:t>Active rate</w:t>
+            </w:r>
+          </w:p>
+        </w:tc>
+        <w:tc>
+          <w:tcPr>
+            <w:tcW w:type="dxa" w:w="1234"/>
+          </w:tcPr>
+          <w:p>
+            <w:r>
+              <w:rPr>
+                <w:b/>
+                <w:sz w:val="16"/>
+              </w:rPr>
+              <w:t>Guarded gain</w:t>
+            </w:r>
+          </w:p>
+        </w:tc>
+        <w:tc>
+          <w:tcPr>
+            <w:tcW w:type="dxa" w:w="1234"/>
+          </w:tcPr>
+          <w:p>
+            <w:r>
+              <w:rPr>
+                <w:b/>
+                <w:sz w:val="16"/>
+              </w:rPr>
+              <w:t>Holm p</w:t>
+            </w:r>
+          </w:p>
+        </w:tc>
+      </w:tr>
+      <w:tr>
+        <w:trPr>
+          <w:cantSplit/>
+        </w:trPr>
+        <w:tc>
+          <w:tcPr>
+            <w:tcW w:type="dxa" w:w="1234"/>
+          </w:tcPr>
+          <w:p>
+            <w:r>
+              <w:rPr>
+                <w:sz w:val="16"/>
+              </w:rPr>
+              <w:t>SCIDOCS</w:t>
+            </w:r>
+          </w:p>
+        </w:tc>
+        <w:tc>
+          <w:tcPr>
+            <w:tcW w:type="dxa" w:w="1234"/>
+          </w:tcPr>
+          <w:p>
+            <w:r>
+              <w:rPr>
+                <w:sz w:val="16"/>
+              </w:rPr>
+              <w:t>0.1832</w:t>
+            </w:r>
+          </w:p>
+        </w:tc>
+        <w:tc>
+          <w:tcPr>
+            <w:tcW w:type="dxa" w:w="1234"/>
+          </w:tcPr>
+          <w:p>
+            <w:r>
+              <w:rPr>
+                <w:sz w:val="16"/>
+              </w:rPr>
+              <w:t>0.2068</w:t>
+            </w:r>
+          </w:p>
+        </w:tc>
+        <w:tc>
+          <w:tcPr>
+            <w:tcW w:type="dxa" w:w="1234"/>
+          </w:tcPr>
+          <w:p>
+            <w:r>
+              <w:rPr>
+                <w:sz w:val="16"/>
+              </w:rPr>
+              <w:t>0.1881</w:t>
+            </w:r>
+          </w:p>
+        </w:tc>
+        <w:tc>
+          <w:tcPr>
+            <w:tcW w:type="dxa" w:w="1234"/>
+          </w:tcPr>
+          <w:p>
+            <w:r>
+              <w:rPr>
+                <w:sz w:val="16"/>
+              </w:rPr>
+              <w:t>96.8% / 18.7%</w:t>
+            </w:r>
+          </w:p>
+        </w:tc>
+        <w:tc>
+          <w:tcPr>
+            <w:tcW w:type="dxa" w:w="1234"/>
+          </w:tcPr>
+          <w:p>
+            <w:r>
+              <w:rPr>
+                <w:sz w:val="16"/>
+              </w:rPr>
+              <w:t>+0.0049</w:t>
+            </w:r>
+          </w:p>
+        </w:tc>
+        <w:tc>
+          <w:tcPr>
+            <w:tcW w:type="dxa" w:w="1234"/>
+          </w:tcPr>
+          <w:p>
+            <w:r>
+              <w:rPr>
+                <w:sz w:val="16"/>
+              </w:rPr>
+              <w:t>p &lt; 0.001</w:t>
+            </w:r>
+          </w:p>
+        </w:tc>
+      </w:tr>
+      <w:tr>
+        <w:trPr>
+          <w:cantSplit/>
+        </w:trPr>
+        <w:tc>
+          <w:tcPr>
+            <w:tcW w:type="dxa" w:w="1234"/>
+          </w:tcPr>
+          <w:p>
+            <w:r>
+              <w:rPr>
+                <w:sz w:val="16"/>
+              </w:rPr>
+              <w:t>SciFact</w:t>
+            </w:r>
+          </w:p>
+        </w:tc>
+        <w:tc>
+          <w:tcPr>
+            <w:tcW w:type="dxa" w:w="1234"/>
+          </w:tcPr>
+          <w:p>
+            <w:r>
+              <w:rPr>
+                <w:sz w:val="16"/>
+              </w:rPr>
+              <w:t>0.7101</w:t>
+            </w:r>
+          </w:p>
+        </w:tc>
+        <w:tc>
+          <w:tcPr>
+            <w:tcW w:type="dxa" w:w="1234"/>
+          </w:tcPr>
+          <w:p>
+            <w:r>
+              <w:rPr>
+                <w:sz w:val="16"/>
+              </w:rPr>
+              <w:t>0.7101</w:t>
+            </w:r>
+          </w:p>
+        </w:tc>
+        <w:tc>
+          <w:tcPr>
+            <w:tcW w:type="dxa" w:w="1234"/>
+          </w:tcPr>
+          <w:p>
+            <w:r>
+              <w:rPr>
+                <w:sz w:val="16"/>
+              </w:rPr>
+              <w:t>0.7101</w:t>
+            </w:r>
+          </w:p>
+        </w:tc>
+        <w:tc>
+          <w:tcPr>
+            <w:tcW w:type="dxa" w:w="1234"/>
+          </w:tcPr>
+          <w:p>
+            <w:r>
+              <w:rPr>
+                <w:sz w:val="16"/>
+              </w:rPr>
+              <w:t>67.3% / 0.0%</w:t>
+            </w:r>
+          </w:p>
+        </w:tc>
+        <w:tc>
+          <w:tcPr>
+            <w:tcW w:type="dxa" w:w="1234"/>
+          </w:tcPr>
+          <w:p>
+            <w:r>
+              <w:rPr>
+                <w:sz w:val="16"/>
+              </w:rPr>
+              <w:t>+0.0000</w:t>
+            </w:r>
+          </w:p>
+        </w:tc>
+        <w:tc>
+          <w:tcPr>
+            <w:tcW w:type="dxa" w:w="1234"/>
+          </w:tcPr>
+          <w:p>
+            <w:r>
+              <w:rPr>
+                <w:sz w:val="16"/>
+              </w:rPr>
+              <w:t>p = 1.000</w:t>
+            </w:r>
+          </w:p>
+        </w:tc>
+      </w:tr>
+      <w:tr>
+        <w:trPr>
+          <w:cantSplit/>
+        </w:trPr>
+        <w:tc>
+          <w:tcPr>
+            <w:tcW w:type="dxa" w:w="1234"/>
+          </w:tcPr>
+          <w:p>
+            <w:r>
+              <w:rPr>
+                <w:sz w:val="16"/>
+              </w:rPr>
+              <w:t>NFCorpus</w:t>
+            </w:r>
+          </w:p>
+        </w:tc>
+        <w:tc>
+          <w:tcPr>
+            <w:tcW w:type="dxa" w:w="1234"/>
+          </w:tcPr>
+          <w:p>
+            <w:r>
+              <w:rPr>
+                <w:sz w:val="16"/>
+              </w:rPr>
+              <w:t>0.3487</w:t>
+            </w:r>
+          </w:p>
+        </w:tc>
+        <w:tc>
+          <w:tcPr>
+            <w:tcW w:type="dxa" w:w="1234"/>
+          </w:tcPr>
+          <w:p>
+            <w:r>
+              <w:rPr>
+                <w:sz w:val="16"/>
+              </w:rPr>
+              <w:t>0.3454</w:t>
+            </w:r>
+          </w:p>
+        </w:tc>
+        <w:tc>
+          <w:tcPr>
+            <w:tcW w:type="dxa" w:w="1234"/>
+          </w:tcPr>
+          <w:p>
+            <w:r>
+              <w:rPr>
+                <w:sz w:val="16"/>
+              </w:rPr>
+              <w:t>0.3487</w:t>
+            </w:r>
+          </w:p>
+        </w:tc>
+        <w:tc>
+          <w:tcPr>
+            <w:tcW w:type="dxa" w:w="1234"/>
+          </w:tcPr>
+          <w:p>
+            <w:r>
+              <w:rPr>
+                <w:sz w:val="16"/>
+              </w:rPr>
+              <w:t>45.8% / 0.0%</w:t>
+            </w:r>
+          </w:p>
+        </w:tc>
+        <w:tc>
+          <w:tcPr>
+            <w:tcW w:type="dxa" w:w="1234"/>
+          </w:tcPr>
+          <w:p>
+            <w:r>
+              <w:rPr>
+                <w:sz w:val="16"/>
+              </w:rPr>
+              <w:t>+0.0000</w:t>
+            </w:r>
+          </w:p>
+        </w:tc>
+        <w:tc>
+          <w:tcPr>
+            <w:tcW w:type="dxa" w:w="1234"/>
+          </w:tcPr>
+          <w:p>
+            <w:r>
+              <w:rPr>
+                <w:sz w:val="16"/>
+              </w:rPr>
+              <w:t>p = 1.000</w:t>
+            </w:r>
+          </w:p>
+        </w:tc>
+      </w:tr>
+      <w:tr>
+        <w:trPr>
+          <w:cantSplit/>
+        </w:trPr>
+        <w:tc>
+          <w:tcPr>
+            <w:tcW w:type="dxa" w:w="1234"/>
+          </w:tcPr>
+          <w:p>
+            <w:r>
+              <w:rPr>
+                <w:sz w:val="16"/>
+              </w:rPr>
+              <w:t>TREC-COVID</w:t>
+            </w:r>
+          </w:p>
+        </w:tc>
+        <w:tc>
+          <w:tcPr>
+            <w:tcW w:type="dxa" w:w="1234"/>
+          </w:tcPr>
+          <w:p>
+            <w:r>
+              <w:rPr>
+                <w:sz w:val="16"/>
+              </w:rPr>
+              <w:t>0.7115</w:t>
+            </w:r>
+          </w:p>
+        </w:tc>
+        <w:tc>
+          <w:tcPr>
+            <w:tcW w:type="dxa" w:w="1234"/>
+          </w:tcPr>
+          <w:p>
+            <w:r>
+              <w:rPr>
+                <w:sz w:val="16"/>
+              </w:rPr>
+              <w:t>0.7000</w:t>
+            </w:r>
+          </w:p>
+        </w:tc>
+        <w:tc>
+          <w:tcPr>
+            <w:tcW w:type="dxa" w:w="1234"/>
+          </w:tcPr>
+          <w:p>
+            <w:r>
+              <w:rPr>
+                <w:sz w:val="16"/>
+              </w:rPr>
+              <w:t>0.7115</w:t>
+            </w:r>
+          </w:p>
+        </w:tc>
+        <w:tc>
+          <w:tcPr>
+            <w:tcW w:type="dxa" w:w="1234"/>
+          </w:tcPr>
+          <w:p>
+            <w:r>
+              <w:rPr>
+                <w:sz w:val="16"/>
+              </w:rPr>
+              <w:t>54.0% / 0.0%</w:t>
+            </w:r>
+          </w:p>
+        </w:tc>
+        <w:tc>
+          <w:tcPr>
+            <w:tcW w:type="dxa" w:w="1234"/>
+          </w:tcPr>
+          <w:p>
+            <w:r>
+              <w:rPr>
+                <w:sz w:val="16"/>
+              </w:rPr>
+              <w:t>+0.0000</w:t>
+            </w:r>
+          </w:p>
+        </w:tc>
+        <w:tc>
+          <w:tcPr>
+            <w:tcW w:type="dxa" w:w="1234"/>
+          </w:tcPr>
+          <w:p>
+            <w:r>
+              <w:rPr>
+                <w:sz w:val="16"/>
+              </w:rPr>
+              <w:t>p = 1.000</w:t>
+            </w:r>
+          </w:p>
+        </w:tc>
+      </w:tr>
+    </w:tbl>
+    <w:p/>
+    <w:p>
+      <w:r>
+        <w:rPr>
+          <w:b w:val="0"/>
+          <w:i w:val="0"/>
+          <w:sz w:val="22"/>
+        </w:rPr>
+        <w:t>BiblioGuard improves SCIDOCS from 0.1832 to 0.1881 NDCG@10 (+0.0049; 18.7% of queries activated; Holm-adjusted p = 1.3e-06; paired d = 0.139). The selected SCIDOCS actions are citation-only: beta = 0.30 on 141 queries, beta = 0.20 on 39, and beta = 0.15 on 7; 813 queries return the fallback. On SciFact, NFCorpus, and TREC-COVID no action clears the simultaneous lower bound, so the policy exactly reproduces BGE-Hybrid. Across the released four-domain evaluation this yields no negative mean transfer and a macro-average gain of +0.0012. This is an empirical result under the cross-fitted protocol, not a universal safety claim.</w:t>
+      </w:r>
+    </w:p>
+    <w:p>
+      <w:r>
+        <w:rPr>
+          <w:b w:val="0"/>
+          <w:i w:val="0"/>
+          <w:sz w:val="22"/>
+        </w:rPr>
+        <w:t>The confidence gate is consequential rather than cosmetic. Removing it activates 96.8% of SCIDOCS queries and reaches 0.2068 NDCG@10, but it also activates 67.3%, 45.8%, and 54.0% of queries on SciFact, NFCorpus, and TREC-COVID and changes NDCG@10 by -0.00003, -0.00339, and -0.01148. The guarded policy therefore trades some attainable SCIDOCS gain for abstention where local mean estimates are not strong enough after simultaneous uncertainty correction. Fig. 5 visualises this selectivity/performance trade-off.</w:t>
+      </w:r>
+    </w:p>
+    <w:p>
+      <w:r>
+        <w:drawing>
+          <wp:inline xmlns:a="http://schemas.openxmlformats.org/drawingml/2006/main" xmlns:pic="http://schemas.openxmlformats.org/drawingml/2006/picture">
+            <wp:extent cx="4572000" cy="2159400"/>
+            <wp:docPr id="2" name="Picture 2"/>
+            <wp:cNvGraphicFramePr>
+              <a:graphicFrameLocks noChangeAspect="1"/>
+            </wp:cNvGraphicFramePr>
+            <a:graphic>
+              <a:graphicData uri="http://schemas.openxmlformats.org/drawingml/2006/picture">
+                <pic:pic>
+                  <pic:nvPicPr>
+                    <pic:cNvPr id="0" name="Fig5_biblioguard.png"/>
+                    <pic:cNvPicPr/>
+                  </pic:nvPicPr>
+                  <pic:blipFill>
+                    <a:blip r:embed="rId10"/>
+                    <a:stretch>
+                      <a:fillRect/>
+                    </a:stretch>
+                  </pic:blipFill>
+                  <pic:spPr>
+                    <a:xfrm>
+                      <a:off x="0" y="0"/>
+                      <a:ext cx="4572000" cy="2159400"/>
+                    </a:xfrm>
+                    <a:prstGeom prst="rect"/>
+                  </pic:spPr>
+                </pic:pic>
+              </a:graphicData>
+            </a:graphic>
+          </wp:inline>
+        </w:drawing>
+      </w:r>
+    </w:p>
+    <w:p>
+      <w:r>
+        <w:rPr>
+          <w:b w:val="0"/>
+          <w:i/>
+          <w:sz w:val="18"/>
+        </w:rPr>
+        <w:t>Fig. 5. BGE-Hybrid, unconstrained paired-effect routing, and confidence-gated BiblioGuard. Labels show the guarded action rate.</w:t>
+      </w:r>
+    </w:p>
+    <w:p>
+      <w:r>
+        <w:rPr>
+          <w:b/>
+          <w:i w:val="0"/>
+          <w:sz w:val="22"/>
+        </w:rPr>
+        <w:t>6.2. Retrieval landscape and failure motivation</w:t>
+      </w:r>
+    </w:p>
+    <w:p>
+      <w:r>
+        <w:rPr>
+          <w:b w:val="0"/>
+          <w:i/>
+          <w:sz w:val="18"/>
+        </w:rPr>
+        <w:t>Table 5. Retrieval effectiveness: NDCG@10 / Recall@10 on the four test sets (best single method per dataset in bold in Fig. 2).</w:t>
       </w:r>
     </w:p>
     <w:tbl>
@@ -2159,6 +2931,10 @@
         <w:gridCol w:w="1728"/>
       </w:tblGrid>
       <w:tr>
+        <w:trPr>
+          <w:cantSplit/>
+          <w:tblHeader/>
+        </w:trPr>
         <w:tc>
           <w:tcPr>
             <w:tcW w:type="dxa" w:w="1728"/>
@@ -2231,6 +3007,9 @@
         </w:tc>
       </w:tr>
       <w:tr>
+        <w:trPr>
+          <w:cantSplit/>
+        </w:trPr>
         <w:tc>
           <w:tcPr>
             <w:tcW w:type="dxa" w:w="1728"/>
@@ -2298,6 +3077,9 @@
         </w:tc>
       </w:tr>
       <w:tr>
+        <w:trPr>
+          <w:cantSplit/>
+        </w:trPr>
         <w:tc>
           <w:tcPr>
             <w:tcW w:type="dxa" w:w="1728"/>
@@ -2365,6 +3147,9 @@
         </w:tc>
       </w:tr>
       <w:tr>
+        <w:trPr>
+          <w:cantSplit/>
+        </w:trPr>
         <w:tc>
           <w:tcPr>
             <w:tcW w:type="dxa" w:w="1728"/>
@@ -2432,6 +3217,9 @@
         </w:tc>
       </w:tr>
       <w:tr>
+        <w:trPr>
+          <w:cantSplit/>
+        </w:trPr>
         <w:tc>
           <w:tcPr>
             <w:tcW w:type="dxa" w:w="1728"/>
@@ -2499,6 +3287,9 @@
         </w:tc>
       </w:tr>
       <w:tr>
+        <w:trPr>
+          <w:cantSplit/>
+        </w:trPr>
         <w:tc>
           <w:tcPr>
             <w:tcW w:type="dxa" w:w="1728"/>
@@ -2566,6 +3357,9 @@
         </w:tc>
       </w:tr>
       <w:tr>
+        <w:trPr>
+          <w:cantSplit/>
+        </w:trPr>
         <w:tc>
           <w:tcPr>
             <w:tcW w:type="dxa" w:w="1728"/>
@@ -2633,6 +3427,9 @@
         </w:tc>
       </w:tr>
       <w:tr>
+        <w:trPr>
+          <w:cantSplit/>
+        </w:trPr>
         <w:tc>
           <w:tcPr>
             <w:tcW w:type="dxa" w:w="1728"/>
@@ -2700,6 +3497,9 @@
         </w:tc>
       </w:tr>
       <w:tr>
+        <w:trPr>
+          <w:cantSplit/>
+        </w:trPr>
         <w:tc>
           <w:tcPr>
             <w:tcW w:type="dxa" w:w="1728"/>
@@ -2767,6 +3567,9 @@
         </w:tc>
       </w:tr>
       <w:tr>
+        <w:trPr>
+          <w:cantSplit/>
+        </w:trPr>
         <w:tc>
           <w:tcPr>
             <w:tcW w:type="dxa" w:w="1728"/>
@@ -2834,6 +3637,9 @@
         </w:tc>
       </w:tr>
       <w:tr>
+        <w:trPr>
+          <w:cantSplit/>
+        </w:trPr>
         <w:tc>
           <w:tcPr>
             <w:tcW w:type="dxa" w:w="1728"/>
@@ -2901,6 +3707,7 @@
         </w:tc>
       </w:tr>
     </w:tbl>
+    <w:p/>
     <w:p>
       <w:r>
         <w:rPr>
@@ -2908,7 +3715,7 @@
           <w:i w:val="0"/>
           <w:sz w:val="22"/>
         </w:rPr>
-        <w:t>Fig. 2 and Table 4 show the central pattern: no configuration wins everywhere. The best single method per dataset is SCIDOCS: SBERT-Dense (0.2164); SciFact: BGE-Dense (0.7127); NFCorpus: BGE-Hybrid (0.3487); TREC-COVID: BGE-Dense (0.7578). Pretrained dense retrieval dominates on SCIDOCS, where SBERT-Dense reaches 0.2164 NDCG@10 versus 0.1496 for BM25 (+44.7% relative); on SciFact the hybrid family is best-in-class (Neural-Hybrid 0.7080 versus 0.6496 for BM25), and CA-HR attains the best Recall@10 (0.8334) of all ten methods. BGE-based configurations provide the best single result on three of the four datasets—BGE-Dense on SciFact (0.7127) and TREC-COVID (0.7578), the latter consistent with its published BEIR reference score (approximately 0.76; Xiao et al., 2023), and BGE-Hybrid on NFCorpus (0.3487)—yet BGE-Dense trails SBERT-Dense on SCIDOCS (0.2052 vs. 0.2164), confirming that even encoder choice is domain-dependent.</w:t>
+        <w:t>Fig. 2 and Table 5 show the central pattern: no configuration wins everywhere. The best single method per dataset is SCIDOCS: SBERT-Dense (0.2164); SciFact: BGE-Dense (0.7127); NFCorpus: BGE-Hybrid (0.3487); TREC-COVID: BGE-Dense (0.7578). Pretrained dense retrieval dominates on SCIDOCS, where SBERT-Dense reaches 0.2164 NDCG@10 versus 0.1496 for BM25 (+44.7% relative); on SciFact the hybrid family is best-in-class (Neural-Hybrid 0.7080 versus 0.6496 for BM25), and CA-HR attains the best Recall@10 (0.8334) of all ten methods. BGE-based configurations provide the best single result on three of the four datasets—BGE-Dense on SciFact (0.7127) and TREC-COVID (0.7578), the latter consistent with its published BEIR reference score (approximately 0.76; Xiao et al., 2023), and BGE-Hybrid on NFCorpus (0.3487)—yet BGE-Dense trails SBERT-Dense on SCIDOCS (0.2052 vs. 0.2164), confirming that even encoder choice is domain-dependent.</w:t>
       </w:r>
     </w:p>
     <w:p>
@@ -2918,7 +3725,7 @@
           <w:i w:val="0"/>
           <w:sz w:val="22"/>
         </w:rPr>
-        <w:t>CA-HR, the citation- and recency-aware configuration, sits in the middle of the hybrid family overall: it significantly outperforms BM25 on all four datasets (Holm-adjusted within the primary family; e.g., SCIDOCS p &lt; 0.001, TREC-COVID p &lt; 0.001), and it also exceeds LSA-Dense on all four datasets, an exploratory comparison outside the primary family (unadjusted one-sided Wilcoxon p &lt; 0.001 on every dataset), but it does not beat the plain dense or plain hybrid baselines except on SciFact, where it significantly exceeds SBERT-Dense (p = 0.001, d = 0.201). In other words, metadata-aware re-ranking reliably beats purely lexical and non-pretrained retrieval, but whether it beats plain dense retrieval depends on the domain.</w:t>
+        <w:t>CA-HR, the citation- and recency-aware configuration, sits in the middle of the hybrid family overall. It exceeds BM25 and LSA-Dense on all four datasets, but it does not beat the strongest plain dense or hybrid baseline except against SBERT-Dense on SciFact. These landscape contrasts are descriptive/exploratory in the revised analysis; the confirmatory family is restricted to BiblioGuard versus its fallback (Section 6.1). The important motivation is that always-on metadata is competitive yet unstable, which creates a role for a selective intervention policy rather than another fixed re-ranker.</w:t>
       </w:r>
     </w:p>
     <w:p>
@@ -2928,15 +3735,15 @@
           <w:i w:val="0"/>
           <w:sz w:val="22"/>
         </w:rPr>
-        <w:t>Table 4 also isolates the role of the dense backbone. Equal-weight hybrid fusion on BGE-small (BGE-Hybrid) does not reproduce the hybrid advantage seen with MiniLM: it trails BGE-Dense on SCIDOCS (0.1832 vs. 0.2052), SciFact (0.7101 vs. 0.7127), and TREC-COVID (0.7115 vs. 0.7578); only on NFCorpus does BGE-Hybrid (0.3487) edge out BGE-Dense (0.3434), where it attains the best NDCG@10 of all ten configurations. Decisively for RQ1, transferring the CA-HR re-ranking rule to the BGE backbone (BGE-CA-HR) never helps: it falls slightly below BGE-Hybrid on every dataset (SCIDOCS 0.1803 vs. 0.1832, d = -0.059; SciFact 0.7094 vs. 0.7101, d = -0.007; NFCorpus 0.3367 vs. 0.3487, d = -0.213; TREC-COVID 0.6917 vs. 0.7115, d = -0.289) and well below BGE-Dense. Under CA-HR's fixed a-priori hyperparameters, the citation gain obtained on the weaker MiniLM backbone on SCIDOCS does not transfer to a stronger encoder: the observed metadata benefit is backbone-dependent rather than additive (Section 6.4 tests whether any metadata weight rescues it).</w:t>
+        <w:t>Table 5 also isolates the role of the dense backbone. Equal-weight hybrid fusion on BGE-small (BGE-Hybrid) does not reproduce the hybrid advantage seen with MiniLM: it trails BGE-Dense on SCIDOCS (0.1832 vs. 0.2052), SciFact (0.7101 vs. 0.7127), and TREC-COVID (0.7115 vs. 0.7578); only on NFCorpus does BGE-Hybrid (0.3487) edge out BGE-Dense (0.3434), where it attains the best NDCG@10 of all ten configurations. Decisively for RQ1, transferring the CA-HR re-ranking rule to the BGE backbone (BGE-CA-HR) never helps: it falls slightly below BGE-Hybrid on every dataset (SCIDOCS 0.1803 vs. 0.1832, d = -0.059; SciFact 0.7094 vs. 0.7101, d = -0.007; NFCorpus 0.3367 vs. 0.3487, d = -0.213; TREC-COVID 0.6917 vs. 0.7115, d = -0.289) and well below BGE-Dense. Under CA-HR's fixed a-priori hyperparameters, the citation gain obtained on the weaker MiniLM backbone on SCIDOCS does not transfer to a stronger encoder: the observed metadata benefit is backbone-dependent rather than additive (Section 6.5 tests whether any metadata weight rescues it).</w:t>
       </w:r>
     </w:p>
     <w:p>
       <w:r>
         <w:drawing>
           <wp:inline xmlns:a="http://schemas.openxmlformats.org/drawingml/2006/main" xmlns:pic="http://schemas.openxmlformats.org/drawingml/2006/picture">
-            <wp:extent cx="5486400" cy="1413048"/>
-            <wp:docPr id="2" name="Picture 2"/>
+            <wp:extent cx="5486400" cy="1419531"/>
+            <wp:docPr id="3" name="Picture 3"/>
             <wp:cNvGraphicFramePr>
               <a:graphicFrameLocks noChangeAspect="1"/>
             </wp:cNvGraphicFramePr>
@@ -2948,7 +3755,7 @@
                     <pic:cNvPicPr/>
                   </pic:nvPicPr>
                   <pic:blipFill>
-                    <a:blip r:embed="rId10"/>
+                    <a:blip r:embed="rId11"/>
                     <a:stretch>
                       <a:fillRect/>
                     </a:stretch>
@@ -2956,7 +3763,7 @@
                   <pic:spPr>
                     <a:xfrm>
                       <a:off x="0" y="0"/>
-                      <a:ext cx="5486400" cy="1413048"/>
+                      <a:ext cx="5486400" cy="1419531"/>
                     </a:xfrm>
                     <a:prstGeom prst="rect"/>
                   </pic:spPr>
@@ -2979,12 +3786,17 @@
     </w:p>
     <w:p>
       <w:r>
+        <w:br w:type="page"/>
+      </w:r>
+    </w:p>
+    <w:p>
+      <w:r>
         <w:rPr>
           <w:b/>
           <w:i w:val="0"/>
           <w:sz w:val="22"/>
         </w:rPr>
-        <w:t>6.2. Ablation of CA-HR components</w:t>
+        <w:t>6.3. Ablation of CA-HR components</w:t>
       </w:r>
     </w:p>
     <w:p>
@@ -2994,7 +3806,7 @@
           <w:i/>
           <w:sz w:val="18"/>
         </w:rPr>
-        <w:t>Table 5. CA-HR ablation (NDCG@10; bold marks cases where removing a component improves performance).</w:t>
+        <w:t>Table 6. CA-HR ablation (NDCG@10; bold marks cases where removing a component improves performance).</w:t>
       </w:r>
     </w:p>
     <w:tbl>
@@ -3011,6 +3823,10 @@
         <w:gridCol w:w="1728"/>
       </w:tblGrid>
       <w:tr>
+        <w:trPr>
+          <w:cantSplit/>
+          <w:tblHeader/>
+        </w:trPr>
         <w:tc>
           <w:tcPr>
             <w:tcW w:type="dxa" w:w="1728"/>
@@ -3083,6 +3899,9 @@
         </w:tc>
       </w:tr>
       <w:tr>
+        <w:trPr>
+          <w:cantSplit/>
+        </w:trPr>
         <w:tc>
           <w:tcPr>
             <w:tcW w:type="dxa" w:w="1728"/>
@@ -3150,6 +3969,9 @@
         </w:tc>
       </w:tr>
       <w:tr>
+        <w:trPr>
+          <w:cantSplit/>
+        </w:trPr>
         <w:tc>
           <w:tcPr>
             <w:tcW w:type="dxa" w:w="1728"/>
@@ -3217,6 +4039,9 @@
         </w:tc>
       </w:tr>
       <w:tr>
+        <w:trPr>
+          <w:cantSplit/>
+        </w:trPr>
         <w:tc>
           <w:tcPr>
             <w:tcW w:type="dxa" w:w="1728"/>
@@ -3284,6 +4109,9 @@
         </w:tc>
       </w:tr>
       <w:tr>
+        <w:trPr>
+          <w:cantSplit/>
+        </w:trPr>
         <w:tc>
           <w:tcPr>
             <w:tcW w:type="dxa" w:w="1728"/>
@@ -3351,6 +4179,9 @@
         </w:tc>
       </w:tr>
       <w:tr>
+        <w:trPr>
+          <w:cantSplit/>
+        </w:trPr>
         <w:tc>
           <w:tcPr>
             <w:tcW w:type="dxa" w:w="1728"/>
@@ -3418,6 +4249,9 @@
         </w:tc>
       </w:tr>
       <w:tr>
+        <w:trPr>
+          <w:cantSplit/>
+        </w:trPr>
         <w:tc>
           <w:tcPr>
             <w:tcW w:type="dxa" w:w="1728"/>
@@ -3485,6 +4319,7 @@
         </w:tc>
       </w:tr>
     </w:tbl>
+    <w:p/>
     <w:p>
       <w:r>
         <w:rPr>
@@ -3492,15 +4327,15 @@
           <w:i w:val="0"/>
           <w:sz w:val="22"/>
         </w:rPr>
-        <w:t>The ablation (Table 5, Fig. 3; * = removal improves on the full model) localises exactly where metadata helps and where it hurts. On SCIDOCS—the corpus where citations are most informative about relevance (AUC = 0.798)—removing the citation boost drops NDCG@10 from 0.1894 to 0.1722, the single most valuable metadata signal in the study, while removing the recency prior improves performance to 0.2022, indicating a miscalibrated recency prior on a snapshot corpus. On SciFact both metadata terms are neutral. On the two new domains the sign flips: removing the citation boost improves NDCG@10 on NFCorpus (0.3322 → 0.3396) and on TREC-COVID (0.6740 → 0.6830). The sign flip tracks the bibliographic-informativeness diagnostics (Table 3), not coverage: NFCorpus and TREC-COVID are exactly the corpora where citation counts carry no (AUC = 0.498) or inverse (AUC = 0.461) information about relevance, so the citation boost amplifies noise rather than refining the ranking. The content side is stable across domains: removing either modality degrades performance almost everywhere, except that a pure dense configuration is best on SCIDOCS, consistent with dense dominance on computer science.</w:t>
+        <w:t>The ablation (Table 6, Fig. 3; * = removal improves on the full model) localises exactly where metadata helps and where it hurts. On SCIDOCS—the corpus where citations are most informative about relevance (AUC = 0.798)—removing the citation boost drops NDCG@10 from 0.1894 to 0.1722, the single most valuable metadata signal in the study, while removing the recency prior improves performance to 0.2022, indicating a miscalibrated recency prior on a snapshot corpus. On SciFact both metadata terms are neutral. On the two new domains the sign flips: removing the citation boost improves NDCG@10 on NFCorpus (0.3322 → 0.3396) and on TREC-COVID (0.6740 → 0.6830). The sign flip tracks the bibliographic-informativeness diagnostics (Table 3), not coverage: NFCorpus and TREC-COVID are exactly the corpora where citation counts carry no (AUC = 0.498) or inverse (AUC = 0.461) information about relevance, so the citation boost amplifies noise rather than refining the ranking. The content side is stable across domains: removing either modality degrades performance almost everywhere, except that a pure dense configuration is best on SCIDOCS, consistent with dense dominance on computer science.</w:t>
       </w:r>
     </w:p>
     <w:p>
       <w:r>
         <w:drawing>
           <wp:inline xmlns:a="http://schemas.openxmlformats.org/drawingml/2006/main" xmlns:pic="http://schemas.openxmlformats.org/drawingml/2006/picture">
-            <wp:extent cx="5486400" cy="1436718"/>
-            <wp:docPr id="3" name="Picture 3"/>
+            <wp:extent cx="5486400" cy="1434023"/>
+            <wp:docPr id="4" name="Picture 4"/>
             <wp:cNvGraphicFramePr>
               <a:graphicFrameLocks noChangeAspect="1"/>
             </wp:cNvGraphicFramePr>
@@ -3512,7 +4347,7 @@
                     <pic:cNvPicPr/>
                   </pic:nvPicPr>
                   <pic:blipFill>
-                    <a:blip r:embed="rId11"/>
+                    <a:blip r:embed="rId12"/>
                     <a:stretch>
                       <a:fillRect/>
                     </a:stretch>
@@ -3520,7 +4355,7 @@
                   <pic:spPr>
                     <a:xfrm>
                       <a:off x="0" y="0"/>
-                      <a:ext cx="5486400" cy="1436718"/>
+                      <a:ext cx="5486400" cy="1434023"/>
                     </a:xfrm>
                     <a:prstGeom prst="rect"/>
                   </pic:spPr>
@@ -3548,7 +4383,7 @@
           <w:i w:val="0"/>
           <w:sz w:val="22"/>
         </w:rPr>
-        <w:t>6.3. Robustness to query corruption</w:t>
+        <w:t>6.4. Robustness to query corruption</w:t>
       </w:r>
     </w:p>
     <w:p>
@@ -3558,15 +4393,15 @@
           <w:i w:val="0"/>
           <w:sz w:val="22"/>
         </w:rPr>
-        <w:t>Under simulated word-drop noise (10%-40%), all hybrid methods degrade gracefully, but robustness rankings are domain-dependent and do not simply follow clean-query rankings (Fig. 4). On TREC-COVID, CA-HR is the most noise-resistant configuration: at 40% corruption it retains 0.4123 NDCG@10 versus 0.3988 for Neural-Hybrid and 0.3424 for BM25: the citation authority term, being independent of the corrupted query text, acts as a stabiliser even where it does not raise clean-query effectiveness. On SciFact, CA-HR (0.5640) and Neural-Hybrid (0.5691) are nearly tied at 40% noise, both well above BM25 (0.5305), and on NFCorpus the two hybrids again track each other closely (0.2809 vs. 0.2844). SCIDOCS is the exception: there BM25 is the most robust method at 40% corruption (0.1115 versus 0.1079 for CA-HR and 0.0887 for Neural-Hybrid), indicating that where dense representations dominate on clean queries they are also the most fragile to lexical corruption.</w:t>
+        <w:t>Under simulated word-drop noise (10%-40%), all hybrid methods degrade gracefully, but robustness rankings are domain-dependent and do not simply follow clean-query rankings (Fig. 4). On TREC-COVID, CA-HR is the most noise-resistant configuration: at 40% corruption it retains 0.4123 NDCG@10 versus 0.3988 for Neural-Hybrid and 0.3424 for BM25: the citation authority term, being independent of the corrupted query text, acts as a stabiliser even where it does not raise clean-query effectiveness. On SciFact, CA-HR (0.6923) and Neural-Hybrid (0.7073) are nearly tied at 40% noise, both well above BM25 (0.6697), and on NFCorpus the two hybrids again track each other closely (0.2809 vs. 0.2844). SCIDOCS is the exception: there BM25 is the most robust method at 40% corruption (0.1185 versus 0.1522 for CA-HR and 0.1545 for Neural-Hybrid), indicating that where dense representations dominate on clean queries they are also the most fragile to lexical corruption.</w:t>
       </w:r>
     </w:p>
     <w:p>
       <w:r>
         <w:drawing>
           <wp:inline xmlns:a="http://schemas.openxmlformats.org/drawingml/2006/main" xmlns:pic="http://schemas.openxmlformats.org/drawingml/2006/picture">
-            <wp:extent cx="5486400" cy="1430221"/>
-            <wp:docPr id="4" name="Picture 4"/>
+            <wp:extent cx="5486400" cy="1434737"/>
+            <wp:docPr id="5" name="Picture 5"/>
             <wp:cNvGraphicFramePr>
               <a:graphicFrameLocks noChangeAspect="1"/>
             </wp:cNvGraphicFramePr>
@@ -3578,7 +4413,7 @@
                     <pic:cNvPicPr/>
                   </pic:nvPicPr>
                   <pic:blipFill>
-                    <a:blip r:embed="rId12"/>
+                    <a:blip r:embed="rId13"/>
                     <a:stretch>
                       <a:fillRect/>
                     </a:stretch>
@@ -3586,7 +4421,7 @@
                   <pic:spPr>
                     <a:xfrm>
                       <a:off x="0" y="0"/>
-                      <a:ext cx="5486400" cy="1430221"/>
+                      <a:ext cx="5486400" cy="1434737"/>
                     </a:xfrm>
                     <a:prstGeom prst="rect"/>
                   </pic:spPr>
@@ -3614,7 +4449,7 @@
           <w:i w:val="0"/>
           <w:sz w:val="22"/>
         </w:rPr>
-        <w:t>6.4. Metadata-weight sensitivity and rank-fusion baselines</w:t>
+        <w:t>6.5. Metadata-weight sensitivity and rank-fusion baselines</w:t>
       </w:r>
     </w:p>
     <w:p>
@@ -3624,7 +4459,7 @@
           <w:i w:val="0"/>
           <w:sz w:val="22"/>
         </w:rPr>
-        <w:t>Two objections remain after Section 6.1. First, CA-HR's weights were fixed a priori, so the absence of a metadata gain on the stronger BGE backbone could be an artefact of under-weighting the metadata terms. Second, our hybrids interpolate min-max-normalised scores, so a standard rank-fusion reference is missing. Table 6 addresses both. We sweep the citation and recency weights of BGE-CA-HR over a 30-combination grid (beta in {0, 0.05, 0.10, 0.15, 0.20, 0.30}, gamma in {0, 0.05, 0.10, 0.15, 0.20}) and test each combination against BGE-Hybrid with one-sided Wilcoxon tests, Holm-corrected within each dataset. Because the grid is selected on the test judgments, we report this sweep strictly as an exploratory sensitivity analysis, not as confirmatory evidence. The metadata gain re-emerges only on SCIDOCS: beta = 0.3, gamma = 0.0 attains 0.2079 NDCG@10, significantly above BGE-Hybrid (0.1832; Holm p &lt; 0.001) and marginally above BGE-Dense (0.2052). On SciFact, NFCorpus, and TREC-COVID no grid combination significantly beats BGE-Hybrid (best 0.7112, 0.3437, and 0.7121 versus 0.7101, 0.3487, and 0.7115; all Holm-adjusted p = 1.0). The backbone effect is therefore not a weight artefact: metadata gains on a strong encoder are gated by citation informativeness, and where the signal is informative the gain transfers only after re-calibrating the metadata weight.</w:t>
+        <w:t>Two objections remain after Section 6.2. First, CA-HR's weights were fixed a priori, so the absence of a metadata gain on the stronger BGE backbone could be an artefact of under-weighting the metadata terms. Second, our hybrids interpolate min-max-normalised scores, so a standard rank-fusion reference is missing. Table 7 addresses both. We sweep the citation and recency weights of BGE-CA-HR over a 30-combination grid (beta in {0, 0.05, 0.10, 0.15, 0.20, 0.30}, gamma in {0, 0.05, 0.10, 0.15, 0.20}) and test each combination against BGE-Hybrid with one-sided Wilcoxon tests, Holm-corrected within each dataset. Because the grid is selected on the test judgments, we report this sweep strictly as an exploratory sensitivity analysis, not as confirmatory evidence. The metadata gain re-emerges only on SCIDOCS: beta = 0.3, gamma = 0.0 attains 0.2079 NDCG@10, significantly above BGE-Hybrid (0.1832; Holm p &lt; 0.001) and marginally above BGE-Dense (0.2052). On SciFact, NFCorpus, and TREC-COVID no grid combination significantly beats BGE-Hybrid (best 0.7112, 0.3437, and 0.7121 versus 0.7101, 0.3487, and 0.7115; all Holm-adjusted p = 1.0). The backbone effect is therefore not a weight artefact: metadata gains on a strong encoder are gated by citation informativeness, and where the signal is informative the gain transfers only after re-calibrating the metadata weight.</w:t>
       </w:r>
     </w:p>
     <w:p>
@@ -3634,7 +4469,17 @@
           <w:i w:val="0"/>
           <w:sz w:val="22"/>
         </w:rPr>
-        <w:t>As a stronger fusion reference we add reciprocal rank fusion (RRF, k = 60) of BM25 with each dense encoder. RRF-MiniLM / RRF-BGE reach NDCG@10 0.1980 / 0.1940 on SCIDOCS, 0.6831 / 0.7114 on SciFact, 0.3323 / 0.3424 on NFCorpus, and 0.6771 / 0.7541 on TREC-COVID: no RRF variant is the best configuration on any dataset, so the qualitative conclusions of Table 4 do not depend on the min-max interpolation rule.</w:t>
+        <w:t>As a stronger fusion reference we add reciprocal rank fusion (RRF, k = 60) of BM25 with each dense encoder. RRF-MiniLM / RRF-BGE reach NDCG@10 0.1980 / 0.1940 on SCIDOCS, 0.6831 / 0.7114 on SciFact, 0.3323 / 0.3424 on NFCorpus, and 0.6771 / 0.7541 on TREC-COVID: no RRF variant is the best configuration on any dataset, so the qualitative conclusions of Table 5 do not depend on the min-max interpolation rule.</w:t>
+      </w:r>
+    </w:p>
+    <w:p>
+      <w:r>
+        <w:rPr>
+          <w:b w:val="0"/>
+          <w:i/>
+          <w:sz w:val="18"/>
+        </w:rPr>
+        <w:t>Table 7. BGE-backbone metadata-weight sensitivity (30-combination grid per dataset; significance vs. BGE-Hybrid, one-sided Wilcoxon with Holm correction) and RRF (k = 60) rank-fusion baselines; NDCG@10.</w:t>
       </w:r>
     </w:p>
     <w:tbl>
@@ -3655,6 +4500,10 @@
         <w:gridCol w:w="960"/>
       </w:tblGrid>
       <w:tr>
+        <w:trPr>
+          <w:cantSplit/>
+          <w:tblHeader/>
+        </w:trPr>
         <w:tc>
           <w:tcPr>
             <w:tcW w:type="dxa" w:w="960"/>
@@ -3783,6 +4632,9 @@
         </w:tc>
       </w:tr>
       <w:tr>
+        <w:trPr>
+          <w:cantSplit/>
+        </w:trPr>
         <w:tc>
           <w:tcPr>
             <w:tcW w:type="dxa" w:w="960"/>
@@ -3902,6 +4754,9 @@
         </w:tc>
       </w:tr>
       <w:tr>
+        <w:trPr>
+          <w:cantSplit/>
+        </w:trPr>
         <w:tc>
           <w:tcPr>
             <w:tcW w:type="dxa" w:w="960"/>
@@ -4021,6 +4876,9 @@
         </w:tc>
       </w:tr>
       <w:tr>
+        <w:trPr>
+          <w:cantSplit/>
+        </w:trPr>
         <w:tc>
           <w:tcPr>
             <w:tcW w:type="dxa" w:w="960"/>
@@ -4140,6 +4998,9 @@
         </w:tc>
       </w:tr>
       <w:tr>
+        <w:trPr>
+          <w:cantSplit/>
+        </w:trPr>
         <w:tc>
           <w:tcPr>
             <w:tcW w:type="dxa" w:w="960"/>
@@ -4259,580 +5120,7 @@
         </w:tc>
       </w:tr>
     </w:tbl>
-    <w:p>
-      <w:r>
-        <w:rPr>
-          <w:b w:val="0"/>
-          <w:i/>
-          <w:sz w:val="18"/>
-        </w:rPr>
-        <w:t>Table 6. BGE-backbone metadata-weight sensitivity (30-combination grid per dataset; significance vs. BGE-Hybrid, one-sided Wilcoxon with Holm correction) and RRF (k = 60) rank-fusion baselines; NDCG@10.</w:t>
-      </w:r>
-    </w:p>
-    <w:p>
-      <w:r>
-        <w:rPr>
-          <w:b/>
-          <w:i w:val="0"/>
-          <w:sz w:val="22"/>
-        </w:rPr>
-        <w:t>6.5. Oracle headroom and learned routing</w:t>
-      </w:r>
-    </w:p>
-    <w:p>
-      <w:r>
-        <w:rPr>
-          <w:b w:val="0"/>
-          <w:i/>
-          <w:sz w:val="18"/>
-        </w:rPr>
-        <w:t>Table 7. Per-query oracle, best single metadata-aware strategy, PAV Router-routed system, and router agreement.</w:t>
-      </w:r>
-    </w:p>
-    <w:tbl>
-      <w:tblPr>
-        <w:tblStyle w:val="TableGrid"/>
-        <w:tblW w:type="auto" w:w="0"/>
-        <w:tblLook w:firstColumn="1" w:firstRow="1" w:lastColumn="0" w:lastRow="0" w:noHBand="0" w:noVBand="1" w:val="04A0"/>
-      </w:tblPr>
-      <w:tblGrid>
-        <w:gridCol w:w="1234"/>
-        <w:gridCol w:w="1234"/>
-        <w:gridCol w:w="1234"/>
-        <w:gridCol w:w="1234"/>
-        <w:gridCol w:w="1234"/>
-        <w:gridCol w:w="1234"/>
-        <w:gridCol w:w="1234"/>
-      </w:tblGrid>
-      <w:tr>
-        <w:tc>
-          <w:tcPr>
-            <w:tcW w:type="dxa" w:w="1234"/>
-          </w:tcPr>
-          <w:p>
-            <w:r>
-              <w:rPr>
-                <w:b/>
-                <w:sz w:val="16"/>
-              </w:rPr>
-              <w:t>Dataset</w:t>
-            </w:r>
-          </w:p>
-        </w:tc>
-        <w:tc>
-          <w:tcPr>
-            <w:tcW w:type="dxa" w:w="1234"/>
-          </w:tcPr>
-          <w:p>
-            <w:r>
-              <w:rPr>
-                <w:b/>
-                <w:sz w:val="16"/>
-              </w:rPr>
-              <w:t>Best single</w:t>
-            </w:r>
-          </w:p>
-        </w:tc>
-        <w:tc>
-          <w:tcPr>
-            <w:tcW w:type="dxa" w:w="1234"/>
-          </w:tcPr>
-          <w:p>
-            <w:r>
-              <w:rPr>
-                <w:b/>
-                <w:sz w:val="16"/>
-              </w:rPr>
-              <w:t>CA-HR</w:t>
-            </w:r>
-          </w:p>
-        </w:tc>
-        <w:tc>
-          <w:tcPr>
-            <w:tcW w:type="dxa" w:w="1234"/>
-          </w:tcPr>
-          <w:p>
-            <w:r>
-              <w:rPr>
-                <w:b/>
-                <w:sz w:val="16"/>
-              </w:rPr>
-              <w:t>PAV Router</w:t>
-            </w:r>
-          </w:p>
-        </w:tc>
-        <w:tc>
-          <w:tcPr>
-            <w:tcW w:type="dxa" w:w="1234"/>
-          </w:tcPr>
-          <w:p>
-            <w:r>
-              <w:rPr>
-                <w:b/>
-                <w:sz w:val="16"/>
-              </w:rPr>
-              <w:t>Oracle</w:t>
-            </w:r>
-          </w:p>
-        </w:tc>
-        <w:tc>
-          <w:tcPr>
-            <w:tcW w:type="dxa" w:w="1234"/>
-          </w:tcPr>
-          <w:p>
-            <w:r>
-              <w:rPr>
-                <w:b/>
-                <w:sz w:val="16"/>
-              </w:rPr>
-              <w:t>Router acc.</w:t>
-            </w:r>
-          </w:p>
-        </w:tc>
-        <w:tc>
-          <w:tcPr>
-            <w:tcW w:type="dxa" w:w="1234"/>
-          </w:tcPr>
-          <w:p>
-            <w:r>
-              <w:rPr>
-                <w:b/>
-                <w:sz w:val="16"/>
-              </w:rPr>
-              <w:t>Cohen's κ</w:t>
-            </w:r>
-          </w:p>
-        </w:tc>
-      </w:tr>
-      <w:tr>
-        <w:tc>
-          <w:tcPr>
-            <w:tcW w:type="dxa" w:w="1234"/>
-          </w:tcPr>
-          <w:p>
-            <w:r>
-              <w:rPr>
-                <w:sz w:val="16"/>
-              </w:rPr>
-              <w:t>SCIDOCS</w:t>
-            </w:r>
-          </w:p>
-        </w:tc>
-        <w:tc>
-          <w:tcPr>
-            <w:tcW w:type="dxa" w:w="1234"/>
-          </w:tcPr>
-          <w:p>
-            <w:r>
-              <w:rPr>
-                <w:sz w:val="16"/>
-              </w:rPr>
-              <w:t>0.1974 (UMA-RAG)</w:t>
-            </w:r>
-          </w:p>
-        </w:tc>
-        <w:tc>
-          <w:tcPr>
-            <w:tcW w:type="dxa" w:w="1234"/>
-          </w:tcPr>
-          <w:p>
-            <w:r>
-              <w:rPr>
-                <w:sz w:val="16"/>
-              </w:rPr>
-              <w:t>0.1894</w:t>
-            </w:r>
-          </w:p>
-        </w:tc>
-        <w:tc>
-          <w:tcPr>
-            <w:tcW w:type="dxa" w:w="1234"/>
-          </w:tcPr>
-          <w:p>
-            <w:r>
-              <w:rPr>
-                <w:sz w:val="16"/>
-              </w:rPr>
-              <w:t>0.1896</w:t>
-            </w:r>
-          </w:p>
-        </w:tc>
-        <w:tc>
-          <w:tcPr>
-            <w:tcW w:type="dxa" w:w="1234"/>
-          </w:tcPr>
-          <w:p>
-            <w:r>
-              <w:rPr>
-                <w:sz w:val="16"/>
-              </w:rPr>
-              <w:t>0.2031</w:t>
-            </w:r>
-          </w:p>
-        </w:tc>
-        <w:tc>
-          <w:tcPr>
-            <w:tcW w:type="dxa" w:w="1234"/>
-          </w:tcPr>
-          <w:p>
-            <w:r>
-              <w:rPr>
-                <w:sz w:val="16"/>
-              </w:rPr>
-              <w:t>0.763</w:t>
-            </w:r>
-          </w:p>
-        </w:tc>
-        <w:tc>
-          <w:tcPr>
-            <w:tcW w:type="dxa" w:w="1234"/>
-          </w:tcPr>
-          <w:p>
-            <w:r>
-              <w:rPr>
-                <w:sz w:val="16"/>
-              </w:rPr>
-              <w:t>0.027</w:t>
-            </w:r>
-          </w:p>
-        </w:tc>
-      </w:tr>
-      <w:tr>
-        <w:tc>
-          <w:tcPr>
-            <w:tcW w:type="dxa" w:w="1234"/>
-          </w:tcPr>
-          <w:p>
-            <w:r>
-              <w:rPr>
-                <w:sz w:val="16"/>
-              </w:rPr>
-              <w:t>SciFact</w:t>
-            </w:r>
-          </w:p>
-        </w:tc>
-        <w:tc>
-          <w:tcPr>
-            <w:tcW w:type="dxa" w:w="1234"/>
-          </w:tcPr>
-          <w:p>
-            <w:r>
-              <w:rPr>
-                <w:sz w:val="16"/>
-              </w:rPr>
-              <w:t>0.7081 (LP-RAG)</w:t>
-            </w:r>
-          </w:p>
-        </w:tc>
-        <w:tc>
-          <w:tcPr>
-            <w:tcW w:type="dxa" w:w="1234"/>
-          </w:tcPr>
-          <w:p>
-            <w:r>
-              <w:rPr>
-                <w:sz w:val="16"/>
-              </w:rPr>
-              <w:t>0.7042</w:t>
-            </w:r>
-          </w:p>
-        </w:tc>
-        <w:tc>
-          <w:tcPr>
-            <w:tcW w:type="dxa" w:w="1234"/>
-          </w:tcPr>
-          <w:p>
-            <w:r>
-              <w:rPr>
-                <w:sz w:val="16"/>
-              </w:rPr>
-              <w:t>0.7042</w:t>
-            </w:r>
-          </w:p>
-        </w:tc>
-        <w:tc>
-          <w:tcPr>
-            <w:tcW w:type="dxa" w:w="1234"/>
-          </w:tcPr>
-          <w:p>
-            <w:r>
-              <w:rPr>
-                <w:sz w:val="16"/>
-              </w:rPr>
-              <w:t>0.7166</w:t>
-            </w:r>
-          </w:p>
-        </w:tc>
-        <w:tc>
-          <w:tcPr>
-            <w:tcW w:type="dxa" w:w="1234"/>
-          </w:tcPr>
-          <w:p>
-            <w:r>
-              <w:rPr>
-                <w:sz w:val="16"/>
-              </w:rPr>
-              <w:t>0.913</w:t>
-            </w:r>
-          </w:p>
-        </w:tc>
-        <w:tc>
-          <w:tcPr>
-            <w:tcW w:type="dxa" w:w="1234"/>
-          </w:tcPr>
-          <w:p>
-            <w:r>
-              <w:rPr>
-                <w:sz w:val="16"/>
-              </w:rPr>
-              <w:t>-0.005</w:t>
-            </w:r>
-          </w:p>
-        </w:tc>
-      </w:tr>
-      <w:tr>
-        <w:tc>
-          <w:tcPr>
-            <w:tcW w:type="dxa" w:w="1234"/>
-          </w:tcPr>
-          <w:p>
-            <w:r>
-              <w:rPr>
-                <w:sz w:val="16"/>
-              </w:rPr>
-              <w:t>NFCorpus</w:t>
-            </w:r>
-          </w:p>
-        </w:tc>
-        <w:tc>
-          <w:tcPr>
-            <w:tcW w:type="dxa" w:w="1234"/>
-          </w:tcPr>
-          <w:p>
-            <w:r>
-              <w:rPr>
-                <w:sz w:val="16"/>
-              </w:rPr>
-              <w:t>0.3391 (LP-RAG)</w:t>
-            </w:r>
-          </w:p>
-        </w:tc>
-        <w:tc>
-          <w:tcPr>
-            <w:tcW w:type="dxa" w:w="1234"/>
-          </w:tcPr>
-          <w:p>
-            <w:r>
-              <w:rPr>
-                <w:sz w:val="16"/>
-              </w:rPr>
-              <w:t>0.3322</w:t>
-            </w:r>
-          </w:p>
-        </w:tc>
-        <w:tc>
-          <w:tcPr>
-            <w:tcW w:type="dxa" w:w="1234"/>
-          </w:tcPr>
-          <w:p>
-            <w:r>
-              <w:rPr>
-                <w:sz w:val="16"/>
-              </w:rPr>
-              <w:t>0.3326</w:t>
-            </w:r>
-          </w:p>
-        </w:tc>
-        <w:tc>
-          <w:tcPr>
-            <w:tcW w:type="dxa" w:w="1234"/>
-          </w:tcPr>
-          <w:p>
-            <w:r>
-              <w:rPr>
-                <w:sz w:val="16"/>
-              </w:rPr>
-              <w:t>0.3493</w:t>
-            </w:r>
-          </w:p>
-        </w:tc>
-        <w:tc>
-          <w:tcPr>
-            <w:tcW w:type="dxa" w:w="1234"/>
-          </w:tcPr>
-          <w:p>
-            <w:r>
-              <w:rPr>
-                <w:sz w:val="16"/>
-              </w:rPr>
-              <w:t>0.684</w:t>
-            </w:r>
-          </w:p>
-        </w:tc>
-        <w:tc>
-          <w:tcPr>
-            <w:tcW w:type="dxa" w:w="1234"/>
-          </w:tcPr>
-          <w:p>
-            <w:r>
-              <w:rPr>
-                <w:sz w:val="16"/>
-              </w:rPr>
-              <w:t>0.003</w:t>
-            </w:r>
-          </w:p>
-        </w:tc>
-      </w:tr>
-      <w:tr>
-        <w:tc>
-          <w:tcPr>
-            <w:tcW w:type="dxa" w:w="1234"/>
-          </w:tcPr>
-          <w:p>
-            <w:r>
-              <w:rPr>
-                <w:sz w:val="16"/>
-              </w:rPr>
-              <w:t>TREC-COVID</w:t>
-            </w:r>
-          </w:p>
-        </w:tc>
-        <w:tc>
-          <w:tcPr>
-            <w:tcW w:type="dxa" w:w="1234"/>
-          </w:tcPr>
-          <w:p>
-            <w:r>
-              <w:rPr>
-                <w:sz w:val="16"/>
-              </w:rPr>
-              <w:t>0.6743 (LP-RAG)</w:t>
-            </w:r>
-          </w:p>
-        </w:tc>
-        <w:tc>
-          <w:tcPr>
-            <w:tcW w:type="dxa" w:w="1234"/>
-          </w:tcPr>
-          <w:p>
-            <w:r>
-              <w:rPr>
-                <w:sz w:val="16"/>
-              </w:rPr>
-              <w:t>0.6740</w:t>
-            </w:r>
-          </w:p>
-        </w:tc>
-        <w:tc>
-          <w:tcPr>
-            <w:tcW w:type="dxa" w:w="1234"/>
-          </w:tcPr>
-          <w:p>
-            <w:r>
-              <w:rPr>
-                <w:sz w:val="16"/>
-              </w:rPr>
-              <w:t>0.6702</w:t>
-            </w:r>
-          </w:p>
-        </w:tc>
-        <w:tc>
-          <w:tcPr>
-            <w:tcW w:type="dxa" w:w="1234"/>
-          </w:tcPr>
-          <w:p>
-            <w:r>
-              <w:rPr>
-                <w:sz w:val="16"/>
-              </w:rPr>
-              <w:t>0.7101</w:t>
-            </w:r>
-          </w:p>
-        </w:tc>
-        <w:tc>
-          <w:tcPr>
-            <w:tcW w:type="dxa" w:w="1234"/>
-          </w:tcPr>
-          <w:p>
-            <w:r>
-              <w:rPr>
-                <w:sz w:val="16"/>
-              </w:rPr>
-              <w:t>0.300</w:t>
-            </w:r>
-          </w:p>
-        </w:tc>
-        <w:tc>
-          <w:tcPr>
-            <w:tcW w:type="dxa" w:w="1234"/>
-          </w:tcPr>
-          <w:p>
-            <w:r>
-              <w:rPr>
-                <w:sz w:val="16"/>
-              </w:rPr>
-              <w:t>-0.108</w:t>
-            </w:r>
-          </w:p>
-        </w:tc>
-      </w:tr>
-    </w:tbl>
-    <w:p>
-      <w:r>
-        <w:rPr>
-          <w:b w:val="0"/>
-          <w:i w:val="0"/>
-          <w:sz w:val="22"/>
-        </w:rPr>
-        <w:t>Table 7 and Fig. 5 quantify how much per-query adaptivity could ever buy. The oracle that picks the per-query best among the three metadata-aware strategies exceeds the best single strategy by only +0.006 (SCIDOCS) and +0.008 (SciFact) NDCG@10; the headroom is larger on NFCorpus (+0.010) and TREC-COVID (+0.036), where the metadata signals interact with sparse coverage. The learned router does not recover this headroom on any dataset: out-of-fold label accuracy reaches 91.3% on SciFact but collapses to majority-class prediction (Cohen's κ between -0.108 and 0.027 across the four datasets), and the routed system never exceeds simply always choosing CA-HR. Across the four datasets, the tested surface-feature router fails to recover the available per-query oracle headroom, suggesting that domain-level configuration is a stronger default than this lightweight form of query-level adaptation.</w:t>
-      </w:r>
-    </w:p>
-    <w:p>
-      <w:r>
-        <w:drawing>
-          <wp:inline xmlns:a="http://schemas.openxmlformats.org/drawingml/2006/main" xmlns:pic="http://schemas.openxmlformats.org/drawingml/2006/picture">
-            <wp:extent cx="5486400" cy="2561317"/>
-            <wp:docPr id="5" name="Picture 5"/>
-            <wp:cNvGraphicFramePr>
-              <a:graphicFrameLocks noChangeAspect="1"/>
-            </wp:cNvGraphicFramePr>
-            <a:graphic>
-              <a:graphicData uri="http://schemas.openxmlformats.org/drawingml/2006/picture">
-                <pic:pic>
-                  <pic:nvPicPr>
-                    <pic:cNvPr id="0" name="Fig5_routing.png"/>
-                    <pic:cNvPicPr/>
-                  </pic:nvPicPr>
-                  <pic:blipFill>
-                    <a:blip r:embed="rId13"/>
-                    <a:stretch>
-                      <a:fillRect/>
-                    </a:stretch>
-                  </pic:blipFill>
-                  <pic:spPr>
-                    <a:xfrm>
-                      <a:off x="0" y="0"/>
-                      <a:ext cx="5486400" cy="2561317"/>
-                    </a:xfrm>
-                    <a:prstGeom prst="rect"/>
-                  </pic:spPr>
-                </pic:pic>
-              </a:graphicData>
-            </a:graphic>
-          </wp:inline>
-        </w:drawing>
-      </w:r>
-    </w:p>
-    <w:p>
-      <w:r>
-        <w:rPr>
-          <w:b w:val="0"/>
-          <w:i/>
-          <w:sz w:val="18"/>
-        </w:rPr>
-        <w:t>Fig. 5. Oracle headroom vs. learned routing (NDCG@10).</w:t>
-      </w:r>
-    </w:p>
+    <w:p/>
     <w:p>
       <w:r>
         <w:rPr>
@@ -4866,6 +5154,10 @@
         <w:gridCol w:w="2160"/>
       </w:tblGrid>
       <w:tr>
+        <w:trPr>
+          <w:cantSplit/>
+          <w:tblHeader/>
+        </w:trPr>
         <w:tc>
           <w:tcPr>
             <w:tcW w:type="dxa" w:w="2160"/>
@@ -4924,6 +5216,9 @@
         </w:tc>
       </w:tr>
       <w:tr>
+        <w:trPr>
+          <w:cantSplit/>
+        </w:trPr>
         <w:tc>
           <w:tcPr>
             <w:tcW w:type="dxa" w:w="2160"/>
@@ -4978,6 +5273,9 @@
         </w:tc>
       </w:tr>
       <w:tr>
+        <w:trPr>
+          <w:cantSplit/>
+        </w:trPr>
         <w:tc>
           <w:tcPr>
             <w:tcW w:type="dxa" w:w="2160"/>
@@ -5032,6 +5330,9 @@
         </w:tc>
       </w:tr>
       <w:tr>
+        <w:trPr>
+          <w:cantSplit/>
+        </w:trPr>
         <w:tc>
           <w:tcPr>
             <w:tcW w:type="dxa" w:w="2160"/>
@@ -5086,6 +5387,9 @@
         </w:tc>
       </w:tr>
       <w:tr>
+        <w:trPr>
+          <w:cantSplit/>
+        </w:trPr>
         <w:tc>
           <w:tcPr>
             <w:tcW w:type="dxa" w:w="2160"/>
@@ -5140,6 +5444,7 @@
         </w:tc>
       </w:tr>
     </w:tbl>
+    <w:p/>
     <w:p>
       <w:r>
         <w:rPr>
@@ -5147,7 +5452,7 @@
           <w:i w:val="0"/>
           <w:sz w:val="22"/>
         </w:rPr>
-        <w:t>Do the retrieval-level differences survive into the answers users actually read? We sampled 200 test queries (50 per dataset, fixed seed), generated cited answers with DeepSeek (deepseek-chat, temperature 0.2, top-5 passages as context), and scored each answer for relevance and faithfulness with an LLM judge and for citation precision against the gold judgments. The judge is the same DeepSeek chat model prompted with a fixed rubric (1-5 relevance; 1-5 faithfulness conditioned on the retrieved context; the exact prompts are released with the code). Each answer was judged once, in randomised backend order with backend labels hidden from the judge; no human verification subsample was performed, which we flag as a limitation (Section 8.2). Table 8 shows the backends are statistically indistinguishable on every measure (all p &gt; 0.48): at top-5, the two systems surface nearly the same passages (1.68 vs. 1.70 gold-relevant documents on average). Two secondary findings are worth reporting. First, absolute answer quality is high (relevance 4.18-4.25, faithfulness 4.89-4.92 of 5), so the pipeline is usable in production. Second, citation precision against the strict gold judgments averages about 0.50 but varies sharply with gold-judgment density: 0.87 on TREC-COVID, whose queries carry dense graded judgments, versus 0.15 on SCIDOCS, whose judgments are sparse; the model frequently cites plausible but not gold-relevant passages, a failure mode invisible to retrieval metrics and a target for future citation verification. We caveat that the judge shares the generator's model family (Zheng et al., 2023); the paired design controls for this bias, but absolute scores should be read accordingly.</w:t>
+        <w:t>This secondary experiment predates BiblioGuard and compares two fixed MiniLM-family backends; it tests whether retrieval changes of the observed magnitude survive generation, not whether BiblioGuard itself improves generated answers. We sampled 200 test queries (50 per dataset, fixed seed), generated cited answers with DeepSeek (deepseek-chat, temperature 0.2, top-5 passages as context), and scored each answer for relevance and faithfulness with an LLM judge and for citation precision against the gold judgments. The judge is the same DeepSeek chat model prompted with a fixed rubric (1-5 relevance; 1-5 faithfulness conditioned on the retrieved context; the exact prompts are released with the code). Each answer was judged once, in randomised backend order with backend labels hidden from the judge; no human verification subsample was performed, which we flag as a limitation (Section 8.2). Table 8 shows the backends are statistically indistinguishable on every measure (all p &gt; 0.48): at top-5, the two systems surface nearly the same passages (1.68 vs. 1.70 gold-relevant documents on average). Two secondary findings are worth reporting. First, absolute answer quality is high (relevance 4.18-4.25, faithfulness 4.89-4.92 of 5), supporting technical feasibility under this automated judge. Second, citation precision against the strict gold judgments averages about 0.50 but varies sharply with gold-judgment density: 0.87 on TREC-COVID, whose queries carry dense graded judgments, versus 0.15 on SCIDOCS, whose judgments are sparse; the model frequently cites plausible but not gold-relevant passages, a failure mode invisible to retrieval metrics and a target for future citation verification. We caveat that the judge shares the generator's model family (Zheng et al., 2023); the paired design controls for this bias, but absolute scores should be read accordingly.</w:t>
       </w:r>
     </w:p>
     <w:p>
@@ -5187,7 +5492,7 @@
           <w:i w:val="0"/>
           <w:sz w:val="22"/>
         </w:rPr>
-        <w:t>The full pipeline has been deployed in the production assistant since 10 July 2026 (system name and URL withheld for anonymous review), on a single Aliyun ECS instance (2 vCPU, 1.6 GB RAM, 40 GB disk, Ubuntu 22.04) with Node.js 20.20.2, MySQL 8.0.46, Nginx 1.18 terminating TLS (Let's Encrypt, auto-renewed), and PM2 supervision. Over the first month of operation the service recorded 6 registered users, 6 uploaded papers, 26 chat conversations with 63 messages, 6 AI-generated summaries, and 3 writing projects; the process restarted twice in six days (both manual deploys) and the edge responds in about 74 ms. This is a pilot-scale deployment, and we report it as such: its purpose is to demonstrate that the evaluated pipeline runs unchanged on commodity hardware in production, not to claim large-scale adoption.</w:t>
+        <w:t>The full pipeline has been deployed in the production assistant since 10 July 2026 (system name and URL withheld for anonymous review), on a single Aliyun ECS instance (2 vCPU, 1.6 GB RAM, 40 GB disk, Ubuntu 22.04) with Node.js 20.20.2, MySQL 8.0.46, Nginx 1.18 terminating TLS (Let's Encrypt, auto-renewed), and PM2 supervision. Over the first month of operation the service recorded 6 registered users, 6 uploaded papers, 26 chat conversations with 63 messages, 6 AI-generated summaries, and 3 writing projects; the process restarted twice in six days (both manual deploys) and the edge responds in about 74 ms. This is a pilot-scale deployment, and we report it as such: its purpose is to demonstrate that the retrieval/generation pipeline runs on commodity hardware, not to claim large-scale adoption or an online evaluation of BiblioGuard. The pilot used fixed hybrid/CA-HR backends and predates the new decision policy; BiblioGuard has been integrated into the offline reproduction code but has not yet been subjected to a live A/B test.</w:t>
       </w:r>
     </w:p>
     <w:p>
@@ -5197,7 +5502,7 @@
           <w:i w:val="0"/>
           <w:sz w:val="22"/>
         </w:rPr>
-        <w:t>Two operational observations connect the deployment to the experimental findings. First, retrieval never appeared in the latency budget: user-perceived response time is dominated by the streamed LLM tokens, consistent with Section 6.7, so the choice among the ten configurations is free from an engineering standpoint. Second, user-uploaded papers are often fresh preprints with no citation record—the production analogue of TREC-COVID's inverted citation-relevance association—so the system defaults to the plain hybrid backend for user libraries and reserves citation-aware re-ranking for corpora where citations demonstrably correlate with relevance, which is exactly the informativeness-conditional configuration policy our experiments support.</w:t>
+        <w:t>Two operational observations connect the deployment to the experimental findings. First, retrieval never appeared in the latency budget: user-perceived response time is dominated by the streamed LLM tokens, consistent with Section 6.7, so the choice among the ten configurations is free from an engineering standpoint. Second, user-uploaded papers are often fresh preprints with no citation record—the production analogue of TREC-COVID's inverted citation-relevance association—so the system defaults to the plain hybrid backend for user libraries. BiblioGuard formalises a future evidence-gated path away from that fallback; the current deployment evidence establishes only that its underlying retrieval actions satisfy the hardware budget.</w:t>
       </w:r>
     </w:p>
     <w:p>
@@ -5217,7 +5522,7 @@
           <w:i w:val="0"/>
           <w:sz w:val="22"/>
         </w:rPr>
-        <w:t>8.1. A configuration policy for scientific RAG</w:t>
+        <w:t>8.1. Why confidence-gated intervention changes the result</w:t>
       </w:r>
     </w:p>
     <w:p>
@@ -5227,7 +5532,17 @@
           <w:i w:val="0"/>
           <w:sz w:val="22"/>
         </w:rPr>
-        <w:t>Taken together, the four-domain results support a simple domain-conditional policy grounded in bibliographic informativeness (Table 3): (i) where citation authority strongly separates relevant from non-relevant documents (computer science; citation-relevance AUC = 0.798), citation-aware signals contribute positively—uniform metadata augmentation (UMA-RAG) is the strongest metadata-aware variant on SCIDOCS, and within CA-HR the citation term is the single most valuable component—though a strong pretrained dense encoder alone is hard to beat; (ii) for claim-style biomedical retrieval, where the citation-relevance association is weak (AUC = 0.582), hybrid fusion is best-in-family and metadata terms are neutral; (iii) where citations are uninformative or inversely associated with relevance (nutrition, AUC = 0.498; pandemic medicine, AUC = 0.461—and, analogously, fresh user uploads with no citation record), metadata boosts are neutral-to-harmful regardless of coverage, and a stronger dense encoder such as BGE-small is the best single investment; and (iv) the tested surface-feature router does not recover the available oracle headroom anywhere we tested—configuration effort should be spent at domain level. Two qualifiers sharpen the policy. First, the metadata effects are backbone- and weight-conditional: at CA-HR's fixed weights every metadata gain measured on the MiniLM backbone disappeared or inverted on the stronger BGE-small backbone (Section 6.1), and a 30-combination weight sweep shows the gain re-emerges only on the citation-informative corpus (SCIDOCS) and only after raising the citation weight (Section 6.4)—metadata re-ranking must therefore be re-validated and re-calibrated whenever the underlying encoder is upgraded. Second, robustness under query corruption does not follow clean-query rankings—BM25 is the most noise-robust method on SCIDOCS while CA-HR is the most robust on TREC-COVID (Section 6.3)—so noise expectations should also enter the per-domain choice.</w:t>
+        <w:t>BiblioGuard changes the learning target from absolute winner prediction to paired incremental utility. This matters because all candidate outcomes share the same query and much of the same ranking; subtracting the fallback removes query difficulty and asks only whether intervention is justified. The explicit no-action outcome also changes the error asymmetry: a false positive can damage a strong baseline, whereas a false negative merely forgoes a possible gain. The lower-bound gate implements this conservative preference.</w:t>
+      </w:r>
+    </w:p>
+    <w:p>
+      <w:r>
+        <w:rPr>
+          <w:b w:val="0"/>
+          <w:i w:val="0"/>
+          <w:sz w:val="22"/>
+        </w:rPr>
+        <w:t>The cross-domain activation pattern is consistent with the independent bibliographic diagnostics. SCIDOCS has a strong citation-relevance association (AUC = 0.798), and every guarded activation is a citation-only action. SciFact is weaker (AUC = 0.582), NFCorpus is uninformative (0.498), and TREC-COVID is inverted (0.461); in these domains the unconstrained estimator often predicts a positive local mean but the simultaneous lower bound rejects it. This difference between mean routing and evidence-gated routing is the central mechanism result, not a claim that bibliographic metadata is generally beneficial. Backbone and query noise remain relevant: the fixed MiniLM metadata gain does not transfer directly to BGE (Section 6.2), and robustness rankings change under word drop (Section 6.4).</w:t>
       </w:r>
     </w:p>
     <w:p>
@@ -5247,7 +5562,7 @@
           <w:i w:val="0"/>
           <w:sz w:val="22"/>
         </w:rPr>
-        <w:t>Six limitations qualify our claims. (1) TREC-COVID has only 50 test queries, so per-dataset rankings there carry wider confidence intervals; the cross-domain pattern, however, is consistent across 1,673 queries in total. (2) Metadata coverage is below 100% by construction on TREC-COVID (69.8% citations); we mitigated with neutral defaults and disclosed coverage per field, but matched and unmatched documents may differ systematically. (3) The generation judge shares the generator's model family; the paired design controls relative bias, absolute judge scores may be inflated, and no human verification subsample was performed. (4) CA-HR's hyperparameters (alpha, beta, gamma, lambda, top-100 depth) were fixed a priori and not tuned per dataset, which is conservative but may understate the method where metadata is rich; the Section 6.4 weight sweep bounds this effect directly, showing a reachable gain only on SCIDOCS. (5) The deployment study is pilot-scale (6 users, one month); it demonstrates operability, not adoption. (6) The benchmark experiments operate on document-level representations (title and abstract), whereas the deployed pipeline retrieves passage-level chunks of uploaded papers; the deployment demonstrates engineering transferability but does not establish that all document-level ranking effects reproduce identically at passage level.</w:t>
+        <w:t>Eight limitations delimit the contribution. (1) BiblioGuard requires historical queries with judgments; an unseen domain follows the metadata-free cold-start path and receives no learned benefit. (2) The similarity-weighted Student-t lower bound is an operational confidence gate, not a finite-sample or distribution-free safety certificate. (3) Evaluation is within-domain cross-fitting, not temporal or cross-domain external validation; only SCIDOCS activates, and its +0.0049 absolute gain and d = 0.139 are modest. (4) Interventions use CA-HR's 0.6/0.4 content fusion whereas the fallback uses 0.5/0.5, so the paired effect measures the complete configuration switch rather than a metadata-only causal effect. (5) The action family, confidence level, one BGE encoder, four benchmarks, and NDCG@10 utility should be locked prospectively and tested on more domains, encoders, and time slices. (6) TREC-COVID has only 50 queries and 69.8% citation coverage; neutral defaults cannot remove systematic missingness. (7) The generation experiment compares fixed MiniLM backends, uses the same model family for generation and judging, has no human verification, and therefore does not establish a BiblioGuard generation gain. (8) The six-user, one-month deployment predates BiblioGuard and shows hardware feasibility only; an online A/B evaluation and passage-level validation remain future work.</w:t>
       </w:r>
     </w:p>
     <w:p>
@@ -5267,7 +5582,7 @@
           <w:i w:val="0"/>
           <w:sz w:val="22"/>
         </w:rPr>
-        <w:t>We evaluated ten retrieval configurations for scientific RAG on four benchmarks with real bibliographic metadata, and deployed the stack in a live academic writing assistant. The answer to the title question is conditional on two dimensions rather than one: bibliographic metadata helps scientific RAG when the bibliographic signal is genuinely informative about relevance—citation authority separates relevant from non-relevant documents on SCIDOCS (AUC = 0.798) but not on NFCorpus (AUC = 0.498) or TREC-COVID (AUC = 0.461)—and requires re-calibration when the underlying content retriever changes: under fixed hyperparameters the citation gain observed with MiniLM vanishes on the stronger BGE-small backbone, and a 30-combination weight sweep recovers it only on the citation-informative corpus (SCIDOCS). A lightweight surface-feature router does not recover even the modest oracle headroom, generation-side quality is insensitive to the backend at top-5, and the whole pipeline runs on commodity CPU hardware in production. For practitioners, the actionable guidance is to configure retrieval per domain and to audit the citation-relevance association of a corpus before relying on metadata-aware ranking. Future work includes citation verification for generated answers, richer routing features (embedding-space and corpus-statistic signals), and scaling the deployment study to a larger user base.</w:t>
+        <w:t>We introduced BiblioGuard, a cross-fitted decision layer for selective bibliographic intervention in scientific RAG. Rather than predicting the best retriever, it estimates paired local uplift relative to a strong fallback, corrects its one-sided gate over nine actions, and abstains when the evidence is insufficient. On four domains it improves SCIDOCS by 0.0049 NDCG@10 and reproduces the fallback exactly elsewhere; removing the lower-confidence gate causes negative transfer in the other three domains. The result supports a narrow conclusion: selective metadata use can be safer empirically than always-on or mean-only routing when paired historical evidence is available. It does not establish a universal guarantee. Prospective multi-encoder and temporal evaluation, calibrated or conformal risk control, and a live BiblioGuard A/B test are the next steps.</w:t>
       </w:r>
     </w:p>
     <w:p>
@@ -5307,7 +5622,7 @@
           <w:i w:val="0"/>
           <w:sz w:val="20"/>
         </w:rPr>
-        <w:t>Asai, A., He, J., Shao, R., Shi, W., Singh, A., Chang, J. C., Lo, K., Soldaini, L., Feldman, S., D'Arcy, M., Wadden, D., Latzke, M., Tian, M., Ji, P., Liu, S., Tong, H., Wu, B., Xiong, Y., Zettlemoyer, L., ... Hajishirzi, H. (2024a). OpenScholar: Synthesizing scientific literature with retrieval-augmented language models. arXiv:2411.14199. https://doi.org/10.48550/arXiv.2411.14199</w:t>
+        <w:t>Asai, A., He, J., Shao, R., Shi, W., Singh, A., Chang, J. C., Lo, K., Soldaini, L., Feldman, S., D'Arcy, M., Wadden, D., Latzke, M., Sparks, J., Hwang, J. D., Kishore, V., Tian, M., Ji, P., Liu, S., Tong, H., Wu, B., ... Hajishirzi, H. (2026). Synthesizing scientific literature with retrieval-augmented language models. Nature, 650, 857–863. https://doi.org/10.1038/s41586-025-10072-4</w:t>
       </w:r>
     </w:p>
     <w:p>
@@ -5317,7 +5632,7 @@
           <w:i w:val="0"/>
           <w:sz w:val="20"/>
         </w:rPr>
-        <w:t>Asai, A., Wu, Z., Wang, Y., Sil, A., &amp; Hajishirzi, H. (2024b). Self-RAG: Learning to retrieve, generate, and critique through self-reflection. In Proceedings of ICLR.</w:t>
+        <w:t>Asai, A., Wu, Z., Wang, Y., Sil, A., &amp; Hajishirzi, H. (2024). Self-RAG: Learning to retrieve, generate, and critique through self-reflection. In Proceedings of ICLR.</w:t>
       </w:r>
     </w:p>
     <w:p>
@@ -5408,6 +5723,16 @@
           <w:sz w:val="20"/>
         </w:rPr>
         <w:t>Karpukhin, V., Oğuz, B., Min, S., Lewis, P., Wu, L., Edunov, S., Chen, D., &amp; Yih, W.-t. (2020). Dense passage retrieval for open-domain question answering. In Proceedings of EMNLP (pp. 6769–6781). https://doi.org/10.18653/v1/2020.emnlp-main.550</w:t>
+      </w:r>
+    </w:p>
+    <w:p>
+      <w:r>
+        <w:rPr>
+          <w:b w:val="0"/>
+          <w:i w:val="0"/>
+          <w:sz w:val="20"/>
+        </w:rPr>
+        <w:t>Kim, J., Yoon, S., Le, X.-B., Nam, Y., Kim, D., Song, H., &amp; Lee, J.-G. (2026). QuDAR: Query-wise dual-perspective adaptive retrieval. In Proceedings of ACL (pp. 38662–38679). https://doi.org/10.18653/v1/2026.acl-long.1791</w:t>
       </w:r>
     </w:p>
     <w:p>
@@ -5527,6 +5852,16 @@
           <w:i w:val="0"/>
           <w:sz w:val="20"/>
         </w:rPr>
+        <w:t>Varangot-Reille, C., Bouvard, C., &amp; Gourru, A. (2026). Generalising LLM routing using past performance retrieval: A few-shot router is sufficient. In Proceedings of EACL Student Research Workshop (pp. 304–319). https://doi.org/10.18653/v1/2026.eacl-srw.22</w:t>
+      </w:r>
+    </w:p>
+    <w:p>
+      <w:r>
+        <w:rPr>
+          <w:b w:val="0"/>
+          <w:i w:val="0"/>
+          <w:sz w:val="20"/>
+        </w:rPr>
         <w:t>Voorhees, E., Alam, T., Bedrick, S., Demner-Fushman, D., Hersh, W. R., Lo, K., Roberts, K., Soboroff, I., &amp; Wang, L. L. (2021). TREC-COVID: Constructing a pandemic information retrieval test collection. ACM SIGIR Forum, 54(1), 1–12.</w:t>
       </w:r>
     </w:p>
@@ -5588,6 +5923,16 @@
           <w:sz w:val="20"/>
         </w:rPr>
         <w:t>Yousuf, R. B., Xu, S., Sharma, M., Neeser, A., Latimer, C., &amp; Ramakrishnan, N. (2026). Utilizing metadata for better retrieval-augmented generation. In Proceedings of ECIR (pp. 305–319). https://doi.org/10.1007/978-3-032-21289-4_20</w:t>
+      </w:r>
+    </w:p>
+    <w:p>
+      <w:r>
+        <w:rPr>
+          <w:b w:val="0"/>
+          <w:i w:val="0"/>
+          <w:sz w:val="20"/>
+        </w:rPr>
+        <w:t>Zhao, T., Zhu, Y., Tian, Y., &amp; Dou, Z. (2026). R^3AG: Retriever routing for retrieval-augmented generation. In Proceedings of ACL (pp. 20506–20522). https://doi.org/10.18653/v1/2026.acl-long.939</w:t>
       </w:r>
     </w:p>
     <w:p>

</xml_diff>